<commit_message>
feat: enhance LiveLeaderboard and related components for presentation mode
- Refactor LiveLeaderboard to support a presentation mode with adjusted layout and data fetching.
- Introduce new presentation-specific chart dimensions and error handling in fetchLivePayload.
- Update ValueByVendor and ValueMap components to accept a presentation prop for conditional rendering.
- Add a new Dialog component for UI consistency and improved user experience.
- Enhance slider component to include aria-label for better accessibility.
- Modify BuildStamp to conditionally render based on the current pathname.
</commit_message>
<xml_diff>
--- a/results/llm-mbti-oejts/20260911T040759/MBTI测试结果总结.docx
+++ b/results/llm-mbti-oejts/20260911T040759/MBTI测试结果总结.docx
@@ -193,7 +193,7 @@
       </w:pPr>
       <w:r>
         <w:rPr>
-          <w:rFonts w:ascii="Arial" w:hAnsi="Arial" w:eastAsia="PingFang SC"/>
+          <w:rFonts w:ascii="Arial" w:hAnsi="Arial" w:eastAsia="Noto Sans SC"/>
           <w:b w:val="0"/>
           <w:color w:val="000000"/>
           <w:sz w:val="20"/>
@@ -241,12 +241,12 @@
           </w:tcPr>
           <w:p>
             <w:pPr>
-              <w:spacing w:before="0" w:after="0" w:line="252" w:lineRule="auto"/>
+              <w:spacing w:before="0" w:after="0" w:line="280" w:lineRule="exact"/>
               <w:jc w:val="left"/>
             </w:pPr>
             <w:r>
               <w:rPr>
-                <w:rFonts w:ascii="Arial" w:hAnsi="Arial" w:eastAsia="PingFang SC"/>
+                <w:rFonts w:ascii="Arial" w:hAnsi="Arial" w:eastAsia="Noto Sans SC"/>
                 <w:b/>
                 <w:color w:val="FFFFFF"/>
                 <w:sz w:val="21"/>
@@ -263,12 +263,12 @@
           </w:tcPr>
           <w:p>
             <w:pPr>
-              <w:spacing w:before="0" w:after="0" w:line="252" w:lineRule="auto"/>
+              <w:spacing w:before="0" w:after="0" w:line="280" w:lineRule="exact"/>
               <w:jc w:val="center"/>
             </w:pPr>
             <w:r>
               <w:rPr>
-                <w:rFonts w:ascii="Arial" w:hAnsi="Arial" w:eastAsia="PingFang SC"/>
+                <w:rFonts w:ascii="Arial" w:hAnsi="Arial" w:eastAsia="Noto Sans SC"/>
                 <w:b/>
                 <w:color w:val="FFFFFF"/>
                 <w:sz w:val="21"/>
@@ -285,12 +285,12 @@
           </w:tcPr>
           <w:p>
             <w:pPr>
-              <w:spacing w:before="0" w:after="0" w:line="252" w:lineRule="auto"/>
+              <w:spacing w:before="0" w:after="0" w:line="280" w:lineRule="exact"/>
               <w:jc w:val="center"/>
             </w:pPr>
             <w:r>
               <w:rPr>
-                <w:rFonts w:ascii="Arial" w:hAnsi="Arial" w:eastAsia="PingFang SC"/>
+                <w:rFonts w:ascii="Arial" w:hAnsi="Arial" w:eastAsia="Noto Sans SC"/>
                 <w:b/>
                 <w:color w:val="FFFFFF"/>
                 <w:sz w:val="21"/>
@@ -307,12 +307,12 @@
           </w:tcPr>
           <w:p>
             <w:pPr>
-              <w:spacing w:before="0" w:after="0" w:line="252" w:lineRule="auto"/>
+              <w:spacing w:before="0" w:after="0" w:line="280" w:lineRule="exact"/>
               <w:jc w:val="center"/>
             </w:pPr>
             <w:r>
               <w:rPr>
-                <w:rFonts w:ascii="Arial" w:hAnsi="Arial" w:eastAsia="PingFang SC"/>
+                <w:rFonts w:ascii="Arial" w:hAnsi="Arial" w:eastAsia="Noto Sans SC"/>
                 <w:b/>
                 <w:color w:val="FFFFFF"/>
                 <w:sz w:val="21"/>
@@ -334,12 +334,12 @@
           </w:tcPr>
           <w:p>
             <w:pPr>
-              <w:spacing w:before="0" w:after="0" w:line="252" w:lineRule="auto"/>
+              <w:spacing w:before="0" w:after="0" w:line="280" w:lineRule="exact"/>
               <w:jc w:val="left"/>
             </w:pPr>
             <w:r>
               <w:rPr>
-                <w:rFonts w:ascii="Arial" w:hAnsi="Arial" w:eastAsia="PingFang SC"/>
+                <w:rFonts w:ascii="Arial" w:hAnsi="Arial" w:eastAsia="Noto Sans SC"/>
                 <w:b w:val="0"/>
                 <w:color w:val="000000"/>
                 <w:sz w:val="21"/>
@@ -356,12 +356,12 @@
           </w:tcPr>
           <w:p>
             <w:pPr>
-              <w:spacing w:before="0" w:after="0" w:line="252" w:lineRule="auto"/>
+              <w:spacing w:before="0" w:after="0" w:line="280" w:lineRule="exact"/>
               <w:jc w:val="center"/>
             </w:pPr>
             <w:r>
               <w:rPr>
-                <w:rFonts w:ascii="Arial" w:hAnsi="Arial" w:eastAsia="PingFang SC"/>
+                <w:rFonts w:ascii="Arial" w:hAnsi="Arial" w:eastAsia="Noto Sans SC"/>
                 <w:b/>
                 <w:color w:val="000000"/>
                 <w:sz w:val="21"/>
@@ -378,12 +378,12 @@
           </w:tcPr>
           <w:p>
             <w:pPr>
-              <w:spacing w:before="0" w:after="0" w:line="252" w:lineRule="auto"/>
+              <w:spacing w:before="0" w:after="0" w:line="280" w:lineRule="exact"/>
               <w:jc w:val="center"/>
             </w:pPr>
             <w:r>
               <w:rPr>
-                <w:rFonts w:ascii="Arial" w:hAnsi="Arial" w:eastAsia="PingFang SC"/>
+                <w:rFonts w:ascii="Arial" w:hAnsi="Arial" w:eastAsia="Noto Sans SC"/>
                 <w:b w:val="0"/>
                 <w:color w:val="000000"/>
                 <w:sz w:val="21"/>
@@ -400,12 +400,12 @@
           </w:tcPr>
           <w:p>
             <w:pPr>
-              <w:spacing w:before="0" w:after="0" w:line="252" w:lineRule="auto"/>
+              <w:spacing w:before="0" w:after="0" w:line="280" w:lineRule="exact"/>
               <w:jc w:val="center"/>
             </w:pPr>
             <w:r>
               <w:rPr>
-                <w:rFonts w:ascii="Arial" w:hAnsi="Arial" w:eastAsia="PingFang SC"/>
+                <w:rFonts w:ascii="Arial" w:hAnsi="Arial" w:eastAsia="Noto Sans SC"/>
                 <w:b w:val="0"/>
                 <w:color w:val="000000"/>
                 <w:sz w:val="21"/>
@@ -427,12 +427,12 @@
           </w:tcPr>
           <w:p>
             <w:pPr>
-              <w:spacing w:before="0" w:after="0" w:line="252" w:lineRule="auto"/>
+              <w:spacing w:before="0" w:after="0" w:line="280" w:lineRule="exact"/>
               <w:jc w:val="left"/>
             </w:pPr>
             <w:r>
               <w:rPr>
-                <w:rFonts w:ascii="Arial" w:hAnsi="Arial" w:eastAsia="PingFang SC"/>
+                <w:rFonts w:ascii="Arial" w:hAnsi="Arial" w:eastAsia="Noto Sans SC"/>
                 <w:b w:val="0"/>
                 <w:color w:val="000000"/>
                 <w:sz w:val="21"/>
@@ -449,12 +449,12 @@
           </w:tcPr>
           <w:p>
             <w:pPr>
-              <w:spacing w:before="0" w:after="0" w:line="252" w:lineRule="auto"/>
+              <w:spacing w:before="0" w:after="0" w:line="280" w:lineRule="exact"/>
               <w:jc w:val="center"/>
             </w:pPr>
             <w:r>
               <w:rPr>
-                <w:rFonts w:ascii="Arial" w:hAnsi="Arial" w:eastAsia="PingFang SC"/>
+                <w:rFonts w:ascii="Arial" w:hAnsi="Arial" w:eastAsia="Noto Sans SC"/>
                 <w:b/>
                 <w:color w:val="000000"/>
                 <w:sz w:val="21"/>
@@ -471,12 +471,12 @@
           </w:tcPr>
           <w:p>
             <w:pPr>
-              <w:spacing w:before="0" w:after="0" w:line="252" w:lineRule="auto"/>
+              <w:spacing w:before="0" w:after="0" w:line="280" w:lineRule="exact"/>
               <w:jc w:val="center"/>
             </w:pPr>
             <w:r>
               <w:rPr>
-                <w:rFonts w:ascii="Arial" w:hAnsi="Arial" w:eastAsia="PingFang SC"/>
+                <w:rFonts w:ascii="Arial" w:hAnsi="Arial" w:eastAsia="Noto Sans SC"/>
                 <w:b w:val="0"/>
                 <w:color w:val="000000"/>
                 <w:sz w:val="21"/>
@@ -493,12 +493,12 @@
           </w:tcPr>
           <w:p>
             <w:pPr>
-              <w:spacing w:before="0" w:after="0" w:line="252" w:lineRule="auto"/>
+              <w:spacing w:before="0" w:after="0" w:line="280" w:lineRule="exact"/>
               <w:jc w:val="center"/>
             </w:pPr>
             <w:r>
               <w:rPr>
-                <w:rFonts w:ascii="Arial" w:hAnsi="Arial" w:eastAsia="PingFang SC"/>
+                <w:rFonts w:ascii="Arial" w:hAnsi="Arial" w:eastAsia="Noto Sans SC"/>
                 <w:b w:val="0"/>
                 <w:color w:val="000000"/>
                 <w:sz w:val="21"/>
@@ -520,12 +520,12 @@
           </w:tcPr>
           <w:p>
             <w:pPr>
-              <w:spacing w:before="0" w:after="0" w:line="252" w:lineRule="auto"/>
+              <w:spacing w:before="0" w:after="0" w:line="280" w:lineRule="exact"/>
               <w:jc w:val="left"/>
             </w:pPr>
             <w:r>
               <w:rPr>
-                <w:rFonts w:ascii="Arial" w:hAnsi="Arial" w:eastAsia="PingFang SC"/>
+                <w:rFonts w:ascii="Arial" w:hAnsi="Arial" w:eastAsia="Noto Sans SC"/>
                 <w:b w:val="0"/>
                 <w:color w:val="000000"/>
                 <w:sz w:val="21"/>
@@ -542,12 +542,12 @@
           </w:tcPr>
           <w:p>
             <w:pPr>
-              <w:spacing w:before="0" w:after="0" w:line="252" w:lineRule="auto"/>
+              <w:spacing w:before="0" w:after="0" w:line="280" w:lineRule="exact"/>
               <w:jc w:val="center"/>
             </w:pPr>
             <w:r>
               <w:rPr>
-                <w:rFonts w:ascii="Arial" w:hAnsi="Arial" w:eastAsia="PingFang SC"/>
+                <w:rFonts w:ascii="Arial" w:hAnsi="Arial" w:eastAsia="Noto Sans SC"/>
                 <w:b/>
                 <w:color w:val="000000"/>
                 <w:sz w:val="21"/>
@@ -564,12 +564,12 @@
           </w:tcPr>
           <w:p>
             <w:pPr>
-              <w:spacing w:before="0" w:after="0" w:line="252" w:lineRule="auto"/>
+              <w:spacing w:before="0" w:after="0" w:line="280" w:lineRule="exact"/>
               <w:jc w:val="center"/>
             </w:pPr>
             <w:r>
               <w:rPr>
-                <w:rFonts w:ascii="Arial" w:hAnsi="Arial" w:eastAsia="PingFang SC"/>
+                <w:rFonts w:ascii="Arial" w:hAnsi="Arial" w:eastAsia="Noto Sans SC"/>
                 <w:b w:val="0"/>
                 <w:color w:val="000000"/>
                 <w:sz w:val="21"/>
@@ -586,12 +586,12 @@
           </w:tcPr>
           <w:p>
             <w:pPr>
-              <w:spacing w:before="0" w:after="0" w:line="252" w:lineRule="auto"/>
+              <w:spacing w:before="0" w:after="0" w:line="280" w:lineRule="exact"/>
               <w:jc w:val="center"/>
             </w:pPr>
             <w:r>
               <w:rPr>
-                <w:rFonts w:ascii="Arial" w:hAnsi="Arial" w:eastAsia="PingFang SC"/>
+                <w:rFonts w:ascii="Arial" w:hAnsi="Arial" w:eastAsia="Noto Sans SC"/>
                 <w:b w:val="0"/>
                 <w:color w:val="000000"/>
                 <w:sz w:val="21"/>
@@ -613,12 +613,12 @@
           </w:tcPr>
           <w:p>
             <w:pPr>
-              <w:spacing w:before="0" w:after="0" w:line="252" w:lineRule="auto"/>
+              <w:spacing w:before="0" w:after="0" w:line="280" w:lineRule="exact"/>
               <w:jc w:val="left"/>
             </w:pPr>
             <w:r>
               <w:rPr>
-                <w:rFonts w:ascii="Arial" w:hAnsi="Arial" w:eastAsia="PingFang SC"/>
+                <w:rFonts w:ascii="Arial" w:hAnsi="Arial" w:eastAsia="Noto Sans SC"/>
                 <w:b w:val="0"/>
                 <w:color w:val="000000"/>
                 <w:sz w:val="21"/>
@@ -635,12 +635,12 @@
           </w:tcPr>
           <w:p>
             <w:pPr>
-              <w:spacing w:before="0" w:after="0" w:line="252" w:lineRule="auto"/>
+              <w:spacing w:before="0" w:after="0" w:line="280" w:lineRule="exact"/>
               <w:jc w:val="center"/>
             </w:pPr>
             <w:r>
               <w:rPr>
-                <w:rFonts w:ascii="Arial" w:hAnsi="Arial" w:eastAsia="PingFang SC"/>
+                <w:rFonts w:ascii="Arial" w:hAnsi="Arial" w:eastAsia="Noto Sans SC"/>
                 <w:b/>
                 <w:color w:val="000000"/>
                 <w:sz w:val="21"/>
@@ -657,12 +657,12 @@
           </w:tcPr>
           <w:p>
             <w:pPr>
-              <w:spacing w:before="0" w:after="0" w:line="252" w:lineRule="auto"/>
+              <w:spacing w:before="0" w:after="0" w:line="280" w:lineRule="exact"/>
               <w:jc w:val="center"/>
             </w:pPr>
             <w:r>
               <w:rPr>
-                <w:rFonts w:ascii="Arial" w:hAnsi="Arial" w:eastAsia="PingFang SC"/>
+                <w:rFonts w:ascii="Arial" w:hAnsi="Arial" w:eastAsia="Noto Sans SC"/>
                 <w:b w:val="0"/>
                 <w:color w:val="000000"/>
                 <w:sz w:val="21"/>
@@ -679,12 +679,12 @@
           </w:tcPr>
           <w:p>
             <w:pPr>
-              <w:spacing w:before="0" w:after="0" w:line="252" w:lineRule="auto"/>
+              <w:spacing w:before="0" w:after="0" w:line="280" w:lineRule="exact"/>
               <w:jc w:val="center"/>
             </w:pPr>
             <w:r>
               <w:rPr>
-                <w:rFonts w:ascii="Arial" w:hAnsi="Arial" w:eastAsia="PingFang SC"/>
+                <w:rFonts w:ascii="Arial" w:hAnsi="Arial" w:eastAsia="Noto Sans SC"/>
                 <w:b w:val="0"/>
                 <w:color w:val="000000"/>
                 <w:sz w:val="21"/>
@@ -706,12 +706,12 @@
           </w:tcPr>
           <w:p>
             <w:pPr>
-              <w:spacing w:before="0" w:after="0" w:line="252" w:lineRule="auto"/>
+              <w:spacing w:before="0" w:after="0" w:line="280" w:lineRule="exact"/>
               <w:jc w:val="left"/>
             </w:pPr>
             <w:r>
               <w:rPr>
-                <w:rFonts w:ascii="Arial" w:hAnsi="Arial" w:eastAsia="PingFang SC"/>
+                <w:rFonts w:ascii="Arial" w:hAnsi="Arial" w:eastAsia="Noto Sans SC"/>
                 <w:b w:val="0"/>
                 <w:color w:val="000000"/>
                 <w:sz w:val="21"/>
@@ -728,12 +728,12 @@
           </w:tcPr>
           <w:p>
             <w:pPr>
-              <w:spacing w:before="0" w:after="0" w:line="252" w:lineRule="auto"/>
+              <w:spacing w:before="0" w:after="0" w:line="280" w:lineRule="exact"/>
               <w:jc w:val="center"/>
             </w:pPr>
             <w:r>
               <w:rPr>
-                <w:rFonts w:ascii="Arial" w:hAnsi="Arial" w:eastAsia="PingFang SC"/>
+                <w:rFonts w:ascii="Arial" w:hAnsi="Arial" w:eastAsia="Noto Sans SC"/>
                 <w:b w:val="0"/>
                 <w:color w:val="000000"/>
                 <w:sz w:val="21"/>
@@ -750,12 +750,12 @@
           </w:tcPr>
           <w:p>
             <w:pPr>
-              <w:spacing w:before="0" w:after="0" w:line="252" w:lineRule="auto"/>
+              <w:spacing w:before="0" w:after="0" w:line="280" w:lineRule="exact"/>
               <w:jc w:val="center"/>
             </w:pPr>
             <w:r>
               <w:rPr>
-                <w:rFonts w:ascii="Arial" w:hAnsi="Arial" w:eastAsia="PingFang SC"/>
+                <w:rFonts w:ascii="Arial" w:hAnsi="Arial" w:eastAsia="Noto Sans SC"/>
                 <w:b w:val="0"/>
                 <w:color w:val="000000"/>
                 <w:sz w:val="21"/>
@@ -772,12 +772,12 @@
           </w:tcPr>
           <w:p>
             <w:pPr>
-              <w:spacing w:before="0" w:after="0" w:line="252" w:lineRule="auto"/>
+              <w:spacing w:before="0" w:after="0" w:line="280" w:lineRule="exact"/>
               <w:jc w:val="center"/>
             </w:pPr>
             <w:r>
               <w:rPr>
-                <w:rFonts w:ascii="Arial" w:hAnsi="Arial" w:eastAsia="PingFang SC"/>
+                <w:rFonts w:ascii="Arial" w:hAnsi="Arial" w:eastAsia="Noto Sans SC"/>
                 <w:b w:val="0"/>
                 <w:color w:val="000000"/>
                 <w:sz w:val="21"/>
@@ -799,12 +799,12 @@
           </w:tcPr>
           <w:p>
             <w:pPr>
-              <w:spacing w:before="0" w:after="0" w:line="252" w:lineRule="auto"/>
+              <w:spacing w:before="0" w:after="0" w:line="280" w:lineRule="exact"/>
               <w:jc w:val="left"/>
             </w:pPr>
             <w:r>
               <w:rPr>
-                <w:rFonts w:ascii="Arial" w:hAnsi="Arial" w:eastAsia="PingFang SC"/>
+                <w:rFonts w:ascii="Arial" w:hAnsi="Arial" w:eastAsia="Noto Sans SC"/>
                 <w:b w:val="0"/>
                 <w:color w:val="000000"/>
                 <w:sz w:val="21"/>
@@ -821,12 +821,12 @@
           </w:tcPr>
           <w:p>
             <w:pPr>
-              <w:spacing w:before="0" w:after="0" w:line="252" w:lineRule="auto"/>
+              <w:spacing w:before="0" w:after="0" w:line="280" w:lineRule="exact"/>
               <w:jc w:val="center"/>
             </w:pPr>
             <w:r>
               <w:rPr>
-                <w:rFonts w:ascii="Arial" w:hAnsi="Arial" w:eastAsia="PingFang SC"/>
+                <w:rFonts w:ascii="Arial" w:hAnsi="Arial" w:eastAsia="Noto Sans SC"/>
                 <w:b/>
                 <w:color w:val="000000"/>
                 <w:sz w:val="21"/>
@@ -843,12 +843,12 @@
           </w:tcPr>
           <w:p>
             <w:pPr>
-              <w:spacing w:before="0" w:after="0" w:line="252" w:lineRule="auto"/>
+              <w:spacing w:before="0" w:after="0" w:line="280" w:lineRule="exact"/>
               <w:jc w:val="center"/>
             </w:pPr>
             <w:r>
               <w:rPr>
-                <w:rFonts w:ascii="Arial" w:hAnsi="Arial" w:eastAsia="PingFang SC"/>
+                <w:rFonts w:ascii="Arial" w:hAnsi="Arial" w:eastAsia="Noto Sans SC"/>
                 <w:b w:val="0"/>
                 <w:color w:val="000000"/>
                 <w:sz w:val="21"/>
@@ -865,12 +865,12 @@
           </w:tcPr>
           <w:p>
             <w:pPr>
-              <w:spacing w:before="0" w:after="0" w:line="252" w:lineRule="auto"/>
+              <w:spacing w:before="0" w:after="0" w:line="280" w:lineRule="exact"/>
               <w:jc w:val="center"/>
             </w:pPr>
             <w:r>
               <w:rPr>
-                <w:rFonts w:ascii="Arial" w:hAnsi="Arial" w:eastAsia="PingFang SC"/>
+                <w:rFonts w:ascii="Arial" w:hAnsi="Arial" w:eastAsia="Noto Sans SC"/>
                 <w:b w:val="0"/>
                 <w:color w:val="000000"/>
                 <w:sz w:val="21"/>
@@ -892,12 +892,12 @@
           </w:tcPr>
           <w:p>
             <w:pPr>
-              <w:spacing w:before="0" w:after="0" w:line="252" w:lineRule="auto"/>
+              <w:spacing w:before="0" w:after="0" w:line="280" w:lineRule="exact"/>
               <w:jc w:val="left"/>
             </w:pPr>
             <w:r>
               <w:rPr>
-                <w:rFonts w:ascii="Arial" w:hAnsi="Arial" w:eastAsia="PingFang SC"/>
+                <w:rFonts w:ascii="Arial" w:hAnsi="Arial" w:eastAsia="Noto Sans SC"/>
                 <w:b w:val="0"/>
                 <w:color w:val="000000"/>
                 <w:sz w:val="21"/>
@@ -914,12 +914,12 @@
           </w:tcPr>
           <w:p>
             <w:pPr>
-              <w:spacing w:before="0" w:after="0" w:line="252" w:lineRule="auto"/>
+              <w:spacing w:before="0" w:after="0" w:line="280" w:lineRule="exact"/>
               <w:jc w:val="center"/>
             </w:pPr>
             <w:r>
               <w:rPr>
-                <w:rFonts w:ascii="Arial" w:hAnsi="Arial" w:eastAsia="PingFang SC"/>
+                <w:rFonts w:ascii="Arial" w:hAnsi="Arial" w:eastAsia="Noto Sans SC"/>
                 <w:b/>
                 <w:color w:val="000000"/>
                 <w:sz w:val="21"/>
@@ -936,12 +936,12 @@
           </w:tcPr>
           <w:p>
             <w:pPr>
-              <w:spacing w:before="0" w:after="0" w:line="252" w:lineRule="auto"/>
+              <w:spacing w:before="0" w:after="0" w:line="280" w:lineRule="exact"/>
               <w:jc w:val="center"/>
             </w:pPr>
             <w:r>
               <w:rPr>
-                <w:rFonts w:ascii="Arial" w:hAnsi="Arial" w:eastAsia="PingFang SC"/>
+                <w:rFonts w:ascii="Arial" w:hAnsi="Arial" w:eastAsia="Noto Sans SC"/>
                 <w:b w:val="0"/>
                 <w:color w:val="000000"/>
                 <w:sz w:val="21"/>
@@ -958,12 +958,12 @@
           </w:tcPr>
           <w:p>
             <w:pPr>
-              <w:spacing w:before="0" w:after="0" w:line="252" w:lineRule="auto"/>
+              <w:spacing w:before="0" w:after="0" w:line="280" w:lineRule="exact"/>
               <w:jc w:val="center"/>
             </w:pPr>
             <w:r>
               <w:rPr>
-                <w:rFonts w:ascii="Arial" w:hAnsi="Arial" w:eastAsia="PingFang SC"/>
+                <w:rFonts w:ascii="Arial" w:hAnsi="Arial" w:eastAsia="Noto Sans SC"/>
                 <w:b w:val="0"/>
                 <w:color w:val="000000"/>
                 <w:sz w:val="21"/>
@@ -985,12 +985,12 @@
           </w:tcPr>
           <w:p>
             <w:pPr>
-              <w:spacing w:before="0" w:after="0" w:line="252" w:lineRule="auto"/>
+              <w:spacing w:before="0" w:after="0" w:line="280" w:lineRule="exact"/>
               <w:jc w:val="left"/>
             </w:pPr>
             <w:r>
               <w:rPr>
-                <w:rFonts w:ascii="Arial" w:hAnsi="Arial" w:eastAsia="PingFang SC"/>
+                <w:rFonts w:ascii="Arial" w:hAnsi="Arial" w:eastAsia="Noto Sans SC"/>
                 <w:b w:val="0"/>
                 <w:color w:val="000000"/>
                 <w:sz w:val="21"/>
@@ -1007,12 +1007,12 @@
           </w:tcPr>
           <w:p>
             <w:pPr>
-              <w:spacing w:before="0" w:after="0" w:line="252" w:lineRule="auto"/>
+              <w:spacing w:before="0" w:after="0" w:line="280" w:lineRule="exact"/>
               <w:jc w:val="center"/>
             </w:pPr>
             <w:r>
               <w:rPr>
-                <w:rFonts w:ascii="Arial" w:hAnsi="Arial" w:eastAsia="PingFang SC"/>
+                <w:rFonts w:ascii="Arial" w:hAnsi="Arial" w:eastAsia="Noto Sans SC"/>
                 <w:b w:val="0"/>
                 <w:color w:val="000000"/>
                 <w:sz w:val="21"/>
@@ -1029,12 +1029,12 @@
           </w:tcPr>
           <w:p>
             <w:pPr>
-              <w:spacing w:before="0" w:after="0" w:line="252" w:lineRule="auto"/>
+              <w:spacing w:before="0" w:after="0" w:line="280" w:lineRule="exact"/>
               <w:jc w:val="center"/>
             </w:pPr>
             <w:r>
               <w:rPr>
-                <w:rFonts w:ascii="Arial" w:hAnsi="Arial" w:eastAsia="PingFang SC"/>
+                <w:rFonts w:ascii="Arial" w:hAnsi="Arial" w:eastAsia="Noto Sans SC"/>
                 <w:b w:val="0"/>
                 <w:color w:val="000000"/>
                 <w:sz w:val="21"/>
@@ -1051,12 +1051,12 @@
           </w:tcPr>
           <w:p>
             <w:pPr>
-              <w:spacing w:before="0" w:after="0" w:line="252" w:lineRule="auto"/>
+              <w:spacing w:before="0" w:after="0" w:line="280" w:lineRule="exact"/>
               <w:jc w:val="center"/>
             </w:pPr>
             <w:r>
               <w:rPr>
-                <w:rFonts w:ascii="Arial" w:hAnsi="Arial" w:eastAsia="PingFang SC"/>
+                <w:rFonts w:ascii="Arial" w:hAnsi="Arial" w:eastAsia="Noto Sans SC"/>
                 <w:b w:val="0"/>
                 <w:color w:val="000000"/>
                 <w:sz w:val="21"/>
@@ -1078,12 +1078,12 @@
           </w:tcPr>
           <w:p>
             <w:pPr>
-              <w:spacing w:before="0" w:after="0" w:line="252" w:lineRule="auto"/>
+              <w:spacing w:before="0" w:after="0" w:line="280" w:lineRule="exact"/>
               <w:jc w:val="left"/>
             </w:pPr>
             <w:r>
               <w:rPr>
-                <w:rFonts w:ascii="Arial" w:hAnsi="Arial" w:eastAsia="PingFang SC"/>
+                <w:rFonts w:ascii="Arial" w:hAnsi="Arial" w:eastAsia="Noto Sans SC"/>
                 <w:b w:val="0"/>
                 <w:color w:val="000000"/>
                 <w:sz w:val="21"/>
@@ -1100,12 +1100,12 @@
           </w:tcPr>
           <w:p>
             <w:pPr>
-              <w:spacing w:before="0" w:after="0" w:line="252" w:lineRule="auto"/>
+              <w:spacing w:before="0" w:after="0" w:line="280" w:lineRule="exact"/>
               <w:jc w:val="center"/>
             </w:pPr>
             <w:r>
               <w:rPr>
-                <w:rFonts w:ascii="Arial" w:hAnsi="Arial" w:eastAsia="PingFang SC"/>
+                <w:rFonts w:ascii="Arial" w:hAnsi="Arial" w:eastAsia="Noto Sans SC"/>
                 <w:b w:val="0"/>
                 <w:color w:val="000000"/>
                 <w:sz w:val="21"/>
@@ -1122,12 +1122,12 @@
           </w:tcPr>
           <w:p>
             <w:pPr>
-              <w:spacing w:before="0" w:after="0" w:line="252" w:lineRule="auto"/>
+              <w:spacing w:before="0" w:after="0" w:line="280" w:lineRule="exact"/>
               <w:jc w:val="center"/>
             </w:pPr>
             <w:r>
               <w:rPr>
-                <w:rFonts w:ascii="Arial" w:hAnsi="Arial" w:eastAsia="PingFang SC"/>
+                <w:rFonts w:ascii="Arial" w:hAnsi="Arial" w:eastAsia="Noto Sans SC"/>
                 <w:b w:val="0"/>
                 <w:color w:val="000000"/>
                 <w:sz w:val="21"/>
@@ -1144,12 +1144,12 @@
           </w:tcPr>
           <w:p>
             <w:pPr>
-              <w:spacing w:before="0" w:after="0" w:line="252" w:lineRule="auto"/>
+              <w:spacing w:before="0" w:after="0" w:line="280" w:lineRule="exact"/>
               <w:jc w:val="center"/>
             </w:pPr>
             <w:r>
               <w:rPr>
-                <w:rFonts w:ascii="Arial" w:hAnsi="Arial" w:eastAsia="PingFang SC"/>
+                <w:rFonts w:ascii="Arial" w:hAnsi="Arial" w:eastAsia="Noto Sans SC"/>
                 <w:b w:val="0"/>
                 <w:color w:val="000000"/>
                 <w:sz w:val="21"/>
@@ -1171,12 +1171,12 @@
           </w:tcPr>
           <w:p>
             <w:pPr>
-              <w:spacing w:before="0" w:after="0" w:line="252" w:lineRule="auto"/>
+              <w:spacing w:before="0" w:after="0" w:line="280" w:lineRule="exact"/>
               <w:jc w:val="left"/>
             </w:pPr>
             <w:r>
               <w:rPr>
-                <w:rFonts w:ascii="Arial" w:hAnsi="Arial" w:eastAsia="PingFang SC"/>
+                <w:rFonts w:ascii="Arial" w:hAnsi="Arial" w:eastAsia="Noto Sans SC"/>
                 <w:b w:val="0"/>
                 <w:color w:val="000000"/>
                 <w:sz w:val="21"/>
@@ -1193,12 +1193,12 @@
           </w:tcPr>
           <w:p>
             <w:pPr>
-              <w:spacing w:before="0" w:after="0" w:line="252" w:lineRule="auto"/>
+              <w:spacing w:before="0" w:after="0" w:line="280" w:lineRule="exact"/>
               <w:jc w:val="center"/>
             </w:pPr>
             <w:r>
               <w:rPr>
-                <w:rFonts w:ascii="Arial" w:hAnsi="Arial" w:eastAsia="PingFang SC"/>
+                <w:rFonts w:ascii="Arial" w:hAnsi="Arial" w:eastAsia="Noto Sans SC"/>
                 <w:b/>
                 <w:color w:val="000000"/>
                 <w:sz w:val="21"/>
@@ -1215,12 +1215,12 @@
           </w:tcPr>
           <w:p>
             <w:pPr>
-              <w:spacing w:before="0" w:after="0" w:line="252" w:lineRule="auto"/>
+              <w:spacing w:before="0" w:after="0" w:line="280" w:lineRule="exact"/>
               <w:jc w:val="center"/>
             </w:pPr>
             <w:r>
               <w:rPr>
-                <w:rFonts w:ascii="Arial" w:hAnsi="Arial" w:eastAsia="PingFang SC"/>
+                <w:rFonts w:ascii="Arial" w:hAnsi="Arial" w:eastAsia="Noto Sans SC"/>
                 <w:b w:val="0"/>
                 <w:color w:val="000000"/>
                 <w:sz w:val="21"/>
@@ -1237,12 +1237,12 @@
           </w:tcPr>
           <w:p>
             <w:pPr>
-              <w:spacing w:before="0" w:after="0" w:line="252" w:lineRule="auto"/>
+              <w:spacing w:before="0" w:after="0" w:line="280" w:lineRule="exact"/>
               <w:jc w:val="center"/>
             </w:pPr>
             <w:r>
               <w:rPr>
-                <w:rFonts w:ascii="Arial" w:hAnsi="Arial" w:eastAsia="PingFang SC"/>
+                <w:rFonts w:ascii="Arial" w:hAnsi="Arial" w:eastAsia="Noto Sans SC"/>
                 <w:b w:val="0"/>
                 <w:color w:val="000000"/>
                 <w:sz w:val="21"/>
@@ -1264,12 +1264,12 @@
           </w:tcPr>
           <w:p>
             <w:pPr>
-              <w:spacing w:before="0" w:after="0" w:line="252" w:lineRule="auto"/>
+              <w:spacing w:before="0" w:after="0" w:line="280" w:lineRule="exact"/>
               <w:jc w:val="left"/>
             </w:pPr>
             <w:r>
               <w:rPr>
-                <w:rFonts w:ascii="Arial" w:hAnsi="Arial" w:eastAsia="PingFang SC"/>
+                <w:rFonts w:ascii="Arial" w:hAnsi="Arial" w:eastAsia="Noto Sans SC"/>
                 <w:b w:val="0"/>
                 <w:color w:val="000000"/>
                 <w:sz w:val="21"/>
@@ -1286,12 +1286,12 @@
           </w:tcPr>
           <w:p>
             <w:pPr>
-              <w:spacing w:before="0" w:after="0" w:line="252" w:lineRule="auto"/>
+              <w:spacing w:before="0" w:after="0" w:line="280" w:lineRule="exact"/>
               <w:jc w:val="center"/>
             </w:pPr>
             <w:r>
               <w:rPr>
-                <w:rFonts w:ascii="Arial" w:hAnsi="Arial" w:eastAsia="PingFang SC"/>
+                <w:rFonts w:ascii="Arial" w:hAnsi="Arial" w:eastAsia="Noto Sans SC"/>
                 <w:b w:val="0"/>
                 <w:color w:val="000000"/>
                 <w:sz w:val="21"/>
@@ -1308,12 +1308,12 @@
           </w:tcPr>
           <w:p>
             <w:pPr>
-              <w:spacing w:before="0" w:after="0" w:line="252" w:lineRule="auto"/>
+              <w:spacing w:before="0" w:after="0" w:line="280" w:lineRule="exact"/>
               <w:jc w:val="center"/>
             </w:pPr>
             <w:r>
               <w:rPr>
-                <w:rFonts w:ascii="Arial" w:hAnsi="Arial" w:eastAsia="PingFang SC"/>
+                <w:rFonts w:ascii="Arial" w:hAnsi="Arial" w:eastAsia="Noto Sans SC"/>
                 <w:b w:val="0"/>
                 <w:color w:val="000000"/>
                 <w:sz w:val="21"/>
@@ -1330,12 +1330,12 @@
           </w:tcPr>
           <w:p>
             <w:pPr>
-              <w:spacing w:before="0" w:after="0" w:line="252" w:lineRule="auto"/>
+              <w:spacing w:before="0" w:after="0" w:line="280" w:lineRule="exact"/>
               <w:jc w:val="center"/>
             </w:pPr>
             <w:r>
               <w:rPr>
-                <w:rFonts w:ascii="Arial" w:hAnsi="Arial" w:eastAsia="PingFang SC"/>
+                <w:rFonts w:ascii="Arial" w:hAnsi="Arial" w:eastAsia="Noto Sans SC"/>
                 <w:b w:val="0"/>
                 <w:color w:val="000000"/>
                 <w:sz w:val="21"/>
@@ -1357,12 +1357,12 @@
           </w:tcPr>
           <w:p>
             <w:pPr>
-              <w:spacing w:before="0" w:after="0" w:line="252" w:lineRule="auto"/>
+              <w:spacing w:before="0" w:after="0" w:line="280" w:lineRule="exact"/>
               <w:jc w:val="left"/>
             </w:pPr>
             <w:r>
               <w:rPr>
-                <w:rFonts w:ascii="Arial" w:hAnsi="Arial" w:eastAsia="PingFang SC"/>
+                <w:rFonts w:ascii="Arial" w:hAnsi="Arial" w:eastAsia="Noto Sans SC"/>
                 <w:b w:val="0"/>
                 <w:color w:val="000000"/>
                 <w:sz w:val="21"/>
@@ -1379,12 +1379,12 @@
           </w:tcPr>
           <w:p>
             <w:pPr>
-              <w:spacing w:before="0" w:after="0" w:line="252" w:lineRule="auto"/>
+              <w:spacing w:before="0" w:after="0" w:line="280" w:lineRule="exact"/>
               <w:jc w:val="center"/>
             </w:pPr>
             <w:r>
               <w:rPr>
-                <w:rFonts w:ascii="Arial" w:hAnsi="Arial" w:eastAsia="PingFang SC"/>
+                <w:rFonts w:ascii="Arial" w:hAnsi="Arial" w:eastAsia="Noto Sans SC"/>
                 <w:b w:val="0"/>
                 <w:color w:val="000000"/>
                 <w:sz w:val="21"/>
@@ -1401,12 +1401,12 @@
           </w:tcPr>
           <w:p>
             <w:pPr>
-              <w:spacing w:before="0" w:after="0" w:line="252" w:lineRule="auto"/>
+              <w:spacing w:before="0" w:after="0" w:line="280" w:lineRule="exact"/>
               <w:jc w:val="center"/>
             </w:pPr>
             <w:r>
               <w:rPr>
-                <w:rFonts w:ascii="Arial" w:hAnsi="Arial" w:eastAsia="PingFang SC"/>
+                <w:rFonts w:ascii="Arial" w:hAnsi="Arial" w:eastAsia="Noto Sans SC"/>
                 <w:b w:val="0"/>
                 <w:color w:val="000000"/>
                 <w:sz w:val="21"/>
@@ -1423,12 +1423,12 @@
           </w:tcPr>
           <w:p>
             <w:pPr>
-              <w:spacing w:before="0" w:after="0" w:line="252" w:lineRule="auto"/>
+              <w:spacing w:before="0" w:after="0" w:line="280" w:lineRule="exact"/>
               <w:jc w:val="center"/>
             </w:pPr>
             <w:r>
               <w:rPr>
-                <w:rFonts w:ascii="Arial" w:hAnsi="Arial" w:eastAsia="PingFang SC"/>
+                <w:rFonts w:ascii="Arial" w:hAnsi="Arial" w:eastAsia="Noto Sans SC"/>
                 <w:b w:val="0"/>
                 <w:color w:val="000000"/>
                 <w:sz w:val="21"/>
@@ -1450,12 +1450,12 @@
           </w:tcPr>
           <w:p>
             <w:pPr>
-              <w:spacing w:before="0" w:after="0" w:line="252" w:lineRule="auto"/>
+              <w:spacing w:before="0" w:after="0" w:line="280" w:lineRule="exact"/>
               <w:jc w:val="left"/>
             </w:pPr>
             <w:r>
               <w:rPr>
-                <w:rFonts w:ascii="Arial" w:hAnsi="Arial" w:eastAsia="PingFang SC"/>
+                <w:rFonts w:ascii="Arial" w:hAnsi="Arial" w:eastAsia="Noto Sans SC"/>
                 <w:b w:val="0"/>
                 <w:color w:val="000000"/>
                 <w:sz w:val="21"/>
@@ -1472,12 +1472,12 @@
           </w:tcPr>
           <w:p>
             <w:pPr>
-              <w:spacing w:before="0" w:after="0" w:line="252" w:lineRule="auto"/>
+              <w:spacing w:before="0" w:after="0" w:line="280" w:lineRule="exact"/>
               <w:jc w:val="center"/>
             </w:pPr>
             <w:r>
               <w:rPr>
-                <w:rFonts w:ascii="Arial" w:hAnsi="Arial" w:eastAsia="PingFang SC"/>
+                <w:rFonts w:ascii="Arial" w:hAnsi="Arial" w:eastAsia="Noto Sans SC"/>
                 <w:b/>
                 <w:color w:val="000000"/>
                 <w:sz w:val="21"/>
@@ -1494,12 +1494,12 @@
           </w:tcPr>
           <w:p>
             <w:pPr>
-              <w:spacing w:before="0" w:after="0" w:line="252" w:lineRule="auto"/>
+              <w:spacing w:before="0" w:after="0" w:line="280" w:lineRule="exact"/>
               <w:jc w:val="center"/>
             </w:pPr>
             <w:r>
               <w:rPr>
-                <w:rFonts w:ascii="Arial" w:hAnsi="Arial" w:eastAsia="PingFang SC"/>
+                <w:rFonts w:ascii="Arial" w:hAnsi="Arial" w:eastAsia="Noto Sans SC"/>
                 <w:b w:val="0"/>
                 <w:color w:val="000000"/>
                 <w:sz w:val="21"/>
@@ -1516,12 +1516,12 @@
           </w:tcPr>
           <w:p>
             <w:pPr>
-              <w:spacing w:before="0" w:after="0" w:line="252" w:lineRule="auto"/>
+              <w:spacing w:before="0" w:after="0" w:line="280" w:lineRule="exact"/>
               <w:jc w:val="center"/>
             </w:pPr>
             <w:r>
               <w:rPr>
-                <w:rFonts w:ascii="Arial" w:hAnsi="Arial" w:eastAsia="PingFang SC"/>
+                <w:rFonts w:ascii="Arial" w:hAnsi="Arial" w:eastAsia="Noto Sans SC"/>
                 <w:b w:val="0"/>
                 <w:color w:val="000000"/>
                 <w:sz w:val="21"/>
@@ -1543,12 +1543,12 @@
           </w:tcPr>
           <w:p>
             <w:pPr>
-              <w:spacing w:before="0" w:after="0" w:line="252" w:lineRule="auto"/>
+              <w:spacing w:before="0" w:after="0" w:line="280" w:lineRule="exact"/>
               <w:jc w:val="left"/>
             </w:pPr>
             <w:r>
               <w:rPr>
-                <w:rFonts w:ascii="Arial" w:hAnsi="Arial" w:eastAsia="PingFang SC"/>
+                <w:rFonts w:ascii="Arial" w:hAnsi="Arial" w:eastAsia="Noto Sans SC"/>
                 <w:b w:val="0"/>
                 <w:color w:val="000000"/>
                 <w:sz w:val="21"/>
@@ -1565,12 +1565,12 @@
           </w:tcPr>
           <w:p>
             <w:pPr>
-              <w:spacing w:before="0" w:after="0" w:line="252" w:lineRule="auto"/>
+              <w:spacing w:before="0" w:after="0" w:line="280" w:lineRule="exact"/>
               <w:jc w:val="center"/>
             </w:pPr>
             <w:r>
               <w:rPr>
-                <w:rFonts w:ascii="Arial" w:hAnsi="Arial" w:eastAsia="PingFang SC"/>
+                <w:rFonts w:ascii="Arial" w:hAnsi="Arial" w:eastAsia="Noto Sans SC"/>
                 <w:b/>
                 <w:color w:val="000000"/>
                 <w:sz w:val="21"/>
@@ -1587,12 +1587,12 @@
           </w:tcPr>
           <w:p>
             <w:pPr>
-              <w:spacing w:before="0" w:after="0" w:line="252" w:lineRule="auto"/>
+              <w:spacing w:before="0" w:after="0" w:line="280" w:lineRule="exact"/>
               <w:jc w:val="center"/>
             </w:pPr>
             <w:r>
               <w:rPr>
-                <w:rFonts w:ascii="Arial" w:hAnsi="Arial" w:eastAsia="PingFang SC"/>
+                <w:rFonts w:ascii="Arial" w:hAnsi="Arial" w:eastAsia="Noto Sans SC"/>
                 <w:b w:val="0"/>
                 <w:color w:val="000000"/>
                 <w:sz w:val="21"/>
@@ -1609,12 +1609,12 @@
           </w:tcPr>
           <w:p>
             <w:pPr>
-              <w:spacing w:before="0" w:after="0" w:line="252" w:lineRule="auto"/>
+              <w:spacing w:before="0" w:after="0" w:line="280" w:lineRule="exact"/>
               <w:jc w:val="center"/>
             </w:pPr>
             <w:r>
               <w:rPr>
-                <w:rFonts w:ascii="Arial" w:hAnsi="Arial" w:eastAsia="PingFang SC"/>
+                <w:rFonts w:ascii="Arial" w:hAnsi="Arial" w:eastAsia="Noto Sans SC"/>
                 <w:b w:val="0"/>
                 <w:color w:val="000000"/>
                 <w:sz w:val="21"/>
@@ -1636,12 +1636,12 @@
           </w:tcPr>
           <w:p>
             <w:pPr>
-              <w:spacing w:before="0" w:after="0" w:line="252" w:lineRule="auto"/>
+              <w:spacing w:before="0" w:after="0" w:line="280" w:lineRule="exact"/>
               <w:jc w:val="left"/>
             </w:pPr>
             <w:r>
               <w:rPr>
-                <w:rFonts w:ascii="Arial" w:hAnsi="Arial" w:eastAsia="PingFang SC"/>
+                <w:rFonts w:ascii="Arial" w:hAnsi="Arial" w:eastAsia="Noto Sans SC"/>
                 <w:b w:val="0"/>
                 <w:color w:val="000000"/>
                 <w:sz w:val="21"/>
@@ -1658,12 +1658,12 @@
           </w:tcPr>
           <w:p>
             <w:pPr>
-              <w:spacing w:before="0" w:after="0" w:line="252" w:lineRule="auto"/>
+              <w:spacing w:before="0" w:after="0" w:line="280" w:lineRule="exact"/>
               <w:jc w:val="center"/>
             </w:pPr>
             <w:r>
               <w:rPr>
-                <w:rFonts w:ascii="Arial" w:hAnsi="Arial" w:eastAsia="PingFang SC"/>
+                <w:rFonts w:ascii="Arial" w:hAnsi="Arial" w:eastAsia="Noto Sans SC"/>
                 <w:b/>
                 <w:color w:val="000000"/>
                 <w:sz w:val="21"/>
@@ -1680,12 +1680,12 @@
           </w:tcPr>
           <w:p>
             <w:pPr>
-              <w:spacing w:before="0" w:after="0" w:line="252" w:lineRule="auto"/>
+              <w:spacing w:before="0" w:after="0" w:line="280" w:lineRule="exact"/>
               <w:jc w:val="center"/>
             </w:pPr>
             <w:r>
               <w:rPr>
-                <w:rFonts w:ascii="Arial" w:hAnsi="Arial" w:eastAsia="PingFang SC"/>
+                <w:rFonts w:ascii="Arial" w:hAnsi="Arial" w:eastAsia="Noto Sans SC"/>
                 <w:b w:val="0"/>
                 <w:color w:val="000000"/>
                 <w:sz w:val="21"/>
@@ -1702,12 +1702,12 @@
           </w:tcPr>
           <w:p>
             <w:pPr>
-              <w:spacing w:before="0" w:after="0" w:line="252" w:lineRule="auto"/>
+              <w:spacing w:before="0" w:after="0" w:line="280" w:lineRule="exact"/>
               <w:jc w:val="center"/>
             </w:pPr>
             <w:r>
               <w:rPr>
-                <w:rFonts w:ascii="Arial" w:hAnsi="Arial" w:eastAsia="PingFang SC"/>
+                <w:rFonts w:ascii="Arial" w:hAnsi="Arial" w:eastAsia="Noto Sans SC"/>
                 <w:b w:val="0"/>
                 <w:color w:val="000000"/>
                 <w:sz w:val="21"/>
@@ -1729,12 +1729,12 @@
           </w:tcPr>
           <w:p>
             <w:pPr>
-              <w:spacing w:before="0" w:after="0" w:line="252" w:lineRule="auto"/>
+              <w:spacing w:before="0" w:after="0" w:line="280" w:lineRule="exact"/>
               <w:jc w:val="left"/>
             </w:pPr>
             <w:r>
               <w:rPr>
-                <w:rFonts w:ascii="Arial" w:hAnsi="Arial" w:eastAsia="PingFang SC"/>
+                <w:rFonts w:ascii="Arial" w:hAnsi="Arial" w:eastAsia="Noto Sans SC"/>
                 <w:b w:val="0"/>
                 <w:color w:val="000000"/>
                 <w:sz w:val="21"/>
@@ -1751,12 +1751,12 @@
           </w:tcPr>
           <w:p>
             <w:pPr>
-              <w:spacing w:before="0" w:after="0" w:line="252" w:lineRule="auto"/>
+              <w:spacing w:before="0" w:after="0" w:line="280" w:lineRule="exact"/>
               <w:jc w:val="center"/>
             </w:pPr>
             <w:r>
               <w:rPr>
-                <w:rFonts w:ascii="Arial" w:hAnsi="Arial" w:eastAsia="PingFang SC"/>
+                <w:rFonts w:ascii="Arial" w:hAnsi="Arial" w:eastAsia="Noto Sans SC"/>
                 <w:b w:val="0"/>
                 <w:color w:val="000000"/>
                 <w:sz w:val="21"/>
@@ -1773,12 +1773,12 @@
           </w:tcPr>
           <w:p>
             <w:pPr>
-              <w:spacing w:before="0" w:after="0" w:line="252" w:lineRule="auto"/>
+              <w:spacing w:before="0" w:after="0" w:line="280" w:lineRule="exact"/>
               <w:jc w:val="center"/>
             </w:pPr>
             <w:r>
               <w:rPr>
-                <w:rFonts w:ascii="Arial" w:hAnsi="Arial" w:eastAsia="PingFang SC"/>
+                <w:rFonts w:ascii="Arial" w:hAnsi="Arial" w:eastAsia="Noto Sans SC"/>
                 <w:b w:val="0"/>
                 <w:color w:val="000000"/>
                 <w:sz w:val="21"/>
@@ -1795,12 +1795,12 @@
           </w:tcPr>
           <w:p>
             <w:pPr>
-              <w:spacing w:before="0" w:after="0" w:line="252" w:lineRule="auto"/>
+              <w:spacing w:before="0" w:after="0" w:line="280" w:lineRule="exact"/>
               <w:jc w:val="center"/>
             </w:pPr>
             <w:r>
               <w:rPr>
-                <w:rFonts w:ascii="Arial" w:hAnsi="Arial" w:eastAsia="PingFang SC"/>
+                <w:rFonts w:ascii="Arial" w:hAnsi="Arial" w:eastAsia="Noto Sans SC"/>
                 <w:b w:val="0"/>
                 <w:color w:val="000000"/>
                 <w:sz w:val="21"/>
@@ -1822,12 +1822,12 @@
           </w:tcPr>
           <w:p>
             <w:pPr>
-              <w:spacing w:before="0" w:after="0" w:line="252" w:lineRule="auto"/>
+              <w:spacing w:before="0" w:after="0" w:line="280" w:lineRule="exact"/>
               <w:jc w:val="left"/>
             </w:pPr>
             <w:r>
               <w:rPr>
-                <w:rFonts w:ascii="Arial" w:hAnsi="Arial" w:eastAsia="PingFang SC"/>
+                <w:rFonts w:ascii="Arial" w:hAnsi="Arial" w:eastAsia="Noto Sans SC"/>
                 <w:b w:val="0"/>
                 <w:color w:val="000000"/>
                 <w:sz w:val="21"/>
@@ -1844,12 +1844,12 @@
           </w:tcPr>
           <w:p>
             <w:pPr>
-              <w:spacing w:before="0" w:after="0" w:line="252" w:lineRule="auto"/>
+              <w:spacing w:before="0" w:after="0" w:line="280" w:lineRule="exact"/>
               <w:jc w:val="center"/>
             </w:pPr>
             <w:r>
               <w:rPr>
-                <w:rFonts w:ascii="Arial" w:hAnsi="Arial" w:eastAsia="PingFang SC"/>
+                <w:rFonts w:ascii="Arial" w:hAnsi="Arial" w:eastAsia="Noto Sans SC"/>
                 <w:b/>
                 <w:color w:val="000000"/>
                 <w:sz w:val="21"/>
@@ -1866,12 +1866,12 @@
           </w:tcPr>
           <w:p>
             <w:pPr>
-              <w:spacing w:before="0" w:after="0" w:line="252" w:lineRule="auto"/>
+              <w:spacing w:before="0" w:after="0" w:line="280" w:lineRule="exact"/>
               <w:jc w:val="center"/>
             </w:pPr>
             <w:r>
               <w:rPr>
-                <w:rFonts w:ascii="Arial" w:hAnsi="Arial" w:eastAsia="PingFang SC"/>
+                <w:rFonts w:ascii="Arial" w:hAnsi="Arial" w:eastAsia="Noto Sans SC"/>
                 <w:b w:val="0"/>
                 <w:color w:val="000000"/>
                 <w:sz w:val="21"/>
@@ -1888,12 +1888,12 @@
           </w:tcPr>
           <w:p>
             <w:pPr>
-              <w:spacing w:before="0" w:after="0" w:line="252" w:lineRule="auto"/>
+              <w:spacing w:before="0" w:after="0" w:line="280" w:lineRule="exact"/>
               <w:jc w:val="center"/>
             </w:pPr>
             <w:r>
               <w:rPr>
-                <w:rFonts w:ascii="Arial" w:hAnsi="Arial" w:eastAsia="PingFang SC"/>
+                <w:rFonts w:ascii="Arial" w:hAnsi="Arial" w:eastAsia="Noto Sans SC"/>
                 <w:b w:val="0"/>
                 <w:color w:val="000000"/>
                 <w:sz w:val="21"/>
@@ -1915,12 +1915,12 @@
           </w:tcPr>
           <w:p>
             <w:pPr>
-              <w:spacing w:before="0" w:after="0" w:line="252" w:lineRule="auto"/>
+              <w:spacing w:before="0" w:after="0" w:line="280" w:lineRule="exact"/>
               <w:jc w:val="left"/>
             </w:pPr>
             <w:r>
               <w:rPr>
-                <w:rFonts w:ascii="Arial" w:hAnsi="Arial" w:eastAsia="PingFang SC"/>
+                <w:rFonts w:ascii="Arial" w:hAnsi="Arial" w:eastAsia="Noto Sans SC"/>
                 <w:b w:val="0"/>
                 <w:color w:val="000000"/>
                 <w:sz w:val="21"/>
@@ -1937,12 +1937,12 @@
           </w:tcPr>
           <w:p>
             <w:pPr>
-              <w:spacing w:before="0" w:after="0" w:line="252" w:lineRule="auto"/>
+              <w:spacing w:before="0" w:after="0" w:line="280" w:lineRule="exact"/>
               <w:jc w:val="center"/>
             </w:pPr>
             <w:r>
               <w:rPr>
-                <w:rFonts w:ascii="Arial" w:hAnsi="Arial" w:eastAsia="PingFang SC"/>
+                <w:rFonts w:ascii="Arial" w:hAnsi="Arial" w:eastAsia="Noto Sans SC"/>
                 <w:b w:val="0"/>
                 <w:color w:val="000000"/>
                 <w:sz w:val="21"/>
@@ -1959,12 +1959,12 @@
           </w:tcPr>
           <w:p>
             <w:pPr>
-              <w:spacing w:before="0" w:after="0" w:line="252" w:lineRule="auto"/>
+              <w:spacing w:before="0" w:after="0" w:line="280" w:lineRule="exact"/>
               <w:jc w:val="center"/>
             </w:pPr>
             <w:r>
               <w:rPr>
-                <w:rFonts w:ascii="Arial" w:hAnsi="Arial" w:eastAsia="PingFang SC"/>
+                <w:rFonts w:ascii="Arial" w:hAnsi="Arial" w:eastAsia="Noto Sans SC"/>
                 <w:b w:val="0"/>
                 <w:color w:val="000000"/>
                 <w:sz w:val="21"/>
@@ -1981,12 +1981,12 @@
           </w:tcPr>
           <w:p>
             <w:pPr>
-              <w:spacing w:before="0" w:after="0" w:line="252" w:lineRule="auto"/>
+              <w:spacing w:before="0" w:after="0" w:line="280" w:lineRule="exact"/>
               <w:jc w:val="center"/>
             </w:pPr>
             <w:r>
               <w:rPr>
-                <w:rFonts w:ascii="Arial" w:hAnsi="Arial" w:eastAsia="PingFang SC"/>
+                <w:rFonts w:ascii="Arial" w:hAnsi="Arial" w:eastAsia="Noto Sans SC"/>
                 <w:b w:val="0"/>
                 <w:color w:val="000000"/>
                 <w:sz w:val="21"/>
@@ -2008,12 +2008,12 @@
           </w:tcPr>
           <w:p>
             <w:pPr>
-              <w:spacing w:before="0" w:after="0" w:line="252" w:lineRule="auto"/>
+              <w:spacing w:before="0" w:after="0" w:line="280" w:lineRule="exact"/>
               <w:jc w:val="left"/>
             </w:pPr>
             <w:r>
               <w:rPr>
-                <w:rFonts w:ascii="Arial" w:hAnsi="Arial" w:eastAsia="PingFang SC"/>
+                <w:rFonts w:ascii="Arial" w:hAnsi="Arial" w:eastAsia="Noto Sans SC"/>
                 <w:b w:val="0"/>
                 <w:color w:val="000000"/>
                 <w:sz w:val="21"/>
@@ -2030,12 +2030,12 @@
           </w:tcPr>
           <w:p>
             <w:pPr>
-              <w:spacing w:before="0" w:after="0" w:line="252" w:lineRule="auto"/>
+              <w:spacing w:before="0" w:after="0" w:line="280" w:lineRule="exact"/>
               <w:jc w:val="center"/>
             </w:pPr>
             <w:r>
               <w:rPr>
-                <w:rFonts w:ascii="Arial" w:hAnsi="Arial" w:eastAsia="PingFang SC"/>
+                <w:rFonts w:ascii="Arial" w:hAnsi="Arial" w:eastAsia="Noto Sans SC"/>
                 <w:b w:val="0"/>
                 <w:color w:val="000000"/>
                 <w:sz w:val="21"/>
@@ -2052,12 +2052,12 @@
           </w:tcPr>
           <w:p>
             <w:pPr>
-              <w:spacing w:before="0" w:after="0" w:line="252" w:lineRule="auto"/>
+              <w:spacing w:before="0" w:after="0" w:line="280" w:lineRule="exact"/>
               <w:jc w:val="center"/>
             </w:pPr>
             <w:r>
               <w:rPr>
-                <w:rFonts w:ascii="Arial" w:hAnsi="Arial" w:eastAsia="PingFang SC"/>
+                <w:rFonts w:ascii="Arial" w:hAnsi="Arial" w:eastAsia="Noto Sans SC"/>
                 <w:b w:val="0"/>
                 <w:color w:val="000000"/>
                 <w:sz w:val="21"/>
@@ -2074,12 +2074,12 @@
           </w:tcPr>
           <w:p>
             <w:pPr>
-              <w:spacing w:before="0" w:after="0" w:line="252" w:lineRule="auto"/>
+              <w:spacing w:before="0" w:after="0" w:line="280" w:lineRule="exact"/>
               <w:jc w:val="center"/>
             </w:pPr>
             <w:r>
               <w:rPr>
-                <w:rFonts w:ascii="Arial" w:hAnsi="Arial" w:eastAsia="PingFang SC"/>
+                <w:rFonts w:ascii="Arial" w:hAnsi="Arial" w:eastAsia="Noto Sans SC"/>
                 <w:b w:val="0"/>
                 <w:color w:val="000000"/>
                 <w:sz w:val="21"/>
@@ -2101,12 +2101,12 @@
           </w:tcPr>
           <w:p>
             <w:pPr>
-              <w:spacing w:before="0" w:after="0" w:line="252" w:lineRule="auto"/>
+              <w:spacing w:before="0" w:after="0" w:line="280" w:lineRule="exact"/>
               <w:jc w:val="left"/>
             </w:pPr>
             <w:r>
               <w:rPr>
-                <w:rFonts w:ascii="Arial" w:hAnsi="Arial" w:eastAsia="PingFang SC"/>
+                <w:rFonts w:ascii="Arial" w:hAnsi="Arial" w:eastAsia="Noto Sans SC"/>
                 <w:b w:val="0"/>
                 <w:color w:val="000000"/>
                 <w:sz w:val="21"/>
@@ -2123,12 +2123,12 @@
           </w:tcPr>
           <w:p>
             <w:pPr>
-              <w:spacing w:before="0" w:after="0" w:line="252" w:lineRule="auto"/>
+              <w:spacing w:before="0" w:after="0" w:line="280" w:lineRule="exact"/>
               <w:jc w:val="center"/>
             </w:pPr>
             <w:r>
               <w:rPr>
-                <w:rFonts w:ascii="Arial" w:hAnsi="Arial" w:eastAsia="PingFang SC"/>
+                <w:rFonts w:ascii="Arial" w:hAnsi="Arial" w:eastAsia="Noto Sans SC"/>
                 <w:b w:val="0"/>
                 <w:color w:val="000000"/>
                 <w:sz w:val="21"/>
@@ -2145,12 +2145,12 @@
           </w:tcPr>
           <w:p>
             <w:pPr>
-              <w:spacing w:before="0" w:after="0" w:line="252" w:lineRule="auto"/>
+              <w:spacing w:before="0" w:after="0" w:line="280" w:lineRule="exact"/>
               <w:jc w:val="center"/>
             </w:pPr>
             <w:r>
               <w:rPr>
-                <w:rFonts w:ascii="Arial" w:hAnsi="Arial" w:eastAsia="PingFang SC"/>
+                <w:rFonts w:ascii="Arial" w:hAnsi="Arial" w:eastAsia="Noto Sans SC"/>
                 <w:b w:val="0"/>
                 <w:color w:val="000000"/>
                 <w:sz w:val="21"/>
@@ -2167,12 +2167,12 @@
           </w:tcPr>
           <w:p>
             <w:pPr>
-              <w:spacing w:before="0" w:after="0" w:line="252" w:lineRule="auto"/>
+              <w:spacing w:before="0" w:after="0" w:line="280" w:lineRule="exact"/>
               <w:jc w:val="center"/>
             </w:pPr>
             <w:r>
               <w:rPr>
-                <w:rFonts w:ascii="Arial" w:hAnsi="Arial" w:eastAsia="PingFang SC"/>
+                <w:rFonts w:ascii="Arial" w:hAnsi="Arial" w:eastAsia="Noto Sans SC"/>
                 <w:b w:val="0"/>
                 <w:color w:val="000000"/>
                 <w:sz w:val="21"/>
@@ -2194,12 +2194,12 @@
           </w:tcPr>
           <w:p>
             <w:pPr>
-              <w:spacing w:before="0" w:after="0" w:line="252" w:lineRule="auto"/>
+              <w:spacing w:before="0" w:after="0" w:line="280" w:lineRule="exact"/>
               <w:jc w:val="left"/>
             </w:pPr>
             <w:r>
               <w:rPr>
-                <w:rFonts w:ascii="Arial" w:hAnsi="Arial" w:eastAsia="PingFang SC"/>
+                <w:rFonts w:ascii="Arial" w:hAnsi="Arial" w:eastAsia="Noto Sans SC"/>
                 <w:b w:val="0"/>
                 <w:color w:val="000000"/>
                 <w:sz w:val="21"/>
@@ -2216,12 +2216,12 @@
           </w:tcPr>
           <w:p>
             <w:pPr>
-              <w:spacing w:before="0" w:after="0" w:line="252" w:lineRule="auto"/>
+              <w:spacing w:before="0" w:after="0" w:line="280" w:lineRule="exact"/>
               <w:jc w:val="center"/>
             </w:pPr>
             <w:r>
               <w:rPr>
-                <w:rFonts w:ascii="Arial" w:hAnsi="Arial" w:eastAsia="PingFang SC"/>
+                <w:rFonts w:ascii="Arial" w:hAnsi="Arial" w:eastAsia="Noto Sans SC"/>
                 <w:b w:val="0"/>
                 <w:color w:val="000000"/>
                 <w:sz w:val="21"/>
@@ -2238,12 +2238,12 @@
           </w:tcPr>
           <w:p>
             <w:pPr>
-              <w:spacing w:before="0" w:after="0" w:line="252" w:lineRule="auto"/>
+              <w:spacing w:before="0" w:after="0" w:line="280" w:lineRule="exact"/>
               <w:jc w:val="center"/>
             </w:pPr>
             <w:r>
               <w:rPr>
-                <w:rFonts w:ascii="Arial" w:hAnsi="Arial" w:eastAsia="PingFang SC"/>
+                <w:rFonts w:ascii="Arial" w:hAnsi="Arial" w:eastAsia="Noto Sans SC"/>
                 <w:b w:val="0"/>
                 <w:color w:val="000000"/>
                 <w:sz w:val="21"/>
@@ -2260,12 +2260,12 @@
           </w:tcPr>
           <w:p>
             <w:pPr>
-              <w:spacing w:before="0" w:after="0" w:line="252" w:lineRule="auto"/>
+              <w:spacing w:before="0" w:after="0" w:line="280" w:lineRule="exact"/>
               <w:jc w:val="center"/>
             </w:pPr>
             <w:r>
               <w:rPr>
-                <w:rFonts w:ascii="Arial" w:hAnsi="Arial" w:eastAsia="PingFang SC"/>
+                <w:rFonts w:ascii="Arial" w:hAnsi="Arial" w:eastAsia="Noto Sans SC"/>
                 <w:b w:val="0"/>
                 <w:color w:val="000000"/>
                 <w:sz w:val="21"/>
@@ -2287,12 +2287,12 @@
           </w:tcPr>
           <w:p>
             <w:pPr>
-              <w:spacing w:before="0" w:after="0" w:line="252" w:lineRule="auto"/>
+              <w:spacing w:before="0" w:after="0" w:line="280" w:lineRule="exact"/>
               <w:jc w:val="left"/>
             </w:pPr>
             <w:r>
               <w:rPr>
-                <w:rFonts w:ascii="Arial" w:hAnsi="Arial" w:eastAsia="PingFang SC"/>
+                <w:rFonts w:ascii="Arial" w:hAnsi="Arial" w:eastAsia="Noto Sans SC"/>
                 <w:b w:val="0"/>
                 <w:color w:val="000000"/>
                 <w:sz w:val="21"/>
@@ -2309,12 +2309,12 @@
           </w:tcPr>
           <w:p>
             <w:pPr>
-              <w:spacing w:before="0" w:after="0" w:line="252" w:lineRule="auto"/>
+              <w:spacing w:before="0" w:after="0" w:line="280" w:lineRule="exact"/>
               <w:jc w:val="center"/>
             </w:pPr>
             <w:r>
               <w:rPr>
-                <w:rFonts w:ascii="Arial" w:hAnsi="Arial" w:eastAsia="PingFang SC"/>
+                <w:rFonts w:ascii="Arial" w:hAnsi="Arial" w:eastAsia="Noto Sans SC"/>
                 <w:b/>
                 <w:color w:val="000000"/>
                 <w:sz w:val="21"/>
@@ -2331,12 +2331,12 @@
           </w:tcPr>
           <w:p>
             <w:pPr>
-              <w:spacing w:before="0" w:after="0" w:line="252" w:lineRule="auto"/>
+              <w:spacing w:before="0" w:after="0" w:line="280" w:lineRule="exact"/>
               <w:jc w:val="center"/>
             </w:pPr>
             <w:r>
               <w:rPr>
-                <w:rFonts w:ascii="Arial" w:hAnsi="Arial" w:eastAsia="PingFang SC"/>
+                <w:rFonts w:ascii="Arial" w:hAnsi="Arial" w:eastAsia="Noto Sans SC"/>
                 <w:b w:val="0"/>
                 <w:color w:val="000000"/>
                 <w:sz w:val="21"/>
@@ -2353,12 +2353,12 @@
           </w:tcPr>
           <w:p>
             <w:pPr>
-              <w:spacing w:before="0" w:after="0" w:line="252" w:lineRule="auto"/>
+              <w:spacing w:before="0" w:after="0" w:line="280" w:lineRule="exact"/>
               <w:jc w:val="center"/>
             </w:pPr>
             <w:r>
               <w:rPr>
-                <w:rFonts w:ascii="Arial" w:hAnsi="Arial" w:eastAsia="PingFang SC"/>
+                <w:rFonts w:ascii="Arial" w:hAnsi="Arial" w:eastAsia="Noto Sans SC"/>
                 <w:b w:val="0"/>
                 <w:color w:val="000000"/>
                 <w:sz w:val="21"/>
@@ -2380,12 +2380,12 @@
           </w:tcPr>
           <w:p>
             <w:pPr>
-              <w:spacing w:before="0" w:after="0" w:line="252" w:lineRule="auto"/>
+              <w:spacing w:before="0" w:after="0" w:line="280" w:lineRule="exact"/>
               <w:jc w:val="left"/>
             </w:pPr>
             <w:r>
               <w:rPr>
-                <w:rFonts w:ascii="Arial" w:hAnsi="Arial" w:eastAsia="PingFang SC"/>
+                <w:rFonts w:ascii="Arial" w:hAnsi="Arial" w:eastAsia="Noto Sans SC"/>
                 <w:b w:val="0"/>
                 <w:color w:val="000000"/>
                 <w:sz w:val="21"/>
@@ -2402,12 +2402,12 @@
           </w:tcPr>
           <w:p>
             <w:pPr>
-              <w:spacing w:before="0" w:after="0" w:line="252" w:lineRule="auto"/>
+              <w:spacing w:before="0" w:after="0" w:line="280" w:lineRule="exact"/>
               <w:jc w:val="center"/>
             </w:pPr>
             <w:r>
               <w:rPr>
-                <w:rFonts w:ascii="Arial" w:hAnsi="Arial" w:eastAsia="PingFang SC"/>
+                <w:rFonts w:ascii="Arial" w:hAnsi="Arial" w:eastAsia="Noto Sans SC"/>
                 <w:b w:val="0"/>
                 <w:color w:val="000000"/>
                 <w:sz w:val="21"/>
@@ -2424,12 +2424,12 @@
           </w:tcPr>
           <w:p>
             <w:pPr>
-              <w:spacing w:before="0" w:after="0" w:line="252" w:lineRule="auto"/>
+              <w:spacing w:before="0" w:after="0" w:line="280" w:lineRule="exact"/>
               <w:jc w:val="center"/>
             </w:pPr>
             <w:r>
               <w:rPr>
-                <w:rFonts w:ascii="Arial" w:hAnsi="Arial" w:eastAsia="PingFang SC"/>
+                <w:rFonts w:ascii="Arial" w:hAnsi="Arial" w:eastAsia="Noto Sans SC"/>
                 <w:b w:val="0"/>
                 <w:color w:val="000000"/>
                 <w:sz w:val="21"/>
@@ -2446,12 +2446,12 @@
           </w:tcPr>
           <w:p>
             <w:pPr>
-              <w:spacing w:before="0" w:after="0" w:line="252" w:lineRule="auto"/>
+              <w:spacing w:before="0" w:after="0" w:line="280" w:lineRule="exact"/>
               <w:jc w:val="center"/>
             </w:pPr>
             <w:r>
               <w:rPr>
-                <w:rFonts w:ascii="Arial" w:hAnsi="Arial" w:eastAsia="PingFang SC"/>
+                <w:rFonts w:ascii="Arial" w:hAnsi="Arial" w:eastAsia="Noto Sans SC"/>
                 <w:b w:val="0"/>
                 <w:color w:val="000000"/>
                 <w:sz w:val="21"/>
@@ -2473,12 +2473,12 @@
           </w:tcPr>
           <w:p>
             <w:pPr>
-              <w:spacing w:before="0" w:after="0" w:line="252" w:lineRule="auto"/>
+              <w:spacing w:before="0" w:after="0" w:line="280" w:lineRule="exact"/>
               <w:jc w:val="left"/>
             </w:pPr>
             <w:r>
               <w:rPr>
-                <w:rFonts w:ascii="Arial" w:hAnsi="Arial" w:eastAsia="PingFang SC"/>
+                <w:rFonts w:ascii="Arial" w:hAnsi="Arial" w:eastAsia="Noto Sans SC"/>
                 <w:b w:val="0"/>
                 <w:color w:val="000000"/>
                 <w:sz w:val="21"/>
@@ -2495,12 +2495,12 @@
           </w:tcPr>
           <w:p>
             <w:pPr>
-              <w:spacing w:before="0" w:after="0" w:line="252" w:lineRule="auto"/>
+              <w:spacing w:before="0" w:after="0" w:line="280" w:lineRule="exact"/>
               <w:jc w:val="center"/>
             </w:pPr>
             <w:r>
               <w:rPr>
-                <w:rFonts w:ascii="Arial" w:hAnsi="Arial" w:eastAsia="PingFang SC"/>
+                <w:rFonts w:ascii="Arial" w:hAnsi="Arial" w:eastAsia="Noto Sans SC"/>
                 <w:b w:val="0"/>
                 <w:color w:val="000000"/>
                 <w:sz w:val="21"/>
@@ -2517,12 +2517,12 @@
           </w:tcPr>
           <w:p>
             <w:pPr>
-              <w:spacing w:before="0" w:after="0" w:line="252" w:lineRule="auto"/>
+              <w:spacing w:before="0" w:after="0" w:line="280" w:lineRule="exact"/>
               <w:jc w:val="center"/>
             </w:pPr>
             <w:r>
               <w:rPr>
-                <w:rFonts w:ascii="Arial" w:hAnsi="Arial" w:eastAsia="PingFang SC"/>
+                <w:rFonts w:ascii="Arial" w:hAnsi="Arial" w:eastAsia="Noto Sans SC"/>
                 <w:b w:val="0"/>
                 <w:color w:val="000000"/>
                 <w:sz w:val="21"/>
@@ -2539,12 +2539,12 @@
           </w:tcPr>
           <w:p>
             <w:pPr>
-              <w:spacing w:before="0" w:after="0" w:line="252" w:lineRule="auto"/>
+              <w:spacing w:before="0" w:after="0" w:line="280" w:lineRule="exact"/>
               <w:jc w:val="center"/>
             </w:pPr>
             <w:r>
               <w:rPr>
-                <w:rFonts w:ascii="Arial" w:hAnsi="Arial" w:eastAsia="PingFang SC"/>
+                <w:rFonts w:ascii="Arial" w:hAnsi="Arial" w:eastAsia="Noto Sans SC"/>
                 <w:b w:val="0"/>
                 <w:color w:val="000000"/>
                 <w:sz w:val="21"/>
@@ -2566,12 +2566,12 @@
           </w:tcPr>
           <w:p>
             <w:pPr>
-              <w:spacing w:before="0" w:after="0" w:line="252" w:lineRule="auto"/>
+              <w:spacing w:before="0" w:after="0" w:line="280" w:lineRule="exact"/>
               <w:jc w:val="left"/>
             </w:pPr>
             <w:r>
               <w:rPr>
-                <w:rFonts w:ascii="Arial" w:hAnsi="Arial" w:eastAsia="PingFang SC"/>
+                <w:rFonts w:ascii="Arial" w:hAnsi="Arial" w:eastAsia="Noto Sans SC"/>
                 <w:b w:val="0"/>
                 <w:color w:val="000000"/>
                 <w:sz w:val="21"/>
@@ -2588,12 +2588,12 @@
           </w:tcPr>
           <w:p>
             <w:pPr>
-              <w:spacing w:before="0" w:after="0" w:line="252" w:lineRule="auto"/>
+              <w:spacing w:before="0" w:after="0" w:line="280" w:lineRule="exact"/>
               <w:jc w:val="center"/>
             </w:pPr>
             <w:r>
               <w:rPr>
-                <w:rFonts w:ascii="Arial" w:hAnsi="Arial" w:eastAsia="PingFang SC"/>
+                <w:rFonts w:ascii="Arial" w:hAnsi="Arial" w:eastAsia="Noto Sans SC"/>
                 <w:b w:val="0"/>
                 <w:color w:val="000000"/>
                 <w:sz w:val="21"/>
@@ -2610,12 +2610,12 @@
           </w:tcPr>
           <w:p>
             <w:pPr>
-              <w:spacing w:before="0" w:after="0" w:line="252" w:lineRule="auto"/>
+              <w:spacing w:before="0" w:after="0" w:line="280" w:lineRule="exact"/>
               <w:jc w:val="center"/>
             </w:pPr>
             <w:r>
               <w:rPr>
-                <w:rFonts w:ascii="Arial" w:hAnsi="Arial" w:eastAsia="PingFang SC"/>
+                <w:rFonts w:ascii="Arial" w:hAnsi="Arial" w:eastAsia="Noto Sans SC"/>
                 <w:b w:val="0"/>
                 <w:color w:val="000000"/>
                 <w:sz w:val="21"/>
@@ -2632,12 +2632,12 @@
           </w:tcPr>
           <w:p>
             <w:pPr>
-              <w:spacing w:before="0" w:after="0" w:line="252" w:lineRule="auto"/>
+              <w:spacing w:before="0" w:after="0" w:line="280" w:lineRule="exact"/>
               <w:jc w:val="center"/>
             </w:pPr>
             <w:r>
               <w:rPr>
-                <w:rFonts w:ascii="Arial" w:hAnsi="Arial" w:eastAsia="PingFang SC"/>
+                <w:rFonts w:ascii="Arial" w:hAnsi="Arial" w:eastAsia="Noto Sans SC"/>
                 <w:b w:val="0"/>
                 <w:color w:val="000000"/>
                 <w:sz w:val="21"/>
@@ -2659,12 +2659,12 @@
           </w:tcPr>
           <w:p>
             <w:pPr>
-              <w:spacing w:before="0" w:after="0" w:line="252" w:lineRule="auto"/>
+              <w:spacing w:before="0" w:after="0" w:line="280" w:lineRule="exact"/>
               <w:jc w:val="left"/>
             </w:pPr>
             <w:r>
               <w:rPr>
-                <w:rFonts w:ascii="Arial" w:hAnsi="Arial" w:eastAsia="PingFang SC"/>
+                <w:rFonts w:ascii="Arial" w:hAnsi="Arial" w:eastAsia="Noto Sans SC"/>
                 <w:b w:val="0"/>
                 <w:color w:val="000000"/>
                 <w:sz w:val="21"/>
@@ -2681,12 +2681,12 @@
           </w:tcPr>
           <w:p>
             <w:pPr>
-              <w:spacing w:before="0" w:after="0" w:line="252" w:lineRule="auto"/>
+              <w:spacing w:before="0" w:after="0" w:line="280" w:lineRule="exact"/>
               <w:jc w:val="center"/>
             </w:pPr>
             <w:r>
               <w:rPr>
-                <w:rFonts w:ascii="Arial" w:hAnsi="Arial" w:eastAsia="PingFang SC"/>
+                <w:rFonts w:ascii="Arial" w:hAnsi="Arial" w:eastAsia="Noto Sans SC"/>
                 <w:b w:val="0"/>
                 <w:color w:val="000000"/>
                 <w:sz w:val="21"/>
@@ -2703,12 +2703,12 @@
           </w:tcPr>
           <w:p>
             <w:pPr>
-              <w:spacing w:before="0" w:after="0" w:line="252" w:lineRule="auto"/>
+              <w:spacing w:before="0" w:after="0" w:line="280" w:lineRule="exact"/>
               <w:jc w:val="center"/>
             </w:pPr>
             <w:r>
               <w:rPr>
-                <w:rFonts w:ascii="Arial" w:hAnsi="Arial" w:eastAsia="PingFang SC"/>
+                <w:rFonts w:ascii="Arial" w:hAnsi="Arial" w:eastAsia="Noto Sans SC"/>
                 <w:b w:val="0"/>
                 <w:color w:val="000000"/>
                 <w:sz w:val="21"/>
@@ -2725,12 +2725,12 @@
           </w:tcPr>
           <w:p>
             <w:pPr>
-              <w:spacing w:before="0" w:after="0" w:line="252" w:lineRule="auto"/>
+              <w:spacing w:before="0" w:after="0" w:line="280" w:lineRule="exact"/>
               <w:jc w:val="center"/>
             </w:pPr>
             <w:r>
               <w:rPr>
-                <w:rFonts w:ascii="Arial" w:hAnsi="Arial" w:eastAsia="PingFang SC"/>
+                <w:rFonts w:ascii="Arial" w:hAnsi="Arial" w:eastAsia="Noto Sans SC"/>
                 <w:b w:val="0"/>
                 <w:color w:val="000000"/>
                 <w:sz w:val="21"/>
@@ -2752,12 +2752,12 @@
           </w:tcPr>
           <w:p>
             <w:pPr>
-              <w:spacing w:before="0" w:after="0" w:line="252" w:lineRule="auto"/>
+              <w:spacing w:before="0" w:after="0" w:line="280" w:lineRule="exact"/>
               <w:jc w:val="left"/>
             </w:pPr>
             <w:r>
               <w:rPr>
-                <w:rFonts w:ascii="Arial" w:hAnsi="Arial" w:eastAsia="PingFang SC"/>
+                <w:rFonts w:ascii="Arial" w:hAnsi="Arial" w:eastAsia="Noto Sans SC"/>
                 <w:b w:val="0"/>
                 <w:color w:val="000000"/>
                 <w:sz w:val="21"/>
@@ -2774,12 +2774,12 @@
           </w:tcPr>
           <w:p>
             <w:pPr>
-              <w:spacing w:before="0" w:after="0" w:line="252" w:lineRule="auto"/>
+              <w:spacing w:before="0" w:after="0" w:line="280" w:lineRule="exact"/>
               <w:jc w:val="center"/>
             </w:pPr>
             <w:r>
               <w:rPr>
-                <w:rFonts w:ascii="Arial" w:hAnsi="Arial" w:eastAsia="PingFang SC"/>
+                <w:rFonts w:ascii="Arial" w:hAnsi="Arial" w:eastAsia="Noto Sans SC"/>
                 <w:b w:val="0"/>
                 <w:color w:val="000000"/>
                 <w:sz w:val="21"/>
@@ -2796,12 +2796,12 @@
           </w:tcPr>
           <w:p>
             <w:pPr>
-              <w:spacing w:before="0" w:after="0" w:line="252" w:lineRule="auto"/>
+              <w:spacing w:before="0" w:after="0" w:line="280" w:lineRule="exact"/>
               <w:jc w:val="center"/>
             </w:pPr>
             <w:r>
               <w:rPr>
-                <w:rFonts w:ascii="Arial" w:hAnsi="Arial" w:eastAsia="PingFang SC"/>
+                <w:rFonts w:ascii="Arial" w:hAnsi="Arial" w:eastAsia="Noto Sans SC"/>
                 <w:b w:val="0"/>
                 <w:color w:val="000000"/>
                 <w:sz w:val="21"/>
@@ -2818,12 +2818,12 @@
           </w:tcPr>
           <w:p>
             <w:pPr>
-              <w:spacing w:before="0" w:after="0" w:line="252" w:lineRule="auto"/>
+              <w:spacing w:before="0" w:after="0" w:line="280" w:lineRule="exact"/>
               <w:jc w:val="center"/>
             </w:pPr>
             <w:r>
               <w:rPr>
-                <w:rFonts w:ascii="Arial" w:hAnsi="Arial" w:eastAsia="PingFang SC"/>
+                <w:rFonts w:ascii="Arial" w:hAnsi="Arial" w:eastAsia="Noto Sans SC"/>
                 <w:b w:val="0"/>
                 <w:color w:val="000000"/>
                 <w:sz w:val="21"/>
@@ -2841,27 +2841,12 @@
       </w:pPr>
       <w:r>
         <w:rPr>
-          <w:rFonts w:ascii="Arial" w:hAnsi="Arial" w:eastAsia="PingFang SC"/>
+          <w:rFonts w:ascii="Arial" w:hAnsi="Arial" w:eastAsia="Noto Sans SC"/>
           <w:b w:val="0"/>
           <w:color w:val="000000"/>
           <w:sz w:val="18"/>
         </w:rPr>
         <w:t>数据来源  ZenMux Arena  批次 20260911T040759</w:t>
-      </w:r>
-    </w:p>
-    <w:p>
-      <w:pPr>
-        <w:widowControl/>
-        <w:spacing w:after="0"/>
-      </w:pPr>
-      <w:r>
-        <w:rPr>
-          <w:rFonts w:ascii="Arial" w:hAnsi="Arial" w:eastAsia="PingFang SC"/>
-          <w:b w:val="0"/>
-          <w:color w:val="000000"/>
-          <w:sz w:val="18"/>
-        </w:rPr>
-        <w:t>完整类型分布、逐份计分及未稳定原因详见同批次 report.md 和 aggregate.json。</w:t>
       </w:r>
     </w:p>
     <w:sectPr>
@@ -2884,7 +2869,7 @@
     </w:pPr>
     <w:r>
       <w:rPr>
-        <w:rFonts w:ascii="Arial" w:hAnsi="Arial" w:eastAsia="PingFang SC"/>
+        <w:rFonts w:ascii="Arial" w:hAnsi="Arial" w:eastAsia="Noto Sans SC"/>
         <w:b w:val="0"/>
         <w:color w:val="000000"/>
         <w:sz w:val="18"/>
@@ -3259,10 +3244,11 @@
     <w:qFormat/>
     <w:rsid w:val="00FC693F"/>
     <w:pPr>
-      <w:spacing w:after="140" w:line="312" w:lineRule="auto"/>
+      <w:spacing w:after="100" w:line="320" w:lineRule="exact"/>
+      <w:snapToGrid w:val="0"/>
     </w:pPr>
     <w:rPr>
-      <w:rFonts w:ascii="Arial" w:hAnsi="Arial" w:eastAsia="PingFang SC"/>
+      <w:rFonts w:ascii="Arial" w:hAnsi="Arial" w:eastAsia="Noto Sans SC"/>
       <w:b w:val="0"/>
       <w:color w:val="000000"/>
       <w:sz w:val="22"/>
@@ -3302,10 +3288,11 @@
         <w:tab w:val="center" w:pos="4680"/>
         <w:tab w:val="right" w:pos="9360"/>
       </w:tabs>
-      <w:spacing w:after="140" w:line="312" w:lineRule="auto"/>
+      <w:spacing w:after="100" w:line="320" w:lineRule="exact"/>
+      <w:snapToGrid w:val="0"/>
     </w:pPr>
     <w:rPr>
-      <w:rFonts w:ascii="Arial" w:hAnsi="Arial" w:eastAsia="PingFang SC"/>
+      <w:rFonts w:ascii="Arial" w:hAnsi="Arial" w:eastAsia="Noto Sans SC"/>
       <w:b w:val="0"/>
       <w:color w:val="000000"/>
       <w:sz w:val="22"/>
@@ -3329,11 +3316,12 @@
     <w:pPr>
       <w:keepNext/>
       <w:keepLines/>
-      <w:spacing w:before="260" w:after="140" w:line="312" w:lineRule="auto"/>
+      <w:spacing w:before="200" w:after="140" w:line="400" w:lineRule="exact"/>
       <w:outlineLvl w:val="0"/>
+      <w:snapToGrid w:val="0"/>
     </w:pPr>
     <w:rPr>
-      <w:rFonts w:ascii="Arial" w:hAnsi="Arial" w:eastAsia="PingFang SC"/>
+      <w:rFonts w:ascii="Arial" w:hAnsi="Arial" w:eastAsia="Noto Sans SC"/>
       <w:b/>
       <w:bCs/>
       <w:color w:val="000000"/>
@@ -3353,11 +3341,12 @@
     <w:pPr>
       <w:keepNext/>
       <w:keepLines/>
-      <w:spacing w:before="140" w:after="60" w:line="312" w:lineRule="auto"/>
+      <w:spacing w:before="100" w:after="60" w:line="320" w:lineRule="exact"/>
       <w:outlineLvl w:val="1"/>
+      <w:snapToGrid w:val="0"/>
     </w:pPr>
     <w:rPr>
-      <w:rFonts w:ascii="Arial" w:hAnsi="Arial" w:eastAsia="PingFang SC"/>
+      <w:rFonts w:ascii="Arial" w:hAnsi="Arial" w:eastAsia="Noto Sans SC"/>
       <w:b/>
       <w:bCs/>
       <w:color w:val="000000"/>
@@ -3615,14 +3604,12 @@
     <w:qFormat/>
     <w:rsid w:val="00FC693F"/>
     <w:pPr>
-      <w:pBdr>
-        <w:bottom w:val="single" w:sz="8" w:space="4" w:color="4F81BD" w:themeColor="accent1"/>
-      </w:pBdr>
-      <w:spacing w:after="160" w:line="312" w:lineRule="auto"/>
+      <w:spacing w:after="160" w:line="640" w:lineRule="exact"/>
       <w:contextualSpacing/>
+      <w:snapToGrid w:val="0"/>
     </w:pPr>
     <w:rPr>
-      <w:rFonts w:ascii="Arial" w:hAnsi="Arial" w:eastAsia="PingFang SC"/>
+      <w:rFonts w:ascii="Arial" w:hAnsi="Arial" w:eastAsia="Noto Sans SC"/>
       <w:b/>
       <w:color w:val="000000"/>
       <w:spacing w:val="5"/>
@@ -3658,12 +3645,13 @@
       <w:numPr>
         <w:ilvl w:val="1"/>
       </w:numPr>
-      <w:spacing w:after="340" w:line="312" w:lineRule="auto"/>
+      <w:spacing w:after="340" w:line="280" w:lineRule="exact"/>
+      <w:snapToGrid w:val="0"/>
     </w:pPr>
     <w:rPr>
-      <w:rFonts w:ascii="Arial" w:hAnsi="Arial" w:eastAsia="PingFang SC"/>
+      <w:rFonts w:ascii="Arial" w:hAnsi="Arial" w:eastAsia="Noto Sans SC"/>
       <w:b w:val="0"/>
-      <w:i/>
+      <w:i w:val="0"/>
       <w:iCs/>
       <w:color w:val="000000"/>
       <w:spacing w:val="15"/>
@@ -4105,9 +4093,6 @@
     <w:qFormat/>
     <w:rsid w:val="00FC693F"/>
     <w:pPr>
-      <w:pBdr>
-        <w:bottom w:val="single" w:sz="4" w:space="4" w:color="4F81BD" w:themeColor="accent1"/>
-      </w:pBdr>
       <w:spacing w:before="200" w:after="280"/>
       <w:ind w:left="936" w:right="936"/>
     </w:pPr>

</xml_diff>

<commit_message>
Refactor MBTI data handling and update tests
- Updated MBTI data structure to reflect new classification rules, including changes to stable and unstable counts.
- Enhanced the loadMbtiTalkData function to enforce new majority-only rule.
- Modified tests to align with updated data structure and validation logic.
- Added new render tests for the MbtiPanel component to ensure correct rendering of model cards and views.
- Adjusted CSS styles for improved layout and responsiveness in the MBTI gallery.
- Updated story content to reflect changes in model stability and classification.
</commit_message>
<xml_diff>
--- a/results/llm-mbti-oejts/20260911T040759/MBTI测试结果总结.docx
+++ b/results/llm-mbti-oejts/20260911T040759/MBTI测试结果总结.docx
@@ -6,8 +6,14 @@
       <w:pPr>
         <w:pStyle w:val="Title"/>
         <w:widowControl/>
+        <w:spacing w:line="560" w:lineRule="exact" w:after="160"/>
       </w:pPr>
       <w:r>
+        <w:rPr>
+          <w:color w:val="000000"/>
+          <w:sz w:val="44"/>
+          <w:u w:val="none"/>
+        </w:rPr>
         <w:t>大模型 MBTI 测试结果总结</w:t>
       </w:r>
     </w:p>
@@ -15,23 +21,32 @@
       <w:pPr>
         <w:pStyle w:val="Subtitle"/>
         <w:widowControl/>
+        <w:spacing w:line="290" w:lineRule="exact" w:before="0" w:after="100"/>
       </w:pPr>
       <w:r>
-        <w:t>OEJTS 测试   2026 年 9 月 11 日</w:t>
+        <w:rPr>
+          <w:sz w:val="21"/>
+        </w:rPr>
+        <w:t>OEJTS 测试   2026 年 9 月 11 日施测   9 月 17 日分析修订</w:t>
       </w:r>
     </w:p>
     <w:p>
       <w:pPr>
         <w:widowControl/>
+        <w:spacing w:line="290" w:lineRule="exact" w:before="0" w:after="100"/>
       </w:pPr>
       <w:r>
-        <w:t>本次测试覆盖 27 款大模型，每款完成 16 份独立问卷，共得到 432 份有效结果。其中，12 款达到预设稳定标准：8 款为 INTJ，4 款为 ISTJ；其余 15 款为未稳定。稳定结果集中于 INTJ 和 ISTJ，未稳定模型的主要分歧集中在 S/N 维度。</w:t>
+        <w:rPr>
+          <w:sz w:val="21"/>
+        </w:rPr>
+        <w:t>本次测试覆盖 27 款大模型，每款完成 16 份完整问卷，共 432 份有效结果。按修订后的唯一众数严格过半判据，22 款稳定：13 款 INTJ、9 款 ISTJ；其余 5 款未稳定。本次仅重分析既有问卷，原始回答、提示词与运行快照不变。</w:t>
       </w:r>
     </w:p>
     <w:p>
       <w:pPr>
         <w:pStyle w:val="Heading1"/>
         <w:widowControl/>
+        <w:spacing w:line="360" w:lineRule="exact" w:before="180" w:after="100"/>
       </w:pPr>
       <w:r>
         <w:t>测试范围和判定标准</w:t>
@@ -40,39 +55,56 @@
     <w:p>
       <w:pPr>
         <w:widowControl/>
+        <w:spacing w:line="290" w:lineRule="exact" w:before="0" w:after="100"/>
       </w:pPr>
       <w:r>
+        <w:rPr>
+          <w:sz w:val="21"/>
+        </w:rPr>
         <w:t>使用 OEJTS 1.2 原始五点量表，每份包含 32 题。所有纳入结果均已核验题目完整、分数可计分，且无请求错误或解析错误。每份问卷按固定规则得到四字母类型，再统计同一模型的 16 次结果。</w:t>
       </w:r>
     </w:p>
     <w:p>
       <w:pPr>
         <w:widowControl/>
+        <w:spacing w:line="290" w:lineRule="exact" w:before="0" w:after="100"/>
       </w:pPr>
       <w:r>
-        <w:t>众数是出现次数最多的完整类型。只有同时满足以下两条，才判为稳定类型：</w:t>
+        <w:rPr>
+          <w:sz w:val="21"/>
+        </w:rPr>
+        <w:t>众数是出现次数最多的完整类型。稳定判据只保留一条：</w:t>
       </w:r>
     </w:p>
     <w:p>
       <w:pPr>
         <w:widowControl/>
+        <w:spacing w:line="290" w:lineRule="exact" w:before="0" w:after="100"/>
       </w:pPr>
       <w:r>
-        <w:t>1. 完整类型有唯一众数，且至少出现 9/16 次。</w:t>
+        <w:rPr>
+          <w:sz w:val="21"/>
+        </w:rPr>
+        <w:t>完整类型有唯一众数，且严格超过半数，即至少出现 9/16 次。</w:t>
       </w:r>
     </w:p>
     <w:p>
       <w:pPr>
         <w:widowControl/>
+        <w:spacing w:line="290" w:lineRule="exact" w:before="0" w:after="100"/>
       </w:pPr>
       <w:r>
-        <w:t>2. 该众数的四个字母，各自至少出现 13/16 次。</w:t>
+        <w:rPr>
+          <w:sz w:val="21"/>
+        </w:rPr>
+        <w:t>恰好 8/16 或并列众数均不算稳定。四字母频数和连续分数仅作描述，不再设置逐字母门槛。本判据于 2026 年 9 月 17 日修订，不是本轮原始预注册或官方 MBTI 认证标准。</w:t>
       </w:r>
     </w:p>
     <w:p>
       <w:pPr>
         <w:pStyle w:val="Heading1"/>
         <w:widowControl/>
+        <w:spacing w:line="360" w:lineRule="exact" w:before="180" w:after="100"/>
       </w:pPr>
       <w:r>
         <w:t>主要发现</w:t>
@@ -82,6 +114,7 @@
       <w:pPr>
         <w:pStyle w:val="Heading2"/>
         <w:widowControl/>
+        <w:spacing w:line="300" w:lineRule="exact" w:before="120" w:after="60"/>
       </w:pPr>
       <w:r>
         <w:t>六款模型的类型完全一致</w:t>
@@ -90,8 +123,12 @@
     <w:p>
       <w:pPr>
         <w:widowControl/>
+        <w:spacing w:line="290" w:lineRule="exact" w:before="0" w:after="100"/>
       </w:pPr>
       <w:r>
+        <w:rPr>
+          <w:sz w:val="21"/>
+        </w:rPr>
         <w:t>GPT-6 Astra 的 16 次结果均为 ISTJ。DeepSeek V4.1 Flash、Kimi K3、GPT-5.6 Luna、Terra 和 Sol 的 16 次结果均为 INTJ。这里的一致指完整类型相同，不表示 32 道题的答案逐项相同。</w:t>
       </w:r>
     </w:p>
@@ -99,23 +136,29 @@
       <w:pPr>
         <w:pStyle w:val="Heading2"/>
         <w:widowControl/>
+        <w:spacing w:line="300" w:lineRule="exact" w:before="120" w:after="60"/>
       </w:pPr>
       <w:r>
-        <w:t>S 和 N 是最常见的分歧</w:t>
+        <w:t>严格多数区分稳定与未稳定</w:t>
       </w:r>
     </w:p>
     <w:p>
       <w:pPr>
         <w:widowControl/>
+        <w:spacing w:line="290" w:lineRule="exact" w:before="0" w:after="100"/>
       </w:pPr>
       <w:r>
-        <w:t>15 款未稳定模型中，有 9 款仅因 S 或 N 的出现次数不足 13 次而未通过。这些模型的 I、T、J 较一致，主要在实感 S 与直觉 N 之间变化。</w:t>
+        <w:rPr>
+          <w:sz w:val="21"/>
+        </w:rPr>
+        <w:t>Claude Fable 5.1 的 INTJ 为 9/16（56.25%），判定稳定；ERNIE 5.1 的 ISTJ 为 8/16（50%），虽是唯一众数但未超过半数，判定未稳定。与原分析相比，10 款模型的稳定性结论改变，问卷计分和类型分布未变。</w:t>
       </w:r>
     </w:p>
     <w:p>
       <w:pPr>
         <w:pStyle w:val="Heading2"/>
         <w:widowControl/>
+        <w:spacing w:line="300" w:lineRule="exact" w:before="120" w:after="60"/>
       </w:pPr>
       <w:r>
         <w:t>豆包达到稳定 ISTJ</w:t>
@@ -124,15 +167,20 @@
     <w:p>
       <w:pPr>
         <w:widowControl/>
+        <w:spacing w:line="290" w:lineRule="exact" w:before="0" w:after="100"/>
       </w:pPr>
       <w:r>
-        <w:t>Doubao Seed 2.1 Pro 的分布为 ISTJ 11 次、INTJ 3 次、ISFJ 2 次。I、S、T、J 分别出现 16、13、14、16 次，四个字母均达到门槛。</w:t>
+        <w:rPr>
+          <w:sz w:val="21"/>
+        </w:rPr>
+        <w:t>Doubao Seed 2.1 Pro 的分布为 ISTJ 11 次、INTJ 3 次、ISFJ 2 次。ISTJ 占 68.75%，是唯一众数且严格超过半数，因此判定为稳定 ISTJ。</w:t>
       </w:r>
     </w:p>
     <w:p>
       <w:pPr>
         <w:pStyle w:val="Heading2"/>
         <w:widowControl/>
+        <w:spacing w:line="300" w:lineRule="exact" w:before="120" w:after="60"/>
       </w:pPr>
       <w:r>
         <w:t>两款 Ling 的结果最分散</w:t>
@@ -141,8 +189,12 @@
     <w:p>
       <w:pPr>
         <w:widowControl/>
+        <w:spacing w:line="290" w:lineRule="exact" w:before="0" w:after="100"/>
       </w:pPr>
       <w:r>
+        <w:rPr>
+          <w:sz w:val="21"/>
+        </w:rPr>
         <w:t>Ling 3.0 Tiny 和 Ling-3.0-flash 均出现 11 种完整类型，众数只有 3/16。MiniMax M3 出现 7 种类型，众数 INFJ 为 5/16；这些模型尚不适合用一个固定类型概括。</w:t>
       </w:r>
     </w:p>
@@ -150,6 +202,7 @@
       <w:pPr>
         <w:pStyle w:val="Heading1"/>
         <w:widowControl/>
+        <w:spacing w:line="360" w:lineRule="exact" w:before="180" w:after="100"/>
       </w:pPr>
       <w:r>
         <w:t>如何理解稳定结果</w:t>
@@ -158,22 +211,35 @@
     <w:p>
       <w:pPr>
         <w:widowControl/>
+        <w:spacing w:line="290" w:lineRule="exact" w:before="0" w:after="100"/>
       </w:pPr>
       <w:r>
-        <w:t>稳定性由完整类型频数与四个字母频数共同决定。例如 Step 3.7 Flash 与 Gemini 3.8 Flash 的众数均为 ISTJ 12/16，但前者四个字母均达标，后者 S 仅出现 12 次，因此只有前者稳定。</w:t>
+        <w:rPr>
+          <w:sz w:val="21"/>
+        </w:rPr>
+        <w:t>Step 3.7 Flash 与 Gemini 3.8 Flash 的众数均为 ISTJ 12/16（75%），现均判定稳定。占比指完整类型出现次数除以 16，不是人格置信度。供应商包含 Azure Mistral；输出上限先后为 8192、16384、50000，不能称为全原厂路由或完全一致参数。</w:t>
       </w:r>
     </w:p>
     <w:p>
       <w:pPr>
         <w:widowControl/>
-        <w:spacing w:after="0"/>
+        <w:spacing w:after="100" w:line="290" w:lineRule="exact" w:before="0"/>
       </w:pPr>
       <w:r>
-        <w:t>本结论描述模型在本次 OEJTS 提示和施测设置下的重复答题表现。未稳定不代表问卷无效，也不直接代表模型能力高低；跨场景的人格判断仍需要更多测试。</w:t>
+        <w:rPr>
+          <w:sz w:val="21"/>
+        </w:rPr>
+        <w:t>结论只描述本次问卷条件下的重复回答，不等于内在人格或能力。缓存影响尚未排除；后续通过保持语义的提示词扰动、无扰动对照、缓存命中记录及可用的绕缓存对照再验证。Prompt / KV 缓存不等于整段答案重放；扰动本身也可能影响回答。</w:t>
       </w:r>
     </w:p>
     <w:p>
+      <w:pPr>
+        <w:spacing w:line="290" w:lineRule="exact" w:before="0" w:after="100"/>
+      </w:pPr>
       <w:r>
+        <w:rPr>
+          <w:sz w:val="21"/>
+        </w:rPr>
         <w:br w:type="page"/>
       </w:r>
     </w:p>
@@ -181,6 +247,7 @@
       <w:pPr>
         <w:pStyle w:val="Heading1"/>
         <w:widowControl/>
+        <w:spacing w:line="360" w:lineRule="exact" w:before="180" w:after="100"/>
       </w:pPr>
       <w:r>
         <w:t>全模型结果对照</w:t>
@@ -189,16 +256,16 @@
     <w:p>
       <w:pPr>
         <w:widowControl/>
-        <w:spacing w:after="160"/>
+        <w:spacing w:after="100" w:line="290" w:lineRule="exact" w:before="0"/>
       </w:pPr>
       <w:r>
         <w:rPr>
           <w:rFonts w:ascii="Arial" w:hAnsi="Arial" w:eastAsia="Noto Sans SC"/>
           <w:b w:val="0"/>
           <w:color w:val="000000"/>
-          <w:sz w:val="20"/>
+          <w:sz w:val="21"/>
         </w:rPr>
-        <w:t>每款均有 16 份有效问卷。表中“未稳定”对应 no_stable_type；众数仍保留，便于观察答题倾向。</w:t>
+        <w:t>每款均有 16 份有效问卷。“未稳定”对应 no_stable_type；仍展示最高频类型与占比，以描述倾向而非强贴标签。</w:t>
       </w:r>
     </w:p>
     <w:tbl>
@@ -241,7 +308,7 @@
           </w:tcPr>
           <w:p>
             <w:pPr>
-              <w:spacing w:before="0" w:after="0" w:line="280" w:lineRule="exact"/>
+              <w:spacing w:before="0" w:after="0" w:line="260" w:lineRule="exact"/>
               <w:jc w:val="left"/>
             </w:pPr>
             <w:r>
@@ -249,7 +316,7 @@
                 <w:rFonts w:ascii="Arial" w:hAnsi="Arial" w:eastAsia="Noto Sans SC"/>
                 <w:b/>
                 <w:color w:val="FFFFFF"/>
-                <w:sz w:val="21"/>
+                <w:sz w:val="20"/>
               </w:rPr>
               <w:t>模型</w:t>
             </w:r>
@@ -263,7 +330,7 @@
           </w:tcPr>
           <w:p>
             <w:pPr>
-              <w:spacing w:before="0" w:after="0" w:line="280" w:lineRule="exact"/>
+              <w:spacing w:before="0" w:after="0" w:line="260" w:lineRule="exact"/>
               <w:jc w:val="center"/>
             </w:pPr>
             <w:r>
@@ -271,7 +338,7 @@
                 <w:rFonts w:ascii="Arial" w:hAnsi="Arial" w:eastAsia="Noto Sans SC"/>
                 <w:b/>
                 <w:color w:val="FFFFFF"/>
-                <w:sz w:val="21"/>
+                <w:sz w:val="20"/>
               </w:rPr>
               <w:t>稳定判定</w:t>
             </w:r>
@@ -285,7 +352,7 @@
           </w:tcPr>
           <w:p>
             <w:pPr>
-              <w:spacing w:before="0" w:after="0" w:line="280" w:lineRule="exact"/>
+              <w:spacing w:before="0" w:after="0" w:line="260" w:lineRule="exact"/>
               <w:jc w:val="center"/>
             </w:pPr>
             <w:r>
@@ -293,7 +360,7 @@
                 <w:rFonts w:ascii="Arial" w:hAnsi="Arial" w:eastAsia="Noto Sans SC"/>
                 <w:b/>
                 <w:color w:val="FFFFFF"/>
-                <w:sz w:val="21"/>
+                <w:sz w:val="20"/>
               </w:rPr>
               <w:t>众数类型</w:t>
             </w:r>
@@ -307,7 +374,7 @@
           </w:tcPr>
           <w:p>
             <w:pPr>
-              <w:spacing w:before="0" w:after="0" w:line="280" w:lineRule="exact"/>
+              <w:spacing w:before="0" w:after="0" w:line="260" w:lineRule="exact"/>
               <w:jc w:val="center"/>
             </w:pPr>
             <w:r>
@@ -315,9 +382,9 @@
                 <w:rFonts w:ascii="Arial" w:hAnsi="Arial" w:eastAsia="Noto Sans SC"/>
                 <w:b/>
                 <w:color w:val="FFFFFF"/>
-                <w:sz w:val="21"/>
+                <w:sz w:val="20"/>
               </w:rPr>
-              <w:t>众数频数</w:t>
+              <w:t>频数与占比</w:t>
             </w:r>
           </w:p>
         </w:tc>
@@ -334,7 +401,7 @@
           </w:tcPr>
           <w:p>
             <w:pPr>
-              <w:spacing w:before="0" w:after="0" w:line="280" w:lineRule="exact"/>
+              <w:spacing w:before="0" w:after="0" w:line="260" w:lineRule="exact"/>
               <w:jc w:val="left"/>
             </w:pPr>
             <w:r>
@@ -342,7 +409,7 @@
                 <w:rFonts w:ascii="Arial" w:hAnsi="Arial" w:eastAsia="Noto Sans SC"/>
                 <w:b w:val="0"/>
                 <w:color w:val="000000"/>
-                <w:sz w:val="21"/>
+                <w:sz w:val="20"/>
               </w:rPr>
               <w:t>GPT-6 Astra</w:t>
             </w:r>
@@ -356,7 +423,7 @@
           </w:tcPr>
           <w:p>
             <w:pPr>
-              <w:spacing w:before="0" w:after="0" w:line="280" w:lineRule="exact"/>
+              <w:spacing w:before="0" w:after="0" w:line="260" w:lineRule="exact"/>
               <w:jc w:val="center"/>
             </w:pPr>
             <w:r>
@@ -364,7 +431,7 @@
                 <w:rFonts w:ascii="Arial" w:hAnsi="Arial" w:eastAsia="Noto Sans SC"/>
                 <w:b/>
                 <w:color w:val="000000"/>
-                <w:sz w:val="21"/>
+                <w:sz w:val="20"/>
               </w:rPr>
               <w:t>ISTJ</w:t>
             </w:r>
@@ -378,7 +445,7 @@
           </w:tcPr>
           <w:p>
             <w:pPr>
-              <w:spacing w:before="0" w:after="0" w:line="280" w:lineRule="exact"/>
+              <w:spacing w:before="0" w:after="0" w:line="260" w:lineRule="exact"/>
               <w:jc w:val="center"/>
             </w:pPr>
             <w:r>
@@ -386,7 +453,7 @@
                 <w:rFonts w:ascii="Arial" w:hAnsi="Arial" w:eastAsia="Noto Sans SC"/>
                 <w:b w:val="0"/>
                 <w:color w:val="000000"/>
-                <w:sz w:val="21"/>
+                <w:sz w:val="20"/>
               </w:rPr>
               <w:t>ISTJ</w:t>
             </w:r>
@@ -400,7 +467,7 @@
           </w:tcPr>
           <w:p>
             <w:pPr>
-              <w:spacing w:before="0" w:after="0" w:line="280" w:lineRule="exact"/>
+              <w:spacing w:before="0" w:after="0" w:line="260" w:lineRule="exact"/>
               <w:jc w:val="center"/>
             </w:pPr>
             <w:r>
@@ -408,9 +475,9 @@
                 <w:rFonts w:ascii="Arial" w:hAnsi="Arial" w:eastAsia="Noto Sans SC"/>
                 <w:b w:val="0"/>
                 <w:color w:val="000000"/>
-                <w:sz w:val="21"/>
+                <w:sz w:val="20"/>
               </w:rPr>
-              <w:t>16/16</w:t>
+              <w:t>16/16  100%</w:t>
             </w:r>
           </w:p>
         </w:tc>
@@ -427,7 +494,7 @@
           </w:tcPr>
           <w:p>
             <w:pPr>
-              <w:spacing w:before="0" w:after="0" w:line="280" w:lineRule="exact"/>
+              <w:spacing w:before="0" w:after="0" w:line="260" w:lineRule="exact"/>
               <w:jc w:val="left"/>
             </w:pPr>
             <w:r>
@@ -435,7 +502,7 @@
                 <w:rFonts w:ascii="Arial" w:hAnsi="Arial" w:eastAsia="Noto Sans SC"/>
                 <w:b w:val="0"/>
                 <w:color w:val="000000"/>
-                <w:sz w:val="21"/>
+                <w:sz w:val="20"/>
               </w:rPr>
               <w:t>GPT-5.6 Luna</w:t>
             </w:r>
@@ -449,7 +516,7 @@
           </w:tcPr>
           <w:p>
             <w:pPr>
-              <w:spacing w:before="0" w:after="0" w:line="280" w:lineRule="exact"/>
+              <w:spacing w:before="0" w:after="0" w:line="260" w:lineRule="exact"/>
               <w:jc w:val="center"/>
             </w:pPr>
             <w:r>
@@ -457,7 +524,7 @@
                 <w:rFonts w:ascii="Arial" w:hAnsi="Arial" w:eastAsia="Noto Sans SC"/>
                 <w:b/>
                 <w:color w:val="000000"/>
-                <w:sz w:val="21"/>
+                <w:sz w:val="20"/>
               </w:rPr>
               <w:t>INTJ</w:t>
             </w:r>
@@ -471,7 +538,7 @@
           </w:tcPr>
           <w:p>
             <w:pPr>
-              <w:spacing w:before="0" w:after="0" w:line="280" w:lineRule="exact"/>
+              <w:spacing w:before="0" w:after="0" w:line="260" w:lineRule="exact"/>
               <w:jc w:val="center"/>
             </w:pPr>
             <w:r>
@@ -479,7 +546,7 @@
                 <w:rFonts w:ascii="Arial" w:hAnsi="Arial" w:eastAsia="Noto Sans SC"/>
                 <w:b w:val="0"/>
                 <w:color w:val="000000"/>
-                <w:sz w:val="21"/>
+                <w:sz w:val="20"/>
               </w:rPr>
               <w:t>INTJ</w:t>
             </w:r>
@@ -493,7 +560,7 @@
           </w:tcPr>
           <w:p>
             <w:pPr>
-              <w:spacing w:before="0" w:after="0" w:line="280" w:lineRule="exact"/>
+              <w:spacing w:before="0" w:after="0" w:line="260" w:lineRule="exact"/>
               <w:jc w:val="center"/>
             </w:pPr>
             <w:r>
@@ -501,9 +568,9 @@
                 <w:rFonts w:ascii="Arial" w:hAnsi="Arial" w:eastAsia="Noto Sans SC"/>
                 <w:b w:val="0"/>
                 <w:color w:val="000000"/>
-                <w:sz w:val="21"/>
+                <w:sz w:val="20"/>
               </w:rPr>
-              <w:t>16/16</w:t>
+              <w:t>16/16  100%</w:t>
             </w:r>
           </w:p>
         </w:tc>
@@ -520,7 +587,7 @@
           </w:tcPr>
           <w:p>
             <w:pPr>
-              <w:spacing w:before="0" w:after="0" w:line="280" w:lineRule="exact"/>
+              <w:spacing w:before="0" w:after="0" w:line="260" w:lineRule="exact"/>
               <w:jc w:val="left"/>
             </w:pPr>
             <w:r>
@@ -528,7 +595,7 @@
                 <w:rFonts w:ascii="Arial" w:hAnsi="Arial" w:eastAsia="Noto Sans SC"/>
                 <w:b w:val="0"/>
                 <w:color w:val="000000"/>
-                <w:sz w:val="21"/>
+                <w:sz w:val="20"/>
               </w:rPr>
               <w:t>GPT-5.6 Terra</w:t>
             </w:r>
@@ -542,7 +609,7 @@
           </w:tcPr>
           <w:p>
             <w:pPr>
-              <w:spacing w:before="0" w:after="0" w:line="280" w:lineRule="exact"/>
+              <w:spacing w:before="0" w:after="0" w:line="260" w:lineRule="exact"/>
               <w:jc w:val="center"/>
             </w:pPr>
             <w:r>
@@ -550,7 +617,7 @@
                 <w:rFonts w:ascii="Arial" w:hAnsi="Arial" w:eastAsia="Noto Sans SC"/>
                 <w:b/>
                 <w:color w:val="000000"/>
-                <w:sz w:val="21"/>
+                <w:sz w:val="20"/>
               </w:rPr>
               <w:t>INTJ</w:t>
             </w:r>
@@ -564,7 +631,7 @@
           </w:tcPr>
           <w:p>
             <w:pPr>
-              <w:spacing w:before="0" w:after="0" w:line="280" w:lineRule="exact"/>
+              <w:spacing w:before="0" w:after="0" w:line="260" w:lineRule="exact"/>
               <w:jc w:val="center"/>
             </w:pPr>
             <w:r>
@@ -572,7 +639,7 @@
                 <w:rFonts w:ascii="Arial" w:hAnsi="Arial" w:eastAsia="Noto Sans SC"/>
                 <w:b w:val="0"/>
                 <w:color w:val="000000"/>
-                <w:sz w:val="21"/>
+                <w:sz w:val="20"/>
               </w:rPr>
               <w:t>INTJ</w:t>
             </w:r>
@@ -586,7 +653,7 @@
           </w:tcPr>
           <w:p>
             <w:pPr>
-              <w:spacing w:before="0" w:after="0" w:line="280" w:lineRule="exact"/>
+              <w:spacing w:before="0" w:after="0" w:line="260" w:lineRule="exact"/>
               <w:jc w:val="center"/>
             </w:pPr>
             <w:r>
@@ -594,9 +661,9 @@
                 <w:rFonts w:ascii="Arial" w:hAnsi="Arial" w:eastAsia="Noto Sans SC"/>
                 <w:b w:val="0"/>
                 <w:color w:val="000000"/>
-                <w:sz w:val="21"/>
+                <w:sz w:val="20"/>
               </w:rPr>
-              <w:t>16/16</w:t>
+              <w:t>16/16  100%</w:t>
             </w:r>
           </w:p>
         </w:tc>
@@ -613,7 +680,7 @@
           </w:tcPr>
           <w:p>
             <w:pPr>
-              <w:spacing w:before="0" w:after="0" w:line="280" w:lineRule="exact"/>
+              <w:spacing w:before="0" w:after="0" w:line="260" w:lineRule="exact"/>
               <w:jc w:val="left"/>
             </w:pPr>
             <w:r>
@@ -621,7 +688,7 @@
                 <w:rFonts w:ascii="Arial" w:hAnsi="Arial" w:eastAsia="Noto Sans SC"/>
                 <w:b w:val="0"/>
                 <w:color w:val="000000"/>
-                <w:sz w:val="21"/>
+                <w:sz w:val="20"/>
               </w:rPr>
               <w:t>GPT-5.6 Sol</w:t>
             </w:r>
@@ -635,7 +702,7 @@
           </w:tcPr>
           <w:p>
             <w:pPr>
-              <w:spacing w:before="0" w:after="0" w:line="280" w:lineRule="exact"/>
+              <w:spacing w:before="0" w:after="0" w:line="260" w:lineRule="exact"/>
               <w:jc w:val="center"/>
             </w:pPr>
             <w:r>
@@ -643,7 +710,7 @@
                 <w:rFonts w:ascii="Arial" w:hAnsi="Arial" w:eastAsia="Noto Sans SC"/>
                 <w:b/>
                 <w:color w:val="000000"/>
-                <w:sz w:val="21"/>
+                <w:sz w:val="20"/>
               </w:rPr>
               <w:t>INTJ</w:t>
             </w:r>
@@ -657,7 +724,7 @@
           </w:tcPr>
           <w:p>
             <w:pPr>
-              <w:spacing w:before="0" w:after="0" w:line="280" w:lineRule="exact"/>
+              <w:spacing w:before="0" w:after="0" w:line="260" w:lineRule="exact"/>
               <w:jc w:val="center"/>
             </w:pPr>
             <w:r>
@@ -665,7 +732,7 @@
                 <w:rFonts w:ascii="Arial" w:hAnsi="Arial" w:eastAsia="Noto Sans SC"/>
                 <w:b w:val="0"/>
                 <w:color w:val="000000"/>
-                <w:sz w:val="21"/>
+                <w:sz w:val="20"/>
               </w:rPr>
               <w:t>INTJ</w:t>
             </w:r>
@@ -679,7 +746,7 @@
           </w:tcPr>
           <w:p>
             <w:pPr>
-              <w:spacing w:before="0" w:after="0" w:line="280" w:lineRule="exact"/>
+              <w:spacing w:before="0" w:after="0" w:line="260" w:lineRule="exact"/>
               <w:jc w:val="center"/>
             </w:pPr>
             <w:r>
@@ -687,9 +754,9 @@
                 <w:rFonts w:ascii="Arial" w:hAnsi="Arial" w:eastAsia="Noto Sans SC"/>
                 <w:b w:val="0"/>
                 <w:color w:val="000000"/>
-                <w:sz w:val="21"/>
+                <w:sz w:val="20"/>
               </w:rPr>
-              <w:t>16/16</w:t>
+              <w:t>16/16  100%</w:t>
             </w:r>
           </w:p>
         </w:tc>
@@ -706,7 +773,7 @@
           </w:tcPr>
           <w:p>
             <w:pPr>
-              <w:spacing w:before="0" w:after="0" w:line="280" w:lineRule="exact"/>
+              <w:spacing w:before="0" w:after="0" w:line="260" w:lineRule="exact"/>
               <w:jc w:val="left"/>
             </w:pPr>
             <w:r>
@@ -714,7 +781,7 @@
                 <w:rFonts w:ascii="Arial" w:hAnsi="Arial" w:eastAsia="Noto Sans SC"/>
                 <w:b w:val="0"/>
                 <w:color w:val="000000"/>
-                <w:sz w:val="21"/>
+                <w:sz w:val="20"/>
               </w:rPr>
               <w:t>Claude Fable 5.1</w:t>
             </w:r>
@@ -728,17 +795,17 @@
           </w:tcPr>
           <w:p>
             <w:pPr>
-              <w:spacing w:before="0" w:after="0" w:line="280" w:lineRule="exact"/>
+              <w:spacing w:before="0" w:after="0" w:line="260" w:lineRule="exact"/>
               <w:jc w:val="center"/>
             </w:pPr>
             <w:r>
               <w:rPr>
                 <w:rFonts w:ascii="Arial" w:hAnsi="Arial" w:eastAsia="Noto Sans SC"/>
-                <w:b w:val="0"/>
+                <w:b/>
                 <w:color w:val="000000"/>
-                <w:sz w:val="21"/>
+                <w:sz w:val="20"/>
               </w:rPr>
-              <w:t>未稳定</w:t>
+              <w:t>INTJ</w:t>
             </w:r>
           </w:p>
         </w:tc>
@@ -750,7 +817,7 @@
           </w:tcPr>
           <w:p>
             <w:pPr>
-              <w:spacing w:before="0" w:after="0" w:line="280" w:lineRule="exact"/>
+              <w:spacing w:before="0" w:after="0" w:line="260" w:lineRule="exact"/>
               <w:jc w:val="center"/>
             </w:pPr>
             <w:r>
@@ -758,7 +825,7 @@
                 <w:rFonts w:ascii="Arial" w:hAnsi="Arial" w:eastAsia="Noto Sans SC"/>
                 <w:b w:val="0"/>
                 <w:color w:val="000000"/>
-                <w:sz w:val="21"/>
+                <w:sz w:val="20"/>
               </w:rPr>
               <w:t>INTJ</w:t>
             </w:r>
@@ -772,7 +839,7 @@
           </w:tcPr>
           <w:p>
             <w:pPr>
-              <w:spacing w:before="0" w:after="0" w:line="280" w:lineRule="exact"/>
+              <w:spacing w:before="0" w:after="0" w:line="260" w:lineRule="exact"/>
               <w:jc w:val="center"/>
             </w:pPr>
             <w:r>
@@ -780,9 +847,9 @@
                 <w:rFonts w:ascii="Arial" w:hAnsi="Arial" w:eastAsia="Noto Sans SC"/>
                 <w:b w:val="0"/>
                 <w:color w:val="000000"/>
-                <w:sz w:val="21"/>
+                <w:sz w:val="20"/>
               </w:rPr>
-              <w:t>9/16</w:t>
+              <w:t>9/16  56.25%</w:t>
             </w:r>
           </w:p>
         </w:tc>
@@ -799,7 +866,7 @@
           </w:tcPr>
           <w:p>
             <w:pPr>
-              <w:spacing w:before="0" w:after="0" w:line="280" w:lineRule="exact"/>
+              <w:spacing w:before="0" w:after="0" w:line="260" w:lineRule="exact"/>
               <w:jc w:val="left"/>
             </w:pPr>
             <w:r>
@@ -807,7 +874,7 @@
                 <w:rFonts w:ascii="Arial" w:hAnsi="Arial" w:eastAsia="Noto Sans SC"/>
                 <w:b w:val="0"/>
                 <w:color w:val="000000"/>
-                <w:sz w:val="21"/>
+                <w:sz w:val="20"/>
               </w:rPr>
               <w:t>Claude Opus 5</w:t>
             </w:r>
@@ -821,7 +888,7 @@
           </w:tcPr>
           <w:p>
             <w:pPr>
-              <w:spacing w:before="0" w:after="0" w:line="280" w:lineRule="exact"/>
+              <w:spacing w:before="0" w:after="0" w:line="260" w:lineRule="exact"/>
               <w:jc w:val="center"/>
             </w:pPr>
             <w:r>
@@ -829,7 +896,7 @@
                 <w:rFonts w:ascii="Arial" w:hAnsi="Arial" w:eastAsia="Noto Sans SC"/>
                 <w:b/>
                 <w:color w:val="000000"/>
-                <w:sz w:val="21"/>
+                <w:sz w:val="20"/>
               </w:rPr>
               <w:t>INTJ</w:t>
             </w:r>
@@ -843,7 +910,7 @@
           </w:tcPr>
           <w:p>
             <w:pPr>
-              <w:spacing w:before="0" w:after="0" w:line="280" w:lineRule="exact"/>
+              <w:spacing w:before="0" w:after="0" w:line="260" w:lineRule="exact"/>
               <w:jc w:val="center"/>
             </w:pPr>
             <w:r>
@@ -851,7 +918,7 @@
                 <w:rFonts w:ascii="Arial" w:hAnsi="Arial" w:eastAsia="Noto Sans SC"/>
                 <w:b w:val="0"/>
                 <w:color w:val="000000"/>
-                <w:sz w:val="21"/>
+                <w:sz w:val="20"/>
               </w:rPr>
               <w:t>INTJ</w:t>
             </w:r>
@@ -865,7 +932,7 @@
           </w:tcPr>
           <w:p>
             <w:pPr>
-              <w:spacing w:before="0" w:after="0" w:line="280" w:lineRule="exact"/>
+              <w:spacing w:before="0" w:after="0" w:line="260" w:lineRule="exact"/>
               <w:jc w:val="center"/>
             </w:pPr>
             <w:r>
@@ -873,9 +940,9 @@
                 <w:rFonts w:ascii="Arial" w:hAnsi="Arial" w:eastAsia="Noto Sans SC"/>
                 <w:b w:val="0"/>
                 <w:color w:val="000000"/>
-                <w:sz w:val="21"/>
+                <w:sz w:val="20"/>
               </w:rPr>
-              <w:t>14/16</w:t>
+              <w:t>14/16  87.5%</w:t>
             </w:r>
           </w:p>
         </w:tc>
@@ -892,7 +959,7 @@
           </w:tcPr>
           <w:p>
             <w:pPr>
-              <w:spacing w:before="0" w:after="0" w:line="280" w:lineRule="exact"/>
+              <w:spacing w:before="0" w:after="0" w:line="260" w:lineRule="exact"/>
               <w:jc w:val="left"/>
             </w:pPr>
             <w:r>
@@ -900,7 +967,7 @@
                 <w:rFonts w:ascii="Arial" w:hAnsi="Arial" w:eastAsia="Noto Sans SC"/>
                 <w:b w:val="0"/>
                 <w:color w:val="000000"/>
-                <w:sz w:val="21"/>
+                <w:sz w:val="20"/>
               </w:rPr>
               <w:t>Claude Sonnet 5</w:t>
             </w:r>
@@ -914,7 +981,7 @@
           </w:tcPr>
           <w:p>
             <w:pPr>
-              <w:spacing w:before="0" w:after="0" w:line="280" w:lineRule="exact"/>
+              <w:spacing w:before="0" w:after="0" w:line="260" w:lineRule="exact"/>
               <w:jc w:val="center"/>
             </w:pPr>
             <w:r>
@@ -922,7 +989,7 @@
                 <w:rFonts w:ascii="Arial" w:hAnsi="Arial" w:eastAsia="Noto Sans SC"/>
                 <w:b/>
                 <w:color w:val="000000"/>
-                <w:sz w:val="21"/>
+                <w:sz w:val="20"/>
               </w:rPr>
               <w:t>INTJ</w:t>
             </w:r>
@@ -936,7 +1003,7 @@
           </w:tcPr>
           <w:p>
             <w:pPr>
-              <w:spacing w:before="0" w:after="0" w:line="280" w:lineRule="exact"/>
+              <w:spacing w:before="0" w:after="0" w:line="260" w:lineRule="exact"/>
               <w:jc w:val="center"/>
             </w:pPr>
             <w:r>
@@ -944,7 +1011,7 @@
                 <w:rFonts w:ascii="Arial" w:hAnsi="Arial" w:eastAsia="Noto Sans SC"/>
                 <w:b w:val="0"/>
                 <w:color w:val="000000"/>
-                <w:sz w:val="21"/>
+                <w:sz w:val="20"/>
               </w:rPr>
               <w:t>INTJ</w:t>
             </w:r>
@@ -958,7 +1025,7 @@
           </w:tcPr>
           <w:p>
             <w:pPr>
-              <w:spacing w:before="0" w:after="0" w:line="280" w:lineRule="exact"/>
+              <w:spacing w:before="0" w:after="0" w:line="260" w:lineRule="exact"/>
               <w:jc w:val="center"/>
             </w:pPr>
             <w:r>
@@ -966,9 +1033,9 @@
                 <w:rFonts w:ascii="Arial" w:hAnsi="Arial" w:eastAsia="Noto Sans SC"/>
                 <w:b w:val="0"/>
                 <w:color w:val="000000"/>
-                <w:sz w:val="21"/>
+                <w:sz w:val="20"/>
               </w:rPr>
-              <w:t>13/16</w:t>
+              <w:t>13/16  81.25%</w:t>
             </w:r>
           </w:p>
         </w:tc>
@@ -985,7 +1052,7 @@
           </w:tcPr>
           <w:p>
             <w:pPr>
-              <w:spacing w:before="0" w:after="0" w:line="280" w:lineRule="exact"/>
+              <w:spacing w:before="0" w:after="0" w:line="260" w:lineRule="exact"/>
               <w:jc w:val="left"/>
             </w:pPr>
             <w:r>
@@ -993,7 +1060,7 @@
                 <w:rFonts w:ascii="Arial" w:hAnsi="Arial" w:eastAsia="Noto Sans SC"/>
                 <w:b w:val="0"/>
                 <w:color w:val="000000"/>
-                <w:sz w:val="21"/>
+                <w:sz w:val="20"/>
               </w:rPr>
               <w:t>Gemini 3.8 Flash</w:t>
             </w:r>
@@ -1007,17 +1074,17 @@
           </w:tcPr>
           <w:p>
             <w:pPr>
-              <w:spacing w:before="0" w:after="0" w:line="280" w:lineRule="exact"/>
+              <w:spacing w:before="0" w:after="0" w:line="260" w:lineRule="exact"/>
               <w:jc w:val="center"/>
             </w:pPr>
             <w:r>
               <w:rPr>
                 <w:rFonts w:ascii="Arial" w:hAnsi="Arial" w:eastAsia="Noto Sans SC"/>
-                <w:b w:val="0"/>
+                <w:b/>
                 <w:color w:val="000000"/>
-                <w:sz w:val="21"/>
+                <w:sz w:val="20"/>
               </w:rPr>
-              <w:t>未稳定</w:t>
+              <w:t>ISTJ</w:t>
             </w:r>
           </w:p>
         </w:tc>
@@ -1029,7 +1096,7 @@
           </w:tcPr>
           <w:p>
             <w:pPr>
-              <w:spacing w:before="0" w:after="0" w:line="280" w:lineRule="exact"/>
+              <w:spacing w:before="0" w:after="0" w:line="260" w:lineRule="exact"/>
               <w:jc w:val="center"/>
             </w:pPr>
             <w:r>
@@ -1037,7 +1104,7 @@
                 <w:rFonts w:ascii="Arial" w:hAnsi="Arial" w:eastAsia="Noto Sans SC"/>
                 <w:b w:val="0"/>
                 <w:color w:val="000000"/>
-                <w:sz w:val="21"/>
+                <w:sz w:val="20"/>
               </w:rPr>
               <w:t>ISTJ</w:t>
             </w:r>
@@ -1051,7 +1118,7 @@
           </w:tcPr>
           <w:p>
             <w:pPr>
-              <w:spacing w:before="0" w:after="0" w:line="280" w:lineRule="exact"/>
+              <w:spacing w:before="0" w:after="0" w:line="260" w:lineRule="exact"/>
               <w:jc w:val="center"/>
             </w:pPr>
             <w:r>
@@ -1059,9 +1126,9 @@
                 <w:rFonts w:ascii="Arial" w:hAnsi="Arial" w:eastAsia="Noto Sans SC"/>
                 <w:b w:val="0"/>
                 <w:color w:val="000000"/>
-                <w:sz w:val="21"/>
+                <w:sz w:val="20"/>
               </w:rPr>
-              <w:t>12/16</w:t>
+              <w:t>12/16  75%</w:t>
             </w:r>
           </w:p>
         </w:tc>
@@ -1078,7 +1145,7 @@
           </w:tcPr>
           <w:p>
             <w:pPr>
-              <w:spacing w:before="0" w:after="0" w:line="280" w:lineRule="exact"/>
+              <w:spacing w:before="0" w:after="0" w:line="260" w:lineRule="exact"/>
               <w:jc w:val="left"/>
             </w:pPr>
             <w:r>
@@ -1086,7 +1153,7 @@
                 <w:rFonts w:ascii="Arial" w:hAnsi="Arial" w:eastAsia="Noto Sans SC"/>
                 <w:b w:val="0"/>
                 <w:color w:val="000000"/>
-                <w:sz w:val="21"/>
+                <w:sz w:val="20"/>
               </w:rPr>
               <w:t>Gemini 3.6 Flash</w:t>
             </w:r>
@@ -1100,17 +1167,17 @@
           </w:tcPr>
           <w:p>
             <w:pPr>
-              <w:spacing w:before="0" w:after="0" w:line="280" w:lineRule="exact"/>
+              <w:spacing w:before="0" w:after="0" w:line="260" w:lineRule="exact"/>
               <w:jc w:val="center"/>
             </w:pPr>
             <w:r>
               <w:rPr>
                 <w:rFonts w:ascii="Arial" w:hAnsi="Arial" w:eastAsia="Noto Sans SC"/>
-                <w:b w:val="0"/>
+                <w:b/>
                 <w:color w:val="000000"/>
-                <w:sz w:val="21"/>
+                <w:sz w:val="20"/>
               </w:rPr>
-              <w:t>未稳定</w:t>
+              <w:t>ISTJ</w:t>
             </w:r>
           </w:p>
         </w:tc>
@@ -1122,7 +1189,7 @@
           </w:tcPr>
           <w:p>
             <w:pPr>
-              <w:spacing w:before="0" w:after="0" w:line="280" w:lineRule="exact"/>
+              <w:spacing w:before="0" w:after="0" w:line="260" w:lineRule="exact"/>
               <w:jc w:val="center"/>
             </w:pPr>
             <w:r>
@@ -1130,7 +1197,7 @@
                 <w:rFonts w:ascii="Arial" w:hAnsi="Arial" w:eastAsia="Noto Sans SC"/>
                 <w:b w:val="0"/>
                 <w:color w:val="000000"/>
-                <w:sz w:val="21"/>
+                <w:sz w:val="20"/>
               </w:rPr>
               <w:t>ISTJ</w:t>
             </w:r>
@@ -1144,7 +1211,7 @@
           </w:tcPr>
           <w:p>
             <w:pPr>
-              <w:spacing w:before="0" w:after="0" w:line="280" w:lineRule="exact"/>
+              <w:spacing w:before="0" w:after="0" w:line="260" w:lineRule="exact"/>
               <w:jc w:val="center"/>
             </w:pPr>
             <w:r>
@@ -1152,9 +1219,9 @@
                 <w:rFonts w:ascii="Arial" w:hAnsi="Arial" w:eastAsia="Noto Sans SC"/>
                 <w:b w:val="0"/>
                 <w:color w:val="000000"/>
-                <w:sz w:val="21"/>
+                <w:sz w:val="20"/>
               </w:rPr>
-              <w:t>10/16</w:t>
+              <w:t>10/16  62.5%</w:t>
             </w:r>
           </w:p>
         </w:tc>
@@ -1171,7 +1238,7 @@
           </w:tcPr>
           <w:p>
             <w:pPr>
-              <w:spacing w:before="0" w:after="0" w:line="280" w:lineRule="exact"/>
+              <w:spacing w:before="0" w:after="0" w:line="260" w:lineRule="exact"/>
               <w:jc w:val="left"/>
             </w:pPr>
             <w:r>
@@ -1179,7 +1246,7 @@
                 <w:rFonts w:ascii="Arial" w:hAnsi="Arial" w:eastAsia="Noto Sans SC"/>
                 <w:b w:val="0"/>
                 <w:color w:val="000000"/>
-                <w:sz w:val="21"/>
+                <w:sz w:val="20"/>
               </w:rPr>
               <w:t>DeepSeek V4.1 Flash</w:t>
             </w:r>
@@ -1193,7 +1260,7 @@
           </w:tcPr>
           <w:p>
             <w:pPr>
-              <w:spacing w:before="0" w:after="0" w:line="280" w:lineRule="exact"/>
+              <w:spacing w:before="0" w:after="0" w:line="260" w:lineRule="exact"/>
               <w:jc w:val="center"/>
             </w:pPr>
             <w:r>
@@ -1201,7 +1268,7 @@
                 <w:rFonts w:ascii="Arial" w:hAnsi="Arial" w:eastAsia="Noto Sans SC"/>
                 <w:b/>
                 <w:color w:val="000000"/>
-                <w:sz w:val="21"/>
+                <w:sz w:val="20"/>
               </w:rPr>
               <w:t>INTJ</w:t>
             </w:r>
@@ -1215,7 +1282,7 @@
           </w:tcPr>
           <w:p>
             <w:pPr>
-              <w:spacing w:before="0" w:after="0" w:line="280" w:lineRule="exact"/>
+              <w:spacing w:before="0" w:after="0" w:line="260" w:lineRule="exact"/>
               <w:jc w:val="center"/>
             </w:pPr>
             <w:r>
@@ -1223,7 +1290,7 @@
                 <w:rFonts w:ascii="Arial" w:hAnsi="Arial" w:eastAsia="Noto Sans SC"/>
                 <w:b w:val="0"/>
                 <w:color w:val="000000"/>
-                <w:sz w:val="21"/>
+                <w:sz w:val="20"/>
               </w:rPr>
               <w:t>INTJ</w:t>
             </w:r>
@@ -1237,7 +1304,7 @@
           </w:tcPr>
           <w:p>
             <w:pPr>
-              <w:spacing w:before="0" w:after="0" w:line="280" w:lineRule="exact"/>
+              <w:spacing w:before="0" w:after="0" w:line="260" w:lineRule="exact"/>
               <w:jc w:val="center"/>
             </w:pPr>
             <w:r>
@@ -1245,9 +1312,9 @@
                 <w:rFonts w:ascii="Arial" w:hAnsi="Arial" w:eastAsia="Noto Sans SC"/>
                 <w:b w:val="0"/>
                 <w:color w:val="000000"/>
-                <w:sz w:val="21"/>
+                <w:sz w:val="20"/>
               </w:rPr>
-              <w:t>16/16</w:t>
+              <w:t>16/16  100%</w:t>
             </w:r>
           </w:p>
         </w:tc>
@@ -1264,7 +1331,7 @@
           </w:tcPr>
           <w:p>
             <w:pPr>
-              <w:spacing w:before="0" w:after="0" w:line="280" w:lineRule="exact"/>
+              <w:spacing w:before="0" w:after="0" w:line="260" w:lineRule="exact"/>
               <w:jc w:val="left"/>
             </w:pPr>
             <w:r>
@@ -1272,7 +1339,7 @@
                 <w:rFonts w:ascii="Arial" w:hAnsi="Arial" w:eastAsia="Noto Sans SC"/>
                 <w:b w:val="0"/>
                 <w:color w:val="000000"/>
-                <w:sz w:val="21"/>
+                <w:sz w:val="20"/>
               </w:rPr>
               <w:t>DeepSeek V4 Pro 0813</w:t>
             </w:r>
@@ -1286,17 +1353,17 @@
           </w:tcPr>
           <w:p>
             <w:pPr>
-              <w:spacing w:before="0" w:after="0" w:line="280" w:lineRule="exact"/>
+              <w:spacing w:before="0" w:after="0" w:line="260" w:lineRule="exact"/>
               <w:jc w:val="center"/>
             </w:pPr>
             <w:r>
               <w:rPr>
                 <w:rFonts w:ascii="Arial" w:hAnsi="Arial" w:eastAsia="Noto Sans SC"/>
-                <w:b w:val="0"/>
+                <w:b/>
                 <w:color w:val="000000"/>
-                <w:sz w:val="21"/>
+                <w:sz w:val="20"/>
               </w:rPr>
-              <w:t>未稳定</w:t>
+              <w:t>INTJ</w:t>
             </w:r>
           </w:p>
         </w:tc>
@@ -1308,7 +1375,7 @@
           </w:tcPr>
           <w:p>
             <w:pPr>
-              <w:spacing w:before="0" w:after="0" w:line="280" w:lineRule="exact"/>
+              <w:spacing w:before="0" w:after="0" w:line="260" w:lineRule="exact"/>
               <w:jc w:val="center"/>
             </w:pPr>
             <w:r>
@@ -1316,7 +1383,7 @@
                 <w:rFonts w:ascii="Arial" w:hAnsi="Arial" w:eastAsia="Noto Sans SC"/>
                 <w:b w:val="0"/>
                 <w:color w:val="000000"/>
-                <w:sz w:val="21"/>
+                <w:sz w:val="20"/>
               </w:rPr>
               <w:t>INTJ</w:t>
             </w:r>
@@ -1330,7 +1397,7 @@
           </w:tcPr>
           <w:p>
             <w:pPr>
-              <w:spacing w:before="0" w:after="0" w:line="280" w:lineRule="exact"/>
+              <w:spacing w:before="0" w:after="0" w:line="260" w:lineRule="exact"/>
               <w:jc w:val="center"/>
             </w:pPr>
             <w:r>
@@ -1338,9 +1405,9 @@
                 <w:rFonts w:ascii="Arial" w:hAnsi="Arial" w:eastAsia="Noto Sans SC"/>
                 <w:b w:val="0"/>
                 <w:color w:val="000000"/>
-                <w:sz w:val="21"/>
+                <w:sz w:val="20"/>
               </w:rPr>
-              <w:t>9/16</w:t>
+              <w:t>9/16  56.25%</w:t>
             </w:r>
           </w:p>
         </w:tc>
@@ -1357,7 +1424,7 @@
           </w:tcPr>
           <w:p>
             <w:pPr>
-              <w:spacing w:before="0" w:after="0" w:line="280" w:lineRule="exact"/>
+              <w:spacing w:before="0" w:after="0" w:line="260" w:lineRule="exact"/>
               <w:jc w:val="left"/>
             </w:pPr>
             <w:r>
@@ -1365,7 +1432,7 @@
                 <w:rFonts w:ascii="Arial" w:hAnsi="Arial" w:eastAsia="Noto Sans SC"/>
                 <w:b w:val="0"/>
                 <w:color w:val="000000"/>
-                <w:sz w:val="21"/>
+                <w:sz w:val="20"/>
               </w:rPr>
               <w:t>Qwen3.8 Max 0902</w:t>
             </w:r>
@@ -1379,17 +1446,17 @@
           </w:tcPr>
           <w:p>
             <w:pPr>
-              <w:spacing w:before="0" w:after="0" w:line="280" w:lineRule="exact"/>
+              <w:spacing w:before="0" w:after="0" w:line="260" w:lineRule="exact"/>
               <w:jc w:val="center"/>
             </w:pPr>
             <w:r>
               <w:rPr>
                 <w:rFonts w:ascii="Arial" w:hAnsi="Arial" w:eastAsia="Noto Sans SC"/>
-                <w:b w:val="0"/>
+                <w:b/>
                 <w:color w:val="000000"/>
-                <w:sz w:val="21"/>
+                <w:sz w:val="20"/>
               </w:rPr>
-              <w:t>未稳定</w:t>
+              <w:t>ISTJ</w:t>
             </w:r>
           </w:p>
         </w:tc>
@@ -1401,7 +1468,7 @@
           </w:tcPr>
           <w:p>
             <w:pPr>
-              <w:spacing w:before="0" w:after="0" w:line="280" w:lineRule="exact"/>
+              <w:spacing w:before="0" w:after="0" w:line="260" w:lineRule="exact"/>
               <w:jc w:val="center"/>
             </w:pPr>
             <w:r>
@@ -1409,7 +1476,7 @@
                 <w:rFonts w:ascii="Arial" w:hAnsi="Arial" w:eastAsia="Noto Sans SC"/>
                 <w:b w:val="0"/>
                 <w:color w:val="000000"/>
-                <w:sz w:val="21"/>
+                <w:sz w:val="20"/>
               </w:rPr>
               <w:t>ISTJ</w:t>
             </w:r>
@@ -1423,7 +1490,7 @@
           </w:tcPr>
           <w:p>
             <w:pPr>
-              <w:spacing w:before="0" w:after="0" w:line="280" w:lineRule="exact"/>
+              <w:spacing w:before="0" w:after="0" w:line="260" w:lineRule="exact"/>
               <w:jc w:val="center"/>
             </w:pPr>
             <w:r>
@@ -1431,9 +1498,9 @@
                 <w:rFonts w:ascii="Arial" w:hAnsi="Arial" w:eastAsia="Noto Sans SC"/>
                 <w:b w:val="0"/>
                 <w:color w:val="000000"/>
-                <w:sz w:val="21"/>
+                <w:sz w:val="20"/>
               </w:rPr>
-              <w:t>10/16</w:t>
+              <w:t>10/16  62.5%</w:t>
             </w:r>
           </w:p>
         </w:tc>
@@ -1450,7 +1517,7 @@
           </w:tcPr>
           <w:p>
             <w:pPr>
-              <w:spacing w:before="0" w:after="0" w:line="280" w:lineRule="exact"/>
+              <w:spacing w:before="0" w:after="0" w:line="260" w:lineRule="exact"/>
               <w:jc w:val="left"/>
             </w:pPr>
             <w:r>
@@ -1458,7 +1525,7 @@
                 <w:rFonts w:ascii="Arial" w:hAnsi="Arial" w:eastAsia="Noto Sans SC"/>
                 <w:b w:val="0"/>
                 <w:color w:val="000000"/>
-                <w:sz w:val="21"/>
+                <w:sz w:val="20"/>
               </w:rPr>
               <w:t>Qwen3.8-Flash</w:t>
             </w:r>
@@ -1472,7 +1539,7 @@
           </w:tcPr>
           <w:p>
             <w:pPr>
-              <w:spacing w:before="0" w:after="0" w:line="280" w:lineRule="exact"/>
+              <w:spacing w:before="0" w:after="0" w:line="260" w:lineRule="exact"/>
               <w:jc w:val="center"/>
             </w:pPr>
             <w:r>
@@ -1480,7 +1547,7 @@
                 <w:rFonts w:ascii="Arial" w:hAnsi="Arial" w:eastAsia="Noto Sans SC"/>
                 <w:b/>
                 <w:color w:val="000000"/>
-                <w:sz w:val="21"/>
+                <w:sz w:val="20"/>
               </w:rPr>
               <w:t>ISTJ</w:t>
             </w:r>
@@ -1494,7 +1561,7 @@
           </w:tcPr>
           <w:p>
             <w:pPr>
-              <w:spacing w:before="0" w:after="0" w:line="280" w:lineRule="exact"/>
+              <w:spacing w:before="0" w:after="0" w:line="260" w:lineRule="exact"/>
               <w:jc w:val="center"/>
             </w:pPr>
             <w:r>
@@ -1502,7 +1569,7 @@
                 <w:rFonts w:ascii="Arial" w:hAnsi="Arial" w:eastAsia="Noto Sans SC"/>
                 <w:b w:val="0"/>
                 <w:color w:val="000000"/>
-                <w:sz w:val="21"/>
+                <w:sz w:val="20"/>
               </w:rPr>
               <w:t>ISTJ</w:t>
             </w:r>
@@ -1516,7 +1583,7 @@
           </w:tcPr>
           <w:p>
             <w:pPr>
-              <w:spacing w:before="0" w:after="0" w:line="280" w:lineRule="exact"/>
+              <w:spacing w:before="0" w:after="0" w:line="260" w:lineRule="exact"/>
               <w:jc w:val="center"/>
             </w:pPr>
             <w:r>
@@ -1524,9 +1591,9 @@
                 <w:rFonts w:ascii="Arial" w:hAnsi="Arial" w:eastAsia="Noto Sans SC"/>
                 <w:b w:val="0"/>
                 <w:color w:val="000000"/>
-                <w:sz w:val="21"/>
+                <w:sz w:val="20"/>
               </w:rPr>
-              <w:t>14/16</w:t>
+              <w:t>14/16  87.5%</w:t>
             </w:r>
           </w:p>
         </w:tc>
@@ -1543,7 +1610,7 @@
           </w:tcPr>
           <w:p>
             <w:pPr>
-              <w:spacing w:before="0" w:after="0" w:line="280" w:lineRule="exact"/>
+              <w:spacing w:before="0" w:after="0" w:line="260" w:lineRule="exact"/>
               <w:jc w:val="left"/>
             </w:pPr>
             <w:r>
@@ -1551,7 +1618,7 @@
                 <w:rFonts w:ascii="Arial" w:hAnsi="Arial" w:eastAsia="Noto Sans SC"/>
                 <w:b w:val="0"/>
                 <w:color w:val="000000"/>
-                <w:sz w:val="21"/>
+                <w:sz w:val="20"/>
               </w:rPr>
               <w:t>Doubao Seed 2.1 Pro</w:t>
             </w:r>
@@ -1565,7 +1632,7 @@
           </w:tcPr>
           <w:p>
             <w:pPr>
-              <w:spacing w:before="0" w:after="0" w:line="280" w:lineRule="exact"/>
+              <w:spacing w:before="0" w:after="0" w:line="260" w:lineRule="exact"/>
               <w:jc w:val="center"/>
             </w:pPr>
             <w:r>
@@ -1573,7 +1640,7 @@
                 <w:rFonts w:ascii="Arial" w:hAnsi="Arial" w:eastAsia="Noto Sans SC"/>
                 <w:b/>
                 <w:color w:val="000000"/>
-                <w:sz w:val="21"/>
+                <w:sz w:val="20"/>
               </w:rPr>
               <w:t>ISTJ</w:t>
             </w:r>
@@ -1587,7 +1654,7 @@
           </w:tcPr>
           <w:p>
             <w:pPr>
-              <w:spacing w:before="0" w:after="0" w:line="280" w:lineRule="exact"/>
+              <w:spacing w:before="0" w:after="0" w:line="260" w:lineRule="exact"/>
               <w:jc w:val="center"/>
             </w:pPr>
             <w:r>
@@ -1595,7 +1662,7 @@
                 <w:rFonts w:ascii="Arial" w:hAnsi="Arial" w:eastAsia="Noto Sans SC"/>
                 <w:b w:val="0"/>
                 <w:color w:val="000000"/>
-                <w:sz w:val="21"/>
+                <w:sz w:val="20"/>
               </w:rPr>
               <w:t>ISTJ</w:t>
             </w:r>
@@ -1609,7 +1676,7 @@
           </w:tcPr>
           <w:p>
             <w:pPr>
-              <w:spacing w:before="0" w:after="0" w:line="280" w:lineRule="exact"/>
+              <w:spacing w:before="0" w:after="0" w:line="260" w:lineRule="exact"/>
               <w:jc w:val="center"/>
             </w:pPr>
             <w:r>
@@ -1617,9 +1684,9 @@
                 <w:rFonts w:ascii="Arial" w:hAnsi="Arial" w:eastAsia="Noto Sans SC"/>
                 <w:b w:val="0"/>
                 <w:color w:val="000000"/>
-                <w:sz w:val="21"/>
+                <w:sz w:val="20"/>
               </w:rPr>
-              <w:t>11/16</w:t>
+              <w:t>11/16  68.75%</w:t>
             </w:r>
           </w:p>
         </w:tc>
@@ -1636,7 +1703,7 @@
           </w:tcPr>
           <w:p>
             <w:pPr>
-              <w:spacing w:before="0" w:after="0" w:line="280" w:lineRule="exact"/>
+              <w:spacing w:before="0" w:after="0" w:line="260" w:lineRule="exact"/>
               <w:jc w:val="left"/>
             </w:pPr>
             <w:r>
@@ -1644,7 +1711,7 @@
                 <w:rFonts w:ascii="Arial" w:hAnsi="Arial" w:eastAsia="Noto Sans SC"/>
                 <w:b w:val="0"/>
                 <w:color w:val="000000"/>
-                <w:sz w:val="21"/>
+                <w:sz w:val="20"/>
               </w:rPr>
               <w:t>Grok 4.6</w:t>
             </w:r>
@@ -1658,7 +1725,7 @@
           </w:tcPr>
           <w:p>
             <w:pPr>
-              <w:spacing w:before="0" w:after="0" w:line="280" w:lineRule="exact"/>
+              <w:spacing w:before="0" w:after="0" w:line="260" w:lineRule="exact"/>
               <w:jc w:val="center"/>
             </w:pPr>
             <w:r>
@@ -1666,7 +1733,7 @@
                 <w:rFonts w:ascii="Arial" w:hAnsi="Arial" w:eastAsia="Noto Sans SC"/>
                 <w:b/>
                 <w:color w:val="000000"/>
-                <w:sz w:val="21"/>
+                <w:sz w:val="20"/>
               </w:rPr>
               <w:t>INTJ</w:t>
             </w:r>
@@ -1680,7 +1747,7 @@
           </w:tcPr>
           <w:p>
             <w:pPr>
-              <w:spacing w:before="0" w:after="0" w:line="280" w:lineRule="exact"/>
+              <w:spacing w:before="0" w:after="0" w:line="260" w:lineRule="exact"/>
               <w:jc w:val="center"/>
             </w:pPr>
             <w:r>
@@ -1688,7 +1755,7 @@
                 <w:rFonts w:ascii="Arial" w:hAnsi="Arial" w:eastAsia="Noto Sans SC"/>
                 <w:b w:val="0"/>
                 <w:color w:val="000000"/>
-                <w:sz w:val="21"/>
+                <w:sz w:val="20"/>
               </w:rPr>
               <w:t>INTJ</w:t>
             </w:r>
@@ -1702,7 +1769,7 @@
           </w:tcPr>
           <w:p>
             <w:pPr>
-              <w:spacing w:before="0" w:after="0" w:line="280" w:lineRule="exact"/>
+              <w:spacing w:before="0" w:after="0" w:line="260" w:lineRule="exact"/>
               <w:jc w:val="center"/>
             </w:pPr>
             <w:r>
@@ -1710,9 +1777,9 @@
                 <w:rFonts w:ascii="Arial" w:hAnsi="Arial" w:eastAsia="Noto Sans SC"/>
                 <w:b w:val="0"/>
                 <w:color w:val="000000"/>
-                <w:sz w:val="21"/>
+                <w:sz w:val="20"/>
               </w:rPr>
-              <w:t>15/16</w:t>
+              <w:t>15/16  93.75%</w:t>
             </w:r>
           </w:p>
         </w:tc>
@@ -1729,7 +1796,7 @@
           </w:tcPr>
           <w:p>
             <w:pPr>
-              <w:spacing w:before="0" w:after="0" w:line="280" w:lineRule="exact"/>
+              <w:spacing w:before="0" w:after="0" w:line="260" w:lineRule="exact"/>
               <w:jc w:val="left"/>
             </w:pPr>
             <w:r>
@@ -1737,7 +1804,7 @@
                 <w:rFonts w:ascii="Arial" w:hAnsi="Arial" w:eastAsia="Noto Sans SC"/>
                 <w:b w:val="0"/>
                 <w:color w:val="000000"/>
-                <w:sz w:val="21"/>
+                <w:sz w:val="20"/>
               </w:rPr>
               <w:t>GLM 5.3 Flash</w:t>
             </w:r>
@@ -1751,17 +1818,17 @@
           </w:tcPr>
           <w:p>
             <w:pPr>
-              <w:spacing w:before="0" w:after="0" w:line="280" w:lineRule="exact"/>
+              <w:spacing w:before="0" w:after="0" w:line="260" w:lineRule="exact"/>
               <w:jc w:val="center"/>
             </w:pPr>
             <w:r>
               <w:rPr>
                 <w:rFonts w:ascii="Arial" w:hAnsi="Arial" w:eastAsia="Noto Sans SC"/>
-                <w:b w:val="0"/>
+                <w:b/>
                 <w:color w:val="000000"/>
-                <w:sz w:val="21"/>
+                <w:sz w:val="20"/>
               </w:rPr>
-              <w:t>未稳定</w:t>
+              <w:t>INTJ</w:t>
             </w:r>
           </w:p>
         </w:tc>
@@ -1773,7 +1840,7 @@
           </w:tcPr>
           <w:p>
             <w:pPr>
-              <w:spacing w:before="0" w:after="0" w:line="280" w:lineRule="exact"/>
+              <w:spacing w:before="0" w:after="0" w:line="260" w:lineRule="exact"/>
               <w:jc w:val="center"/>
             </w:pPr>
             <w:r>
@@ -1781,7 +1848,7 @@
                 <w:rFonts w:ascii="Arial" w:hAnsi="Arial" w:eastAsia="Noto Sans SC"/>
                 <w:b w:val="0"/>
                 <w:color w:val="000000"/>
-                <w:sz w:val="21"/>
+                <w:sz w:val="20"/>
               </w:rPr>
               <w:t>INTJ</w:t>
             </w:r>
@@ -1795,7 +1862,7 @@
           </w:tcPr>
           <w:p>
             <w:pPr>
-              <w:spacing w:before="0" w:after="0" w:line="280" w:lineRule="exact"/>
+              <w:spacing w:before="0" w:after="0" w:line="260" w:lineRule="exact"/>
               <w:jc w:val="center"/>
             </w:pPr>
             <w:r>
@@ -1803,9 +1870,9 @@
                 <w:rFonts w:ascii="Arial" w:hAnsi="Arial" w:eastAsia="Noto Sans SC"/>
                 <w:b w:val="0"/>
                 <w:color w:val="000000"/>
-                <w:sz w:val="21"/>
+                <w:sz w:val="20"/>
               </w:rPr>
-              <w:t>10/16</w:t>
+              <w:t>10/16  62.5%</w:t>
             </w:r>
           </w:p>
         </w:tc>
@@ -1822,7 +1889,7 @@
           </w:tcPr>
           <w:p>
             <w:pPr>
-              <w:spacing w:before="0" w:after="0" w:line="280" w:lineRule="exact"/>
+              <w:spacing w:before="0" w:after="0" w:line="260" w:lineRule="exact"/>
               <w:jc w:val="left"/>
             </w:pPr>
             <w:r>
@@ -1830,7 +1897,7 @@
                 <w:rFonts w:ascii="Arial" w:hAnsi="Arial" w:eastAsia="Noto Sans SC"/>
                 <w:b w:val="0"/>
                 <w:color w:val="000000"/>
-                <w:sz w:val="21"/>
+                <w:sz w:val="20"/>
               </w:rPr>
               <w:t>Kimi K3</w:t>
             </w:r>
@@ -1844,7 +1911,7 @@
           </w:tcPr>
           <w:p>
             <w:pPr>
-              <w:spacing w:before="0" w:after="0" w:line="280" w:lineRule="exact"/>
+              <w:spacing w:before="0" w:after="0" w:line="260" w:lineRule="exact"/>
               <w:jc w:val="center"/>
             </w:pPr>
             <w:r>
@@ -1852,7 +1919,7 @@
                 <w:rFonts w:ascii="Arial" w:hAnsi="Arial" w:eastAsia="Noto Sans SC"/>
                 <w:b/>
                 <w:color w:val="000000"/>
-                <w:sz w:val="21"/>
+                <w:sz w:val="20"/>
               </w:rPr>
               <w:t>INTJ</w:t>
             </w:r>
@@ -1866,7 +1933,7 @@
           </w:tcPr>
           <w:p>
             <w:pPr>
-              <w:spacing w:before="0" w:after="0" w:line="280" w:lineRule="exact"/>
+              <w:spacing w:before="0" w:after="0" w:line="260" w:lineRule="exact"/>
               <w:jc w:val="center"/>
             </w:pPr>
             <w:r>
@@ -1874,7 +1941,7 @@
                 <w:rFonts w:ascii="Arial" w:hAnsi="Arial" w:eastAsia="Noto Sans SC"/>
                 <w:b w:val="0"/>
                 <w:color w:val="000000"/>
-                <w:sz w:val="21"/>
+                <w:sz w:val="20"/>
               </w:rPr>
               <w:t>INTJ</w:t>
             </w:r>
@@ -1888,7 +1955,7 @@
           </w:tcPr>
           <w:p>
             <w:pPr>
-              <w:spacing w:before="0" w:after="0" w:line="280" w:lineRule="exact"/>
+              <w:spacing w:before="0" w:after="0" w:line="260" w:lineRule="exact"/>
               <w:jc w:val="center"/>
             </w:pPr>
             <w:r>
@@ -1896,9 +1963,9 @@
                 <w:rFonts w:ascii="Arial" w:hAnsi="Arial" w:eastAsia="Noto Sans SC"/>
                 <w:b w:val="0"/>
                 <w:color w:val="000000"/>
-                <w:sz w:val="21"/>
+                <w:sz w:val="20"/>
               </w:rPr>
-              <w:t>16/16</w:t>
+              <w:t>16/16  100%</w:t>
             </w:r>
           </w:p>
         </w:tc>
@@ -1915,7 +1982,7 @@
           </w:tcPr>
           <w:p>
             <w:pPr>
-              <w:spacing w:before="0" w:after="0" w:line="280" w:lineRule="exact"/>
+              <w:spacing w:before="0" w:after="0" w:line="260" w:lineRule="exact"/>
               <w:jc w:val="left"/>
             </w:pPr>
             <w:r>
@@ -1923,7 +1990,7 @@
                 <w:rFonts w:ascii="Arial" w:hAnsi="Arial" w:eastAsia="Noto Sans SC"/>
                 <w:b w:val="0"/>
                 <w:color w:val="000000"/>
-                <w:sz w:val="21"/>
+                <w:sz w:val="20"/>
               </w:rPr>
               <w:t>MiniMax M3</w:t>
             </w:r>
@@ -1937,7 +2004,7 @@
           </w:tcPr>
           <w:p>
             <w:pPr>
-              <w:spacing w:before="0" w:after="0" w:line="280" w:lineRule="exact"/>
+              <w:spacing w:before="0" w:after="0" w:line="260" w:lineRule="exact"/>
               <w:jc w:val="center"/>
             </w:pPr>
             <w:r>
@@ -1945,7 +2012,7 @@
                 <w:rFonts w:ascii="Arial" w:hAnsi="Arial" w:eastAsia="Noto Sans SC"/>
                 <w:b w:val="0"/>
                 <w:color w:val="000000"/>
-                <w:sz w:val="21"/>
+                <w:sz w:val="20"/>
               </w:rPr>
               <w:t>未稳定</w:t>
             </w:r>
@@ -1959,7 +2026,7 @@
           </w:tcPr>
           <w:p>
             <w:pPr>
-              <w:spacing w:before="0" w:after="0" w:line="280" w:lineRule="exact"/>
+              <w:spacing w:before="0" w:after="0" w:line="260" w:lineRule="exact"/>
               <w:jc w:val="center"/>
             </w:pPr>
             <w:r>
@@ -1967,7 +2034,7 @@
                 <w:rFonts w:ascii="Arial" w:hAnsi="Arial" w:eastAsia="Noto Sans SC"/>
                 <w:b w:val="0"/>
                 <w:color w:val="000000"/>
-                <w:sz w:val="21"/>
+                <w:sz w:val="20"/>
               </w:rPr>
               <w:t>INFJ</w:t>
             </w:r>
@@ -1981,7 +2048,7 @@
           </w:tcPr>
           <w:p>
             <w:pPr>
-              <w:spacing w:before="0" w:after="0" w:line="280" w:lineRule="exact"/>
+              <w:spacing w:before="0" w:after="0" w:line="260" w:lineRule="exact"/>
               <w:jc w:val="center"/>
             </w:pPr>
             <w:r>
@@ -1989,9 +2056,9 @@
                 <w:rFonts w:ascii="Arial" w:hAnsi="Arial" w:eastAsia="Noto Sans SC"/>
                 <w:b w:val="0"/>
                 <w:color w:val="000000"/>
-                <w:sz w:val="21"/>
+                <w:sz w:val="20"/>
               </w:rPr>
-              <w:t>5/16</w:t>
+              <w:t>5/16  31.25%</w:t>
             </w:r>
           </w:p>
         </w:tc>
@@ -2008,7 +2075,7 @@
           </w:tcPr>
           <w:p>
             <w:pPr>
-              <w:spacing w:before="0" w:after="0" w:line="280" w:lineRule="exact"/>
+              <w:spacing w:before="0" w:after="0" w:line="260" w:lineRule="exact"/>
               <w:jc w:val="left"/>
             </w:pPr>
             <w:r>
@@ -2016,7 +2083,7 @@
                 <w:rFonts w:ascii="Arial" w:hAnsi="Arial" w:eastAsia="Noto Sans SC"/>
                 <w:b w:val="0"/>
                 <w:color w:val="000000"/>
-                <w:sz w:val="21"/>
+                <w:sz w:val="20"/>
               </w:rPr>
               <w:t>ERNIE 5.1</w:t>
             </w:r>
@@ -2030,7 +2097,7 @@
           </w:tcPr>
           <w:p>
             <w:pPr>
-              <w:spacing w:before="0" w:after="0" w:line="280" w:lineRule="exact"/>
+              <w:spacing w:before="0" w:after="0" w:line="260" w:lineRule="exact"/>
               <w:jc w:val="center"/>
             </w:pPr>
             <w:r>
@@ -2038,7 +2105,7 @@
                 <w:rFonts w:ascii="Arial" w:hAnsi="Arial" w:eastAsia="Noto Sans SC"/>
                 <w:b w:val="0"/>
                 <w:color w:val="000000"/>
-                <w:sz w:val="21"/>
+                <w:sz w:val="20"/>
               </w:rPr>
               <w:t>未稳定</w:t>
             </w:r>
@@ -2052,7 +2119,7 @@
           </w:tcPr>
           <w:p>
             <w:pPr>
-              <w:spacing w:before="0" w:after="0" w:line="280" w:lineRule="exact"/>
+              <w:spacing w:before="0" w:after="0" w:line="260" w:lineRule="exact"/>
               <w:jc w:val="center"/>
             </w:pPr>
             <w:r>
@@ -2060,7 +2127,7 @@
                 <w:rFonts w:ascii="Arial" w:hAnsi="Arial" w:eastAsia="Noto Sans SC"/>
                 <w:b w:val="0"/>
                 <w:color w:val="000000"/>
-                <w:sz w:val="21"/>
+                <w:sz w:val="20"/>
               </w:rPr>
               <w:t>ISTJ</w:t>
             </w:r>
@@ -2074,7 +2141,7 @@
           </w:tcPr>
           <w:p>
             <w:pPr>
-              <w:spacing w:before="0" w:after="0" w:line="280" w:lineRule="exact"/>
+              <w:spacing w:before="0" w:after="0" w:line="260" w:lineRule="exact"/>
               <w:jc w:val="center"/>
             </w:pPr>
             <w:r>
@@ -2082,9 +2149,9 @@
                 <w:rFonts w:ascii="Arial" w:hAnsi="Arial" w:eastAsia="Noto Sans SC"/>
                 <w:b w:val="0"/>
                 <w:color w:val="000000"/>
-                <w:sz w:val="21"/>
+                <w:sz w:val="20"/>
               </w:rPr>
-              <w:t>8/16</w:t>
+              <w:t>8/16  50%</w:t>
             </w:r>
           </w:p>
         </w:tc>
@@ -2101,7 +2168,7 @@
           </w:tcPr>
           <w:p>
             <w:pPr>
-              <w:spacing w:before="0" w:after="0" w:line="280" w:lineRule="exact"/>
+              <w:spacing w:before="0" w:after="0" w:line="260" w:lineRule="exact"/>
               <w:jc w:val="left"/>
             </w:pPr>
             <w:r>
@@ -2109,7 +2176,7 @@
                 <w:rFonts w:ascii="Arial" w:hAnsi="Arial" w:eastAsia="Noto Sans SC"/>
                 <w:b w:val="0"/>
                 <w:color w:val="000000"/>
-                <w:sz w:val="21"/>
+                <w:sz w:val="20"/>
               </w:rPr>
               <w:t>Hy3</w:t>
             </w:r>
@@ -2123,17 +2190,17 @@
           </w:tcPr>
           <w:p>
             <w:pPr>
-              <w:spacing w:before="0" w:after="0" w:line="280" w:lineRule="exact"/>
+              <w:spacing w:before="0" w:after="0" w:line="260" w:lineRule="exact"/>
               <w:jc w:val="center"/>
             </w:pPr>
             <w:r>
               <w:rPr>
                 <w:rFonts w:ascii="Arial" w:hAnsi="Arial" w:eastAsia="Noto Sans SC"/>
-                <w:b w:val="0"/>
+                <w:b/>
                 <w:color w:val="000000"/>
-                <w:sz w:val="21"/>
+                <w:sz w:val="20"/>
               </w:rPr>
-              <w:t>未稳定</w:t>
+              <w:t>ISTJ</w:t>
             </w:r>
           </w:p>
         </w:tc>
@@ -2145,7 +2212,7 @@
           </w:tcPr>
           <w:p>
             <w:pPr>
-              <w:spacing w:before="0" w:after="0" w:line="280" w:lineRule="exact"/>
+              <w:spacing w:before="0" w:after="0" w:line="260" w:lineRule="exact"/>
               <w:jc w:val="center"/>
             </w:pPr>
             <w:r>
@@ -2153,7 +2220,7 @@
                 <w:rFonts w:ascii="Arial" w:hAnsi="Arial" w:eastAsia="Noto Sans SC"/>
                 <w:b w:val="0"/>
                 <w:color w:val="000000"/>
-                <w:sz w:val="21"/>
+                <w:sz w:val="20"/>
               </w:rPr>
               <w:t>ISTJ</w:t>
             </w:r>
@@ -2167,7 +2234,7 @@
           </w:tcPr>
           <w:p>
             <w:pPr>
-              <w:spacing w:before="0" w:after="0" w:line="280" w:lineRule="exact"/>
+              <w:spacing w:before="0" w:after="0" w:line="260" w:lineRule="exact"/>
               <w:jc w:val="center"/>
             </w:pPr>
             <w:r>
@@ -2175,9 +2242,9 @@
                 <w:rFonts w:ascii="Arial" w:hAnsi="Arial" w:eastAsia="Noto Sans SC"/>
                 <w:b w:val="0"/>
                 <w:color w:val="000000"/>
-                <w:sz w:val="21"/>
+                <w:sz w:val="20"/>
               </w:rPr>
-              <w:t>11/16</w:t>
+              <w:t>11/16  68.75%</w:t>
             </w:r>
           </w:p>
         </w:tc>
@@ -2194,7 +2261,7 @@
           </w:tcPr>
           <w:p>
             <w:pPr>
-              <w:spacing w:before="0" w:after="0" w:line="280" w:lineRule="exact"/>
+              <w:spacing w:before="0" w:after="0" w:line="260" w:lineRule="exact"/>
               <w:jc w:val="left"/>
             </w:pPr>
             <w:r>
@@ -2202,7 +2269,7 @@
                 <w:rFonts w:ascii="Arial" w:hAnsi="Arial" w:eastAsia="Noto Sans SC"/>
                 <w:b w:val="0"/>
                 <w:color w:val="000000"/>
-                <w:sz w:val="21"/>
+                <w:sz w:val="20"/>
               </w:rPr>
               <w:t>MiMo V2.5 Pro</w:t>
             </w:r>
@@ -2216,7 +2283,7 @@
           </w:tcPr>
           <w:p>
             <w:pPr>
-              <w:spacing w:before="0" w:after="0" w:line="280" w:lineRule="exact"/>
+              <w:spacing w:before="0" w:after="0" w:line="260" w:lineRule="exact"/>
               <w:jc w:val="center"/>
             </w:pPr>
             <w:r>
@@ -2224,7 +2291,7 @@
                 <w:rFonts w:ascii="Arial" w:hAnsi="Arial" w:eastAsia="Noto Sans SC"/>
                 <w:b w:val="0"/>
                 <w:color w:val="000000"/>
-                <w:sz w:val="21"/>
+                <w:sz w:val="20"/>
               </w:rPr>
               <w:t>未稳定</w:t>
             </w:r>
@@ -2238,7 +2305,7 @@
           </w:tcPr>
           <w:p>
             <w:pPr>
-              <w:spacing w:before="0" w:after="0" w:line="280" w:lineRule="exact"/>
+              <w:spacing w:before="0" w:after="0" w:line="260" w:lineRule="exact"/>
               <w:jc w:val="center"/>
             </w:pPr>
             <w:r>
@@ -2246,7 +2313,7 @@
                 <w:rFonts w:ascii="Arial" w:hAnsi="Arial" w:eastAsia="Noto Sans SC"/>
                 <w:b w:val="0"/>
                 <w:color w:val="000000"/>
-                <w:sz w:val="21"/>
+                <w:sz w:val="20"/>
               </w:rPr>
               <w:t>INTJ</w:t>
             </w:r>
@@ -2260,7 +2327,7 @@
           </w:tcPr>
           <w:p>
             <w:pPr>
-              <w:spacing w:before="0" w:after="0" w:line="280" w:lineRule="exact"/>
+              <w:spacing w:before="0" w:after="0" w:line="260" w:lineRule="exact"/>
               <w:jc w:val="center"/>
             </w:pPr>
             <w:r>
@@ -2268,9 +2335,9 @@
                 <w:rFonts w:ascii="Arial" w:hAnsi="Arial" w:eastAsia="Noto Sans SC"/>
                 <w:b w:val="0"/>
                 <w:color w:val="000000"/>
-                <w:sz w:val="21"/>
+                <w:sz w:val="20"/>
               </w:rPr>
-              <w:t>7/16</w:t>
+              <w:t>7/16  43.75%</w:t>
             </w:r>
           </w:p>
         </w:tc>
@@ -2287,7 +2354,7 @@
           </w:tcPr>
           <w:p>
             <w:pPr>
-              <w:spacing w:before="0" w:after="0" w:line="280" w:lineRule="exact"/>
+              <w:spacing w:before="0" w:after="0" w:line="260" w:lineRule="exact"/>
               <w:jc w:val="left"/>
             </w:pPr>
             <w:r>
@@ -2295,7 +2362,7 @@
                 <w:rFonts w:ascii="Arial" w:hAnsi="Arial" w:eastAsia="Noto Sans SC"/>
                 <w:b w:val="0"/>
                 <w:color w:val="000000"/>
-                <w:sz w:val="21"/>
+                <w:sz w:val="20"/>
               </w:rPr>
               <w:t>Step 3.7 Flash</w:t>
             </w:r>
@@ -2309,7 +2376,7 @@
           </w:tcPr>
           <w:p>
             <w:pPr>
-              <w:spacing w:before="0" w:after="0" w:line="280" w:lineRule="exact"/>
+              <w:spacing w:before="0" w:after="0" w:line="260" w:lineRule="exact"/>
               <w:jc w:val="center"/>
             </w:pPr>
             <w:r>
@@ -2317,7 +2384,7 @@
                 <w:rFonts w:ascii="Arial" w:hAnsi="Arial" w:eastAsia="Noto Sans SC"/>
                 <w:b/>
                 <w:color w:val="000000"/>
-                <w:sz w:val="21"/>
+                <w:sz w:val="20"/>
               </w:rPr>
               <w:t>ISTJ</w:t>
             </w:r>
@@ -2331,7 +2398,7 @@
           </w:tcPr>
           <w:p>
             <w:pPr>
-              <w:spacing w:before="0" w:after="0" w:line="280" w:lineRule="exact"/>
+              <w:spacing w:before="0" w:after="0" w:line="260" w:lineRule="exact"/>
               <w:jc w:val="center"/>
             </w:pPr>
             <w:r>
@@ -2339,7 +2406,7 @@
                 <w:rFonts w:ascii="Arial" w:hAnsi="Arial" w:eastAsia="Noto Sans SC"/>
                 <w:b w:val="0"/>
                 <w:color w:val="000000"/>
-                <w:sz w:val="21"/>
+                <w:sz w:val="20"/>
               </w:rPr>
               <w:t>ISTJ</w:t>
             </w:r>
@@ -2353,7 +2420,7 @@
           </w:tcPr>
           <w:p>
             <w:pPr>
-              <w:spacing w:before="0" w:after="0" w:line="280" w:lineRule="exact"/>
+              <w:spacing w:before="0" w:after="0" w:line="260" w:lineRule="exact"/>
               <w:jc w:val="center"/>
             </w:pPr>
             <w:r>
@@ -2361,9 +2428,9 @@
                 <w:rFonts w:ascii="Arial" w:hAnsi="Arial" w:eastAsia="Noto Sans SC"/>
                 <w:b w:val="0"/>
                 <w:color w:val="000000"/>
-                <w:sz w:val="21"/>
+                <w:sz w:val="20"/>
               </w:rPr>
-              <w:t>12/16</w:t>
+              <w:t>12/16  75%</w:t>
             </w:r>
           </w:p>
         </w:tc>
@@ -2380,7 +2447,7 @@
           </w:tcPr>
           <w:p>
             <w:pPr>
-              <w:spacing w:before="0" w:after="0" w:line="280" w:lineRule="exact"/>
+              <w:spacing w:before="0" w:after="0" w:line="260" w:lineRule="exact"/>
               <w:jc w:val="left"/>
             </w:pPr>
             <w:r>
@@ -2388,7 +2455,7 @@
                 <w:rFonts w:ascii="Arial" w:hAnsi="Arial" w:eastAsia="Noto Sans SC"/>
                 <w:b w:val="0"/>
                 <w:color w:val="000000"/>
-                <w:sz w:val="21"/>
+                <w:sz w:val="20"/>
               </w:rPr>
               <w:t>LongCat 2.0</w:t>
             </w:r>
@@ -2402,17 +2469,17 @@
           </w:tcPr>
           <w:p>
             <w:pPr>
-              <w:spacing w:before="0" w:after="0" w:line="280" w:lineRule="exact"/>
+              <w:spacing w:before="0" w:after="0" w:line="260" w:lineRule="exact"/>
               <w:jc w:val="center"/>
             </w:pPr>
             <w:r>
               <w:rPr>
                 <w:rFonts w:ascii="Arial" w:hAnsi="Arial" w:eastAsia="Noto Sans SC"/>
-                <w:b w:val="0"/>
+                <w:b/>
                 <w:color w:val="000000"/>
-                <w:sz w:val="21"/>
+                <w:sz w:val="20"/>
               </w:rPr>
-              <w:t>未稳定</w:t>
+              <w:t>ISTJ</w:t>
             </w:r>
           </w:p>
         </w:tc>
@@ -2424,7 +2491,7 @@
           </w:tcPr>
           <w:p>
             <w:pPr>
-              <w:spacing w:before="0" w:after="0" w:line="280" w:lineRule="exact"/>
+              <w:spacing w:before="0" w:after="0" w:line="260" w:lineRule="exact"/>
               <w:jc w:val="center"/>
             </w:pPr>
             <w:r>
@@ -2432,7 +2499,7 @@
                 <w:rFonts w:ascii="Arial" w:hAnsi="Arial" w:eastAsia="Noto Sans SC"/>
                 <w:b w:val="0"/>
                 <w:color w:val="000000"/>
-                <w:sz w:val="21"/>
+                <w:sz w:val="20"/>
               </w:rPr>
               <w:t>ISTJ</w:t>
             </w:r>
@@ -2446,7 +2513,7 @@
           </w:tcPr>
           <w:p>
             <w:pPr>
-              <w:spacing w:before="0" w:after="0" w:line="280" w:lineRule="exact"/>
+              <w:spacing w:before="0" w:after="0" w:line="260" w:lineRule="exact"/>
               <w:jc w:val="center"/>
             </w:pPr>
             <w:r>
@@ -2454,9 +2521,9 @@
                 <w:rFonts w:ascii="Arial" w:hAnsi="Arial" w:eastAsia="Noto Sans SC"/>
                 <w:b w:val="0"/>
                 <w:color w:val="000000"/>
-                <w:sz w:val="21"/>
+                <w:sz w:val="20"/>
               </w:rPr>
-              <w:t>11/16</w:t>
+              <w:t>11/16  68.75%</w:t>
             </w:r>
           </w:p>
         </w:tc>
@@ -2473,7 +2540,7 @@
           </w:tcPr>
           <w:p>
             <w:pPr>
-              <w:spacing w:before="0" w:after="0" w:line="280" w:lineRule="exact"/>
+              <w:spacing w:before="0" w:after="0" w:line="260" w:lineRule="exact"/>
               <w:jc w:val="left"/>
             </w:pPr>
             <w:r>
@@ -2481,7 +2548,7 @@
                 <w:rFonts w:ascii="Arial" w:hAnsi="Arial" w:eastAsia="Noto Sans SC"/>
                 <w:b w:val="0"/>
                 <w:color w:val="000000"/>
-                <w:sz w:val="21"/>
+                <w:sz w:val="20"/>
               </w:rPr>
               <w:t>Ling 3.0 Tiny</w:t>
             </w:r>
@@ -2495,7 +2562,7 @@
           </w:tcPr>
           <w:p>
             <w:pPr>
-              <w:spacing w:before="0" w:after="0" w:line="280" w:lineRule="exact"/>
+              <w:spacing w:before="0" w:after="0" w:line="260" w:lineRule="exact"/>
               <w:jc w:val="center"/>
             </w:pPr>
             <w:r>
@@ -2503,7 +2570,7 @@
                 <w:rFonts w:ascii="Arial" w:hAnsi="Arial" w:eastAsia="Noto Sans SC"/>
                 <w:b w:val="0"/>
                 <w:color w:val="000000"/>
-                <w:sz w:val="21"/>
+                <w:sz w:val="20"/>
               </w:rPr>
               <w:t>未稳定</w:t>
             </w:r>
@@ -2517,7 +2584,7 @@
           </w:tcPr>
           <w:p>
             <w:pPr>
-              <w:spacing w:before="0" w:after="0" w:line="280" w:lineRule="exact"/>
+              <w:spacing w:before="0" w:after="0" w:line="260" w:lineRule="exact"/>
               <w:jc w:val="center"/>
             </w:pPr>
             <w:r>
@@ -2525,7 +2592,7 @@
                 <w:rFonts w:ascii="Arial" w:hAnsi="Arial" w:eastAsia="Noto Sans SC"/>
                 <w:b w:val="0"/>
                 <w:color w:val="000000"/>
-                <w:sz w:val="21"/>
+                <w:sz w:val="20"/>
               </w:rPr>
               <w:t>ESFJ</w:t>
             </w:r>
@@ -2539,7 +2606,7 @@
           </w:tcPr>
           <w:p>
             <w:pPr>
-              <w:spacing w:before="0" w:after="0" w:line="280" w:lineRule="exact"/>
+              <w:spacing w:before="0" w:after="0" w:line="260" w:lineRule="exact"/>
               <w:jc w:val="center"/>
             </w:pPr>
             <w:r>
@@ -2547,9 +2614,9 @@
                 <w:rFonts w:ascii="Arial" w:hAnsi="Arial" w:eastAsia="Noto Sans SC"/>
                 <w:b w:val="0"/>
                 <w:color w:val="000000"/>
-                <w:sz w:val="21"/>
+                <w:sz w:val="20"/>
               </w:rPr>
-              <w:t>3/16</w:t>
+              <w:t>3/16  18.75%</w:t>
             </w:r>
           </w:p>
         </w:tc>
@@ -2566,7 +2633,7 @@
           </w:tcPr>
           <w:p>
             <w:pPr>
-              <w:spacing w:before="0" w:after="0" w:line="280" w:lineRule="exact"/>
+              <w:spacing w:before="0" w:after="0" w:line="260" w:lineRule="exact"/>
               <w:jc w:val="left"/>
             </w:pPr>
             <w:r>
@@ -2574,7 +2641,7 @@
                 <w:rFonts w:ascii="Arial" w:hAnsi="Arial" w:eastAsia="Noto Sans SC"/>
                 <w:b w:val="0"/>
                 <w:color w:val="000000"/>
-                <w:sz w:val="21"/>
+                <w:sz w:val="20"/>
               </w:rPr>
               <w:t>Ling-3.0-flash</w:t>
             </w:r>
@@ -2588,7 +2655,7 @@
           </w:tcPr>
           <w:p>
             <w:pPr>
-              <w:spacing w:before="0" w:after="0" w:line="280" w:lineRule="exact"/>
+              <w:spacing w:before="0" w:after="0" w:line="260" w:lineRule="exact"/>
               <w:jc w:val="center"/>
             </w:pPr>
             <w:r>
@@ -2596,7 +2663,7 @@
                 <w:rFonts w:ascii="Arial" w:hAnsi="Arial" w:eastAsia="Noto Sans SC"/>
                 <w:b w:val="0"/>
                 <w:color w:val="000000"/>
-                <w:sz w:val="21"/>
+                <w:sz w:val="20"/>
               </w:rPr>
               <w:t>未稳定</w:t>
             </w:r>
@@ -2610,7 +2677,7 @@
           </w:tcPr>
           <w:p>
             <w:pPr>
-              <w:spacing w:before="0" w:after="0" w:line="280" w:lineRule="exact"/>
+              <w:spacing w:before="0" w:after="0" w:line="260" w:lineRule="exact"/>
               <w:jc w:val="center"/>
             </w:pPr>
             <w:r>
@@ -2618,7 +2685,7 @@
                 <w:rFonts w:ascii="Arial" w:hAnsi="Arial" w:eastAsia="Noto Sans SC"/>
                 <w:b w:val="0"/>
                 <w:color w:val="000000"/>
-                <w:sz w:val="21"/>
+                <w:sz w:val="20"/>
               </w:rPr>
               <w:t>ISTJ</w:t>
             </w:r>
@@ -2632,7 +2699,7 @@
           </w:tcPr>
           <w:p>
             <w:pPr>
-              <w:spacing w:before="0" w:after="0" w:line="280" w:lineRule="exact"/>
+              <w:spacing w:before="0" w:after="0" w:line="260" w:lineRule="exact"/>
               <w:jc w:val="center"/>
             </w:pPr>
             <w:r>
@@ -2640,9 +2707,9 @@
                 <w:rFonts w:ascii="Arial" w:hAnsi="Arial" w:eastAsia="Noto Sans SC"/>
                 <w:b w:val="0"/>
                 <w:color w:val="000000"/>
-                <w:sz w:val="21"/>
+                <w:sz w:val="20"/>
               </w:rPr>
-              <w:t>3/16</w:t>
+              <w:t>3/16  18.75%</w:t>
             </w:r>
           </w:p>
         </w:tc>
@@ -2659,7 +2726,7 @@
           </w:tcPr>
           <w:p>
             <w:pPr>
-              <w:spacing w:before="0" w:after="0" w:line="280" w:lineRule="exact"/>
+              <w:spacing w:before="0" w:after="0" w:line="260" w:lineRule="exact"/>
               <w:jc w:val="left"/>
             </w:pPr>
             <w:r>
@@ -2667,7 +2734,7 @@
                 <w:rFonts w:ascii="Arial" w:hAnsi="Arial" w:eastAsia="Noto Sans SC"/>
                 <w:b w:val="0"/>
                 <w:color w:val="000000"/>
-                <w:sz w:val="21"/>
+                <w:sz w:val="20"/>
               </w:rPr>
               <w:t>Muse Spark 1.3</w:t>
             </w:r>
@@ -2681,17 +2748,17 @@
           </w:tcPr>
           <w:p>
             <w:pPr>
-              <w:spacing w:before="0" w:after="0" w:line="280" w:lineRule="exact"/>
+              <w:spacing w:before="0" w:after="0" w:line="260" w:lineRule="exact"/>
               <w:jc w:val="center"/>
             </w:pPr>
             <w:r>
               <w:rPr>
                 <w:rFonts w:ascii="Arial" w:hAnsi="Arial" w:eastAsia="Noto Sans SC"/>
-                <w:b w:val="0"/>
+                <w:b/>
                 <w:color w:val="000000"/>
-                <w:sz w:val="21"/>
+                <w:sz w:val="20"/>
               </w:rPr>
-              <w:t>未稳定</w:t>
+              <w:t>INTJ</w:t>
             </w:r>
           </w:p>
         </w:tc>
@@ -2703,7 +2770,7 @@
           </w:tcPr>
           <w:p>
             <w:pPr>
-              <w:spacing w:before="0" w:after="0" w:line="280" w:lineRule="exact"/>
+              <w:spacing w:before="0" w:after="0" w:line="260" w:lineRule="exact"/>
               <w:jc w:val="center"/>
             </w:pPr>
             <w:r>
@@ -2711,7 +2778,7 @@
                 <w:rFonts w:ascii="Arial" w:hAnsi="Arial" w:eastAsia="Noto Sans SC"/>
                 <w:b w:val="0"/>
                 <w:color w:val="000000"/>
-                <w:sz w:val="21"/>
+                <w:sz w:val="20"/>
               </w:rPr>
               <w:t>INTJ</w:t>
             </w:r>
@@ -2725,7 +2792,7 @@
           </w:tcPr>
           <w:p>
             <w:pPr>
-              <w:spacing w:before="0" w:after="0" w:line="280" w:lineRule="exact"/>
+              <w:spacing w:before="0" w:after="0" w:line="260" w:lineRule="exact"/>
               <w:jc w:val="center"/>
             </w:pPr>
             <w:r>
@@ -2733,9 +2800,9 @@
                 <w:rFonts w:ascii="Arial" w:hAnsi="Arial" w:eastAsia="Noto Sans SC"/>
                 <w:b w:val="0"/>
                 <w:color w:val="000000"/>
-                <w:sz w:val="21"/>
+                <w:sz w:val="20"/>
               </w:rPr>
-              <w:t>10/16</w:t>
+              <w:t>10/16  62.5%</w:t>
             </w:r>
           </w:p>
         </w:tc>
@@ -2752,7 +2819,7 @@
           </w:tcPr>
           <w:p>
             <w:pPr>
-              <w:spacing w:before="0" w:after="0" w:line="280" w:lineRule="exact"/>
+              <w:spacing w:before="0" w:after="0" w:line="260" w:lineRule="exact"/>
               <w:jc w:val="left"/>
             </w:pPr>
             <w:r>
@@ -2760,7 +2827,7 @@
                 <w:rFonts w:ascii="Arial" w:hAnsi="Arial" w:eastAsia="Noto Sans SC"/>
                 <w:b w:val="0"/>
                 <w:color w:val="000000"/>
-                <w:sz w:val="21"/>
+                <w:sz w:val="20"/>
               </w:rPr>
               <w:t>Mistral Large 3 (Azure)</w:t>
             </w:r>
@@ -2774,17 +2841,17 @@
           </w:tcPr>
           <w:p>
             <w:pPr>
-              <w:spacing w:before="0" w:after="0" w:line="280" w:lineRule="exact"/>
+              <w:spacing w:before="0" w:after="0" w:line="260" w:lineRule="exact"/>
               <w:jc w:val="center"/>
             </w:pPr>
             <w:r>
               <w:rPr>
                 <w:rFonts w:ascii="Arial" w:hAnsi="Arial" w:eastAsia="Noto Sans SC"/>
-                <w:b w:val="0"/>
+                <w:b/>
                 <w:color w:val="000000"/>
-                <w:sz w:val="21"/>
+                <w:sz w:val="20"/>
               </w:rPr>
-              <w:t>未稳定</w:t>
+              <w:t>INTJ</w:t>
             </w:r>
           </w:p>
         </w:tc>
@@ -2796,7 +2863,7 @@
           </w:tcPr>
           <w:p>
             <w:pPr>
-              <w:spacing w:before="0" w:after="0" w:line="280" w:lineRule="exact"/>
+              <w:spacing w:before="0" w:after="0" w:line="260" w:lineRule="exact"/>
               <w:jc w:val="center"/>
             </w:pPr>
             <w:r>
@@ -2804,7 +2871,7 @@
                 <w:rFonts w:ascii="Arial" w:hAnsi="Arial" w:eastAsia="Noto Sans SC"/>
                 <w:b w:val="0"/>
                 <w:color w:val="000000"/>
-                <w:sz w:val="21"/>
+                <w:sz w:val="20"/>
               </w:rPr>
               <w:t>INTJ</w:t>
             </w:r>
@@ -2818,7 +2885,7 @@
           </w:tcPr>
           <w:p>
             <w:pPr>
-              <w:spacing w:before="0" w:after="0" w:line="280" w:lineRule="exact"/>
+              <w:spacing w:before="0" w:after="0" w:line="260" w:lineRule="exact"/>
               <w:jc w:val="center"/>
             </w:pPr>
             <w:r>
@@ -2826,9 +2893,9 @@
                 <w:rFonts w:ascii="Arial" w:hAnsi="Arial" w:eastAsia="Noto Sans SC"/>
                 <w:b w:val="0"/>
                 <w:color w:val="000000"/>
-                <w:sz w:val="21"/>
+                <w:sz w:val="20"/>
               </w:rPr>
-              <w:t>11/16</w:t>
+              <w:t>11/16  68.75%</w:t>
             </w:r>
           </w:p>
         </w:tc>
@@ -2837,22 +2904,22 @@
     <w:p>
       <w:pPr>
         <w:widowControl/>
-        <w:spacing w:before="140" w:after="40"/>
+        <w:spacing w:before="0" w:after="100" w:line="290" w:lineRule="exact"/>
       </w:pPr>
       <w:r>
         <w:rPr>
           <w:rFonts w:ascii="Arial" w:hAnsi="Arial" w:eastAsia="Noto Sans SC"/>
           <w:b w:val="0"/>
           <w:color w:val="000000"/>
-          <w:sz w:val="18"/>
+          <w:sz w:val="21"/>
         </w:rPr>
-        <w:t>数据来源  ZenMux Arena  批次 20260911T040759</w:t>
+        <w:t>数据来源  ZenMux Arena  批次 20260911T040759  分析修订 20260917</w:t>
       </w:r>
     </w:p>
     <w:sectPr>
       <w:footerReference w:type="default" r:id="rId9"/>
       <w:pgSz w:w="12240" w:h="15840"/>
-      <w:pgMar w:top="1152" w:right="1152" w:bottom="1152" w:left="1152" w:header="720" w:footer="504" w:gutter="0"/>
+      <w:pgMar w:top="936" w:right="1152" w:bottom="936" w:left="1152" w:header="720" w:footer="504" w:gutter="0"/>
       <w:cols w:space="720"/>
       <w:docGrid w:linePitch="360"/>
     </w:sectPr>
@@ -3088,7 +3155,7 @@
   <w:docDefaults>
     <w:rPrDefault>
       <w:rPr>
-        <w:rFonts w:asciiTheme="minorHAnsi" w:eastAsiaTheme="minorEastAsia" w:hAnsiTheme="minorHAnsi" w:cstheme="minorBidi"/>
+        <w:rFonts w:asciiTheme="minorHAnsi" w:hAnsiTheme="minorHAnsi" w:cstheme="minorBidi" w:eastAsia="Noto Sans SC"/>
         <w:sz w:val="22"/>
         <w:szCs w:val="22"/>
         <w:lang w:val="en-US" w:eastAsia="en-US" w:bidi="ar-SA"/>
@@ -3370,7 +3437,7 @@
       <w:outlineLvl w:val="2"/>
     </w:pPr>
     <w:rPr>
-      <w:rFonts w:asciiTheme="majorHAnsi" w:eastAsiaTheme="majorEastAsia" w:hAnsiTheme="majorHAnsi" w:cstheme="majorBidi"/>
+      <w:rFonts w:asciiTheme="majorHAnsi" w:hAnsiTheme="majorHAnsi" w:cstheme="majorBidi" w:eastAsia="Noto Sans SC"/>
       <w:b/>
       <w:bCs/>
       <w:color w:val="4F81BD" w:themeColor="accent1"/>
@@ -3393,7 +3460,7 @@
       <w:outlineLvl w:val="3"/>
     </w:pPr>
     <w:rPr>
-      <w:rFonts w:asciiTheme="majorHAnsi" w:eastAsiaTheme="majorEastAsia" w:hAnsiTheme="majorHAnsi" w:cstheme="majorBidi"/>
+      <w:rFonts w:asciiTheme="majorHAnsi" w:hAnsiTheme="majorHAnsi" w:cstheme="majorBidi" w:eastAsia="Noto Sans SC"/>
       <w:b/>
       <w:bCs/>
       <w:i/>
@@ -3418,7 +3485,7 @@
       <w:outlineLvl w:val="4"/>
     </w:pPr>
     <w:rPr>
-      <w:rFonts w:asciiTheme="majorHAnsi" w:eastAsiaTheme="majorEastAsia" w:hAnsiTheme="majorHAnsi" w:cstheme="majorBidi"/>
+      <w:rFonts w:asciiTheme="majorHAnsi" w:hAnsiTheme="majorHAnsi" w:cstheme="majorBidi" w:eastAsia="Noto Sans SC"/>
       <w:color w:val="243F60" w:themeColor="accent1" w:themeShade="7F"/>
     </w:rPr>
   </w:style>
@@ -3439,7 +3506,7 @@
       <w:outlineLvl w:val="5"/>
     </w:pPr>
     <w:rPr>
-      <w:rFonts w:asciiTheme="majorHAnsi" w:eastAsiaTheme="majorEastAsia" w:hAnsiTheme="majorHAnsi" w:cstheme="majorBidi"/>
+      <w:rFonts w:asciiTheme="majorHAnsi" w:hAnsiTheme="majorHAnsi" w:cstheme="majorBidi" w:eastAsia="Noto Sans SC"/>
       <w:i/>
       <w:iCs/>
       <w:color w:val="243F60" w:themeColor="accent1" w:themeShade="7F"/>
@@ -3462,7 +3529,7 @@
       <w:outlineLvl w:val="6"/>
     </w:pPr>
     <w:rPr>
-      <w:rFonts w:asciiTheme="majorHAnsi" w:eastAsiaTheme="majorEastAsia" w:hAnsiTheme="majorHAnsi" w:cstheme="majorBidi"/>
+      <w:rFonts w:asciiTheme="majorHAnsi" w:hAnsiTheme="majorHAnsi" w:cstheme="majorBidi" w:eastAsia="Noto Sans SC"/>
       <w:i/>
       <w:iCs/>
       <w:color w:val="404040" w:themeColor="text1" w:themeTint="BF"/>
@@ -3485,7 +3552,7 @@
       <w:outlineLvl w:val="7"/>
     </w:pPr>
     <w:rPr>
-      <w:rFonts w:asciiTheme="majorHAnsi" w:eastAsiaTheme="majorEastAsia" w:hAnsiTheme="majorHAnsi" w:cstheme="majorBidi"/>
+      <w:rFonts w:asciiTheme="majorHAnsi" w:hAnsiTheme="majorHAnsi" w:cstheme="majorBidi" w:eastAsia="Noto Sans SC"/>
       <w:color w:val="4F81BD" w:themeColor="accent1"/>
       <w:sz w:val="20"/>
       <w:szCs w:val="20"/>
@@ -3508,7 +3575,7 @@
       <w:outlineLvl w:val="8"/>
     </w:pPr>
     <w:rPr>
-      <w:rFonts w:asciiTheme="majorHAnsi" w:eastAsiaTheme="majorEastAsia" w:hAnsiTheme="majorHAnsi" w:cstheme="majorBidi"/>
+      <w:rFonts w:asciiTheme="majorHAnsi" w:hAnsiTheme="majorHAnsi" w:cstheme="majorBidi" w:eastAsia="Noto Sans SC"/>
       <w:i/>
       <w:iCs/>
       <w:color w:val="404040" w:themeColor="text1" w:themeTint="BF"/>
@@ -3559,7 +3626,7 @@
     <w:uiPriority w:val="9"/>
     <w:rsid w:val="00FC693F"/>
     <w:rPr>
-      <w:rFonts w:asciiTheme="majorHAnsi" w:eastAsiaTheme="majorEastAsia" w:hAnsiTheme="majorHAnsi" w:cstheme="majorBidi"/>
+      <w:rFonts w:asciiTheme="majorHAnsi" w:hAnsiTheme="majorHAnsi" w:cstheme="majorBidi" w:eastAsia="Noto Sans SC"/>
       <w:b/>
       <w:bCs/>
       <w:color w:val="365F91" w:themeColor="accent1" w:themeShade="BF"/>
@@ -3574,7 +3641,7 @@
     <w:uiPriority w:val="9"/>
     <w:rsid w:val="00FC693F"/>
     <w:rPr>
-      <w:rFonts w:asciiTheme="majorHAnsi" w:eastAsiaTheme="majorEastAsia" w:hAnsiTheme="majorHAnsi" w:cstheme="majorBidi"/>
+      <w:rFonts w:asciiTheme="majorHAnsi" w:hAnsiTheme="majorHAnsi" w:cstheme="majorBidi" w:eastAsia="Noto Sans SC"/>
       <w:b/>
       <w:bCs/>
       <w:color w:val="4F81BD" w:themeColor="accent1"/>
@@ -3589,7 +3656,7 @@
     <w:uiPriority w:val="9"/>
     <w:rsid w:val="00FC693F"/>
     <w:rPr>
-      <w:rFonts w:asciiTheme="majorHAnsi" w:eastAsiaTheme="majorEastAsia" w:hAnsiTheme="majorHAnsi" w:cstheme="majorBidi"/>
+      <w:rFonts w:asciiTheme="majorHAnsi" w:hAnsiTheme="majorHAnsi" w:cstheme="majorBidi" w:eastAsia="Noto Sans SC"/>
       <w:b/>
       <w:bCs/>
       <w:color w:val="4F81BD" w:themeColor="accent1"/>
@@ -3625,7 +3692,7 @@
     <w:uiPriority w:val="10"/>
     <w:rsid w:val="00FC693F"/>
     <w:rPr>
-      <w:rFonts w:asciiTheme="majorHAnsi" w:eastAsiaTheme="majorEastAsia" w:hAnsiTheme="majorHAnsi" w:cstheme="majorBidi"/>
+      <w:rFonts w:asciiTheme="majorHAnsi" w:hAnsiTheme="majorHAnsi" w:cstheme="majorBidi" w:eastAsia="Noto Sans SC"/>
       <w:color w:val="17365D" w:themeColor="text2" w:themeShade="BF"/>
       <w:spacing w:val="5"/>
       <w:kern w:val="28"/>
@@ -3666,7 +3733,7 @@
     <w:uiPriority w:val="11"/>
     <w:rsid w:val="00FC693F"/>
     <w:rPr>
-      <w:rFonts w:asciiTheme="majorHAnsi" w:eastAsiaTheme="majorEastAsia" w:hAnsiTheme="majorHAnsi" w:cstheme="majorBidi"/>
+      <w:rFonts w:asciiTheme="majorHAnsi" w:hAnsiTheme="majorHAnsi" w:cstheme="majorBidi" w:eastAsia="Noto Sans SC"/>
       <w:i/>
       <w:iCs/>
       <w:color w:val="4F81BD" w:themeColor="accent1"/>
@@ -3913,7 +3980,7 @@
       </w:tabs>
     </w:pPr>
     <w:rPr>
-      <w:rFonts w:ascii="Courier" w:hAnsi="Courier"/>
+      <w:rFonts w:ascii="Courier" w:hAnsi="Courier" w:eastAsia="Noto Sans SC"/>
       <w:sz w:val="20"/>
       <w:szCs w:val="20"/>
     </w:rPr>
@@ -3925,7 +3992,7 @@
     <w:uiPriority w:val="99"/>
     <w:rsid w:val="0029639D"/>
     <w:rPr>
-      <w:rFonts w:ascii="Courier" w:hAnsi="Courier"/>
+      <w:rFonts w:ascii="Courier" w:hAnsi="Courier" w:eastAsia="Noto Sans SC"/>
       <w:sz w:val="20"/>
       <w:szCs w:val="20"/>
     </w:rPr>
@@ -3964,7 +4031,7 @@
     <w:semiHidden/>
     <w:rsid w:val="00FC693F"/>
     <w:rPr>
-      <w:rFonts w:asciiTheme="majorHAnsi" w:eastAsiaTheme="majorEastAsia" w:hAnsiTheme="majorHAnsi" w:cstheme="majorBidi"/>
+      <w:rFonts w:asciiTheme="majorHAnsi" w:hAnsiTheme="majorHAnsi" w:cstheme="majorBidi" w:eastAsia="Noto Sans SC"/>
       <w:b/>
       <w:bCs/>
       <w:i/>
@@ -3980,7 +4047,7 @@
     <w:semiHidden/>
     <w:rsid w:val="00FC693F"/>
     <w:rPr>
-      <w:rFonts w:asciiTheme="majorHAnsi" w:eastAsiaTheme="majorEastAsia" w:hAnsiTheme="majorHAnsi" w:cstheme="majorBidi"/>
+      <w:rFonts w:asciiTheme="majorHAnsi" w:hAnsiTheme="majorHAnsi" w:cstheme="majorBidi" w:eastAsia="Noto Sans SC"/>
       <w:color w:val="243F60" w:themeColor="accent1" w:themeShade="7F"/>
     </w:rPr>
   </w:style>
@@ -3992,7 +4059,7 @@
     <w:semiHidden/>
     <w:rsid w:val="00FC693F"/>
     <w:rPr>
-      <w:rFonts w:asciiTheme="majorHAnsi" w:eastAsiaTheme="majorEastAsia" w:hAnsiTheme="majorHAnsi" w:cstheme="majorBidi"/>
+      <w:rFonts w:asciiTheme="majorHAnsi" w:hAnsiTheme="majorHAnsi" w:cstheme="majorBidi" w:eastAsia="Noto Sans SC"/>
       <w:i/>
       <w:iCs/>
       <w:color w:val="243F60" w:themeColor="accent1" w:themeShade="7F"/>
@@ -4006,7 +4073,7 @@
     <w:semiHidden/>
     <w:rsid w:val="00FC693F"/>
     <w:rPr>
-      <w:rFonts w:asciiTheme="majorHAnsi" w:eastAsiaTheme="majorEastAsia" w:hAnsiTheme="majorHAnsi" w:cstheme="majorBidi"/>
+      <w:rFonts w:asciiTheme="majorHAnsi" w:hAnsiTheme="majorHAnsi" w:cstheme="majorBidi" w:eastAsia="Noto Sans SC"/>
       <w:i/>
       <w:iCs/>
       <w:color w:val="404040" w:themeColor="text1" w:themeTint="BF"/>
@@ -4020,7 +4087,7 @@
     <w:semiHidden/>
     <w:rsid w:val="00FC693F"/>
     <w:rPr>
-      <w:rFonts w:asciiTheme="majorHAnsi" w:eastAsiaTheme="majorEastAsia" w:hAnsiTheme="majorHAnsi" w:cstheme="majorBidi"/>
+      <w:rFonts w:asciiTheme="majorHAnsi" w:hAnsiTheme="majorHAnsi" w:cstheme="majorBidi" w:eastAsia="Noto Sans SC"/>
       <w:color w:val="4F81BD" w:themeColor="accent1"/>
       <w:sz w:val="20"/>
       <w:szCs w:val="20"/>
@@ -4034,7 +4101,7 @@
     <w:semiHidden/>
     <w:rsid w:val="00FC693F"/>
     <w:rPr>
-      <w:rFonts w:asciiTheme="majorHAnsi" w:eastAsiaTheme="majorEastAsia" w:hAnsiTheme="majorHAnsi" w:cstheme="majorBidi"/>
+      <w:rFonts w:asciiTheme="majorHAnsi" w:hAnsiTheme="majorHAnsi" w:cstheme="majorBidi" w:eastAsia="Noto Sans SC"/>
       <w:i/>
       <w:iCs/>
       <w:color w:val="404040" w:themeColor="text1" w:themeTint="BF"/>
@@ -5620,7 +5687,7 @@
         <w:spacing w:before="0" w:after="0" w:line="240" w:lineRule="auto"/>
       </w:pPr>
       <w:rPr>
-        <w:rFonts w:asciiTheme="majorHAnsi" w:eastAsiaTheme="majorEastAsia" w:hAnsiTheme="majorHAnsi" w:cstheme="majorBidi"/>
+        <w:rFonts w:asciiTheme="majorHAnsi" w:hAnsiTheme="majorHAnsi" w:cstheme="majorBidi" w:eastAsia="Noto Sans SC"/>
         <w:b/>
         <w:bCs/>
       </w:rPr>
@@ -5641,7 +5708,7 @@
         <w:spacing w:before="0" w:after="0" w:line="240" w:lineRule="auto"/>
       </w:pPr>
       <w:rPr>
-        <w:rFonts w:asciiTheme="majorHAnsi" w:eastAsiaTheme="majorEastAsia" w:hAnsiTheme="majorHAnsi" w:cstheme="majorBidi"/>
+        <w:rFonts w:asciiTheme="majorHAnsi" w:hAnsiTheme="majorHAnsi" w:cstheme="majorBidi" w:eastAsia="Noto Sans SC"/>
         <w:b/>
         <w:bCs/>
       </w:rPr>
@@ -5659,14 +5726,14 @@
     </w:tblStylePr>
     <w:tblStylePr w:type="firstCol">
       <w:rPr>
-        <w:rFonts w:asciiTheme="majorHAnsi" w:eastAsiaTheme="majorEastAsia" w:hAnsiTheme="majorHAnsi" w:cstheme="majorBidi"/>
+        <w:rFonts w:asciiTheme="majorHAnsi" w:hAnsiTheme="majorHAnsi" w:cstheme="majorBidi" w:eastAsia="Noto Sans SC"/>
         <w:b/>
         <w:bCs/>
       </w:rPr>
     </w:tblStylePr>
     <w:tblStylePr w:type="lastCol">
       <w:rPr>
-        <w:rFonts w:asciiTheme="majorHAnsi" w:eastAsiaTheme="majorEastAsia" w:hAnsiTheme="majorHAnsi" w:cstheme="majorBidi"/>
+        <w:rFonts w:asciiTheme="majorHAnsi" w:hAnsiTheme="majorHAnsi" w:cstheme="majorBidi" w:eastAsia="Noto Sans SC"/>
         <w:b/>
         <w:bCs/>
       </w:rPr>
@@ -5750,7 +5817,7 @@
         <w:spacing w:before="0" w:after="0" w:line="240" w:lineRule="auto"/>
       </w:pPr>
       <w:rPr>
-        <w:rFonts w:asciiTheme="majorHAnsi" w:eastAsiaTheme="majorEastAsia" w:hAnsiTheme="majorHAnsi" w:cstheme="majorBidi"/>
+        <w:rFonts w:asciiTheme="majorHAnsi" w:hAnsiTheme="majorHAnsi" w:cstheme="majorBidi" w:eastAsia="Noto Sans SC"/>
         <w:b/>
         <w:bCs/>
       </w:rPr>
@@ -5771,7 +5838,7 @@
         <w:spacing w:before="0" w:after="0" w:line="240" w:lineRule="auto"/>
       </w:pPr>
       <w:rPr>
-        <w:rFonts w:asciiTheme="majorHAnsi" w:eastAsiaTheme="majorEastAsia" w:hAnsiTheme="majorHAnsi" w:cstheme="majorBidi"/>
+        <w:rFonts w:asciiTheme="majorHAnsi" w:hAnsiTheme="majorHAnsi" w:cstheme="majorBidi" w:eastAsia="Noto Sans SC"/>
         <w:b/>
         <w:bCs/>
       </w:rPr>
@@ -5789,14 +5856,14 @@
     </w:tblStylePr>
     <w:tblStylePr w:type="firstCol">
       <w:rPr>
-        <w:rFonts w:asciiTheme="majorHAnsi" w:eastAsiaTheme="majorEastAsia" w:hAnsiTheme="majorHAnsi" w:cstheme="majorBidi"/>
+        <w:rFonts w:asciiTheme="majorHAnsi" w:hAnsiTheme="majorHAnsi" w:cstheme="majorBidi" w:eastAsia="Noto Sans SC"/>
         <w:b/>
         <w:bCs/>
       </w:rPr>
     </w:tblStylePr>
     <w:tblStylePr w:type="lastCol">
       <w:rPr>
-        <w:rFonts w:asciiTheme="majorHAnsi" w:eastAsiaTheme="majorEastAsia" w:hAnsiTheme="majorHAnsi" w:cstheme="majorBidi"/>
+        <w:rFonts w:asciiTheme="majorHAnsi" w:hAnsiTheme="majorHAnsi" w:cstheme="majorBidi" w:eastAsia="Noto Sans SC"/>
         <w:b/>
         <w:bCs/>
       </w:rPr>
@@ -5880,7 +5947,7 @@
         <w:spacing w:before="0" w:after="0" w:line="240" w:lineRule="auto"/>
       </w:pPr>
       <w:rPr>
-        <w:rFonts w:asciiTheme="majorHAnsi" w:eastAsiaTheme="majorEastAsia" w:hAnsiTheme="majorHAnsi" w:cstheme="majorBidi"/>
+        <w:rFonts w:asciiTheme="majorHAnsi" w:hAnsiTheme="majorHAnsi" w:cstheme="majorBidi" w:eastAsia="Noto Sans SC"/>
         <w:b/>
         <w:bCs/>
       </w:rPr>
@@ -5901,7 +5968,7 @@
         <w:spacing w:before="0" w:after="0" w:line="240" w:lineRule="auto"/>
       </w:pPr>
       <w:rPr>
-        <w:rFonts w:asciiTheme="majorHAnsi" w:eastAsiaTheme="majorEastAsia" w:hAnsiTheme="majorHAnsi" w:cstheme="majorBidi"/>
+        <w:rFonts w:asciiTheme="majorHAnsi" w:hAnsiTheme="majorHAnsi" w:cstheme="majorBidi" w:eastAsia="Noto Sans SC"/>
         <w:b/>
         <w:bCs/>
       </w:rPr>
@@ -5919,14 +5986,14 @@
     </w:tblStylePr>
     <w:tblStylePr w:type="firstCol">
       <w:rPr>
-        <w:rFonts w:asciiTheme="majorHAnsi" w:eastAsiaTheme="majorEastAsia" w:hAnsiTheme="majorHAnsi" w:cstheme="majorBidi"/>
+        <w:rFonts w:asciiTheme="majorHAnsi" w:hAnsiTheme="majorHAnsi" w:cstheme="majorBidi" w:eastAsia="Noto Sans SC"/>
         <w:b/>
         <w:bCs/>
       </w:rPr>
     </w:tblStylePr>
     <w:tblStylePr w:type="lastCol">
       <w:rPr>
-        <w:rFonts w:asciiTheme="majorHAnsi" w:eastAsiaTheme="majorEastAsia" w:hAnsiTheme="majorHAnsi" w:cstheme="majorBidi"/>
+        <w:rFonts w:asciiTheme="majorHAnsi" w:hAnsiTheme="majorHAnsi" w:cstheme="majorBidi" w:eastAsia="Noto Sans SC"/>
         <w:b/>
         <w:bCs/>
       </w:rPr>
@@ -6010,7 +6077,7 @@
         <w:spacing w:before="0" w:after="0" w:line="240" w:lineRule="auto"/>
       </w:pPr>
       <w:rPr>
-        <w:rFonts w:asciiTheme="majorHAnsi" w:eastAsiaTheme="majorEastAsia" w:hAnsiTheme="majorHAnsi" w:cstheme="majorBidi"/>
+        <w:rFonts w:asciiTheme="majorHAnsi" w:hAnsiTheme="majorHAnsi" w:cstheme="majorBidi" w:eastAsia="Noto Sans SC"/>
         <w:b/>
         <w:bCs/>
       </w:rPr>
@@ -6031,7 +6098,7 @@
         <w:spacing w:before="0" w:after="0" w:line="240" w:lineRule="auto"/>
       </w:pPr>
       <w:rPr>
-        <w:rFonts w:asciiTheme="majorHAnsi" w:eastAsiaTheme="majorEastAsia" w:hAnsiTheme="majorHAnsi" w:cstheme="majorBidi"/>
+        <w:rFonts w:asciiTheme="majorHAnsi" w:hAnsiTheme="majorHAnsi" w:cstheme="majorBidi" w:eastAsia="Noto Sans SC"/>
         <w:b/>
         <w:bCs/>
       </w:rPr>
@@ -6049,14 +6116,14 @@
     </w:tblStylePr>
     <w:tblStylePr w:type="firstCol">
       <w:rPr>
-        <w:rFonts w:asciiTheme="majorHAnsi" w:eastAsiaTheme="majorEastAsia" w:hAnsiTheme="majorHAnsi" w:cstheme="majorBidi"/>
+        <w:rFonts w:asciiTheme="majorHAnsi" w:hAnsiTheme="majorHAnsi" w:cstheme="majorBidi" w:eastAsia="Noto Sans SC"/>
         <w:b/>
         <w:bCs/>
       </w:rPr>
     </w:tblStylePr>
     <w:tblStylePr w:type="lastCol">
       <w:rPr>
-        <w:rFonts w:asciiTheme="majorHAnsi" w:eastAsiaTheme="majorEastAsia" w:hAnsiTheme="majorHAnsi" w:cstheme="majorBidi"/>
+        <w:rFonts w:asciiTheme="majorHAnsi" w:hAnsiTheme="majorHAnsi" w:cstheme="majorBidi" w:eastAsia="Noto Sans SC"/>
         <w:b/>
         <w:bCs/>
       </w:rPr>
@@ -6140,7 +6207,7 @@
         <w:spacing w:before="0" w:after="0" w:line="240" w:lineRule="auto"/>
       </w:pPr>
       <w:rPr>
-        <w:rFonts w:asciiTheme="majorHAnsi" w:eastAsiaTheme="majorEastAsia" w:hAnsiTheme="majorHAnsi" w:cstheme="majorBidi"/>
+        <w:rFonts w:asciiTheme="majorHAnsi" w:hAnsiTheme="majorHAnsi" w:cstheme="majorBidi" w:eastAsia="Noto Sans SC"/>
         <w:b/>
         <w:bCs/>
       </w:rPr>
@@ -6161,7 +6228,7 @@
         <w:spacing w:before="0" w:after="0" w:line="240" w:lineRule="auto"/>
       </w:pPr>
       <w:rPr>
-        <w:rFonts w:asciiTheme="majorHAnsi" w:eastAsiaTheme="majorEastAsia" w:hAnsiTheme="majorHAnsi" w:cstheme="majorBidi"/>
+        <w:rFonts w:asciiTheme="majorHAnsi" w:hAnsiTheme="majorHAnsi" w:cstheme="majorBidi" w:eastAsia="Noto Sans SC"/>
         <w:b/>
         <w:bCs/>
       </w:rPr>
@@ -6179,14 +6246,14 @@
     </w:tblStylePr>
     <w:tblStylePr w:type="firstCol">
       <w:rPr>
-        <w:rFonts w:asciiTheme="majorHAnsi" w:eastAsiaTheme="majorEastAsia" w:hAnsiTheme="majorHAnsi" w:cstheme="majorBidi"/>
+        <w:rFonts w:asciiTheme="majorHAnsi" w:hAnsiTheme="majorHAnsi" w:cstheme="majorBidi" w:eastAsia="Noto Sans SC"/>
         <w:b/>
         <w:bCs/>
       </w:rPr>
     </w:tblStylePr>
     <w:tblStylePr w:type="lastCol">
       <w:rPr>
-        <w:rFonts w:asciiTheme="majorHAnsi" w:eastAsiaTheme="majorEastAsia" w:hAnsiTheme="majorHAnsi" w:cstheme="majorBidi"/>
+        <w:rFonts w:asciiTheme="majorHAnsi" w:hAnsiTheme="majorHAnsi" w:cstheme="majorBidi" w:eastAsia="Noto Sans SC"/>
         <w:b/>
         <w:bCs/>
       </w:rPr>
@@ -6270,7 +6337,7 @@
         <w:spacing w:before="0" w:after="0" w:line="240" w:lineRule="auto"/>
       </w:pPr>
       <w:rPr>
-        <w:rFonts w:asciiTheme="majorHAnsi" w:eastAsiaTheme="majorEastAsia" w:hAnsiTheme="majorHAnsi" w:cstheme="majorBidi"/>
+        <w:rFonts w:asciiTheme="majorHAnsi" w:hAnsiTheme="majorHAnsi" w:cstheme="majorBidi" w:eastAsia="Noto Sans SC"/>
         <w:b/>
         <w:bCs/>
       </w:rPr>
@@ -6291,7 +6358,7 @@
         <w:spacing w:before="0" w:after="0" w:line="240" w:lineRule="auto"/>
       </w:pPr>
       <w:rPr>
-        <w:rFonts w:asciiTheme="majorHAnsi" w:eastAsiaTheme="majorEastAsia" w:hAnsiTheme="majorHAnsi" w:cstheme="majorBidi"/>
+        <w:rFonts w:asciiTheme="majorHAnsi" w:hAnsiTheme="majorHAnsi" w:cstheme="majorBidi" w:eastAsia="Noto Sans SC"/>
         <w:b/>
         <w:bCs/>
       </w:rPr>
@@ -6309,14 +6376,14 @@
     </w:tblStylePr>
     <w:tblStylePr w:type="firstCol">
       <w:rPr>
-        <w:rFonts w:asciiTheme="majorHAnsi" w:eastAsiaTheme="majorEastAsia" w:hAnsiTheme="majorHAnsi" w:cstheme="majorBidi"/>
+        <w:rFonts w:asciiTheme="majorHAnsi" w:hAnsiTheme="majorHAnsi" w:cstheme="majorBidi" w:eastAsia="Noto Sans SC"/>
         <w:b/>
         <w:bCs/>
       </w:rPr>
     </w:tblStylePr>
     <w:tblStylePr w:type="lastCol">
       <w:rPr>
-        <w:rFonts w:asciiTheme="majorHAnsi" w:eastAsiaTheme="majorEastAsia" w:hAnsiTheme="majorHAnsi" w:cstheme="majorBidi"/>
+        <w:rFonts w:asciiTheme="majorHAnsi" w:hAnsiTheme="majorHAnsi" w:cstheme="majorBidi" w:eastAsia="Noto Sans SC"/>
         <w:b/>
         <w:bCs/>
       </w:rPr>
@@ -6400,7 +6467,7 @@
         <w:spacing w:before="0" w:after="0" w:line="240" w:lineRule="auto"/>
       </w:pPr>
       <w:rPr>
-        <w:rFonts w:asciiTheme="majorHAnsi" w:eastAsiaTheme="majorEastAsia" w:hAnsiTheme="majorHAnsi" w:cstheme="majorBidi"/>
+        <w:rFonts w:asciiTheme="majorHAnsi" w:hAnsiTheme="majorHAnsi" w:cstheme="majorBidi" w:eastAsia="Noto Sans SC"/>
         <w:b/>
         <w:bCs/>
       </w:rPr>
@@ -6421,7 +6488,7 @@
         <w:spacing w:before="0" w:after="0" w:line="240" w:lineRule="auto"/>
       </w:pPr>
       <w:rPr>
-        <w:rFonts w:asciiTheme="majorHAnsi" w:eastAsiaTheme="majorEastAsia" w:hAnsiTheme="majorHAnsi" w:cstheme="majorBidi"/>
+        <w:rFonts w:asciiTheme="majorHAnsi" w:hAnsiTheme="majorHAnsi" w:cstheme="majorBidi" w:eastAsia="Noto Sans SC"/>
         <w:b/>
         <w:bCs/>
       </w:rPr>
@@ -6439,14 +6506,14 @@
     </w:tblStylePr>
     <w:tblStylePr w:type="firstCol">
       <w:rPr>
-        <w:rFonts w:asciiTheme="majorHAnsi" w:eastAsiaTheme="majorEastAsia" w:hAnsiTheme="majorHAnsi" w:cstheme="majorBidi"/>
+        <w:rFonts w:asciiTheme="majorHAnsi" w:hAnsiTheme="majorHAnsi" w:cstheme="majorBidi" w:eastAsia="Noto Sans SC"/>
         <w:b/>
         <w:bCs/>
       </w:rPr>
     </w:tblStylePr>
     <w:tblStylePr w:type="lastCol">
       <w:rPr>
-        <w:rFonts w:asciiTheme="majorHAnsi" w:eastAsiaTheme="majorEastAsia" w:hAnsiTheme="majorHAnsi" w:cstheme="majorBidi"/>
+        <w:rFonts w:asciiTheme="majorHAnsi" w:hAnsiTheme="majorHAnsi" w:cstheme="majorBidi" w:eastAsia="Noto Sans SC"/>
         <w:b/>
         <w:bCs/>
       </w:rPr>
@@ -8311,7 +8378,7 @@
     </w:tblPr>
     <w:tblStylePr w:type="firstRow">
       <w:rPr>
-        <w:rFonts w:asciiTheme="majorHAnsi" w:eastAsiaTheme="majorEastAsia" w:hAnsiTheme="majorHAnsi" w:cstheme="majorBidi"/>
+        <w:rFonts w:asciiTheme="majorHAnsi" w:hAnsiTheme="majorHAnsi" w:cstheme="majorBidi" w:eastAsia="Noto Sans SC"/>
       </w:rPr>
       <w:tblPr/>
       <w:tcPr>
@@ -8395,7 +8462,7 @@
     </w:tblPr>
     <w:tblStylePr w:type="firstRow">
       <w:rPr>
-        <w:rFonts w:asciiTheme="majorHAnsi" w:eastAsiaTheme="majorEastAsia" w:hAnsiTheme="majorHAnsi" w:cstheme="majorBidi"/>
+        <w:rFonts w:asciiTheme="majorHAnsi" w:hAnsiTheme="majorHAnsi" w:cstheme="majorBidi" w:eastAsia="Noto Sans SC"/>
       </w:rPr>
       <w:tblPr/>
       <w:tcPr>
@@ -8479,7 +8546,7 @@
     </w:tblPr>
     <w:tblStylePr w:type="firstRow">
       <w:rPr>
-        <w:rFonts w:asciiTheme="majorHAnsi" w:eastAsiaTheme="majorEastAsia" w:hAnsiTheme="majorHAnsi" w:cstheme="majorBidi"/>
+        <w:rFonts w:asciiTheme="majorHAnsi" w:hAnsiTheme="majorHAnsi" w:cstheme="majorBidi" w:eastAsia="Noto Sans SC"/>
       </w:rPr>
       <w:tblPr/>
       <w:tcPr>
@@ -8563,7 +8630,7 @@
     </w:tblPr>
     <w:tblStylePr w:type="firstRow">
       <w:rPr>
-        <w:rFonts w:asciiTheme="majorHAnsi" w:eastAsiaTheme="majorEastAsia" w:hAnsiTheme="majorHAnsi" w:cstheme="majorBidi"/>
+        <w:rFonts w:asciiTheme="majorHAnsi" w:hAnsiTheme="majorHAnsi" w:cstheme="majorBidi" w:eastAsia="Noto Sans SC"/>
       </w:rPr>
       <w:tblPr/>
       <w:tcPr>
@@ -8647,7 +8714,7 @@
     </w:tblPr>
     <w:tblStylePr w:type="firstRow">
       <w:rPr>
-        <w:rFonts w:asciiTheme="majorHAnsi" w:eastAsiaTheme="majorEastAsia" w:hAnsiTheme="majorHAnsi" w:cstheme="majorBidi"/>
+        <w:rFonts w:asciiTheme="majorHAnsi" w:hAnsiTheme="majorHAnsi" w:cstheme="majorBidi" w:eastAsia="Noto Sans SC"/>
       </w:rPr>
       <w:tblPr/>
       <w:tcPr>
@@ -8731,7 +8798,7 @@
     </w:tblPr>
     <w:tblStylePr w:type="firstRow">
       <w:rPr>
-        <w:rFonts w:asciiTheme="majorHAnsi" w:eastAsiaTheme="majorEastAsia" w:hAnsiTheme="majorHAnsi" w:cstheme="majorBidi"/>
+        <w:rFonts w:asciiTheme="majorHAnsi" w:hAnsiTheme="majorHAnsi" w:cstheme="majorBidi" w:eastAsia="Noto Sans SC"/>
       </w:rPr>
       <w:tblPr/>
       <w:tcPr>
@@ -8815,7 +8882,7 @@
     </w:tblPr>
     <w:tblStylePr w:type="firstRow">
       <w:rPr>
-        <w:rFonts w:asciiTheme="majorHAnsi" w:eastAsiaTheme="majorEastAsia" w:hAnsiTheme="majorHAnsi" w:cstheme="majorBidi"/>
+        <w:rFonts w:asciiTheme="majorHAnsi" w:hAnsiTheme="majorHAnsi" w:cstheme="majorBidi" w:eastAsia="Noto Sans SC"/>
       </w:rPr>
       <w:tblPr/>
       <w:tcPr>
@@ -8880,7 +8947,7 @@
       <w:spacing w:after="0" w:line="240" w:lineRule="auto"/>
     </w:pPr>
     <w:rPr>
-      <w:rFonts w:asciiTheme="majorHAnsi" w:eastAsiaTheme="majorEastAsia" w:hAnsiTheme="majorHAnsi" w:cstheme="majorBidi"/>
+      <w:rFonts w:asciiTheme="majorHAnsi" w:hAnsiTheme="majorHAnsi" w:cstheme="majorBidi" w:eastAsia="Noto Sans SC"/>
       <w:color w:val="000000" w:themeColor="text1"/>
     </w:rPr>
     <w:tblPr>
@@ -9008,7 +9075,7 @@
       <w:spacing w:after="0" w:line="240" w:lineRule="auto"/>
     </w:pPr>
     <w:rPr>
-      <w:rFonts w:asciiTheme="majorHAnsi" w:eastAsiaTheme="majorEastAsia" w:hAnsiTheme="majorHAnsi" w:cstheme="majorBidi"/>
+      <w:rFonts w:asciiTheme="majorHAnsi" w:hAnsiTheme="majorHAnsi" w:cstheme="majorBidi" w:eastAsia="Noto Sans SC"/>
       <w:color w:val="000000" w:themeColor="text1"/>
     </w:rPr>
     <w:tblPr>
@@ -9136,7 +9203,7 @@
       <w:spacing w:after="0" w:line="240" w:lineRule="auto"/>
     </w:pPr>
     <w:rPr>
-      <w:rFonts w:asciiTheme="majorHAnsi" w:eastAsiaTheme="majorEastAsia" w:hAnsiTheme="majorHAnsi" w:cstheme="majorBidi"/>
+      <w:rFonts w:asciiTheme="majorHAnsi" w:hAnsiTheme="majorHAnsi" w:cstheme="majorBidi" w:eastAsia="Noto Sans SC"/>
       <w:color w:val="000000" w:themeColor="text1"/>
     </w:rPr>
     <w:tblPr>
@@ -9264,7 +9331,7 @@
       <w:spacing w:after="0" w:line="240" w:lineRule="auto"/>
     </w:pPr>
     <w:rPr>
-      <w:rFonts w:asciiTheme="majorHAnsi" w:eastAsiaTheme="majorEastAsia" w:hAnsiTheme="majorHAnsi" w:cstheme="majorBidi"/>
+      <w:rFonts w:asciiTheme="majorHAnsi" w:hAnsiTheme="majorHAnsi" w:cstheme="majorBidi" w:eastAsia="Noto Sans SC"/>
       <w:color w:val="000000" w:themeColor="text1"/>
     </w:rPr>
     <w:tblPr>
@@ -9392,7 +9459,7 @@
       <w:spacing w:after="0" w:line="240" w:lineRule="auto"/>
     </w:pPr>
     <w:rPr>
-      <w:rFonts w:asciiTheme="majorHAnsi" w:eastAsiaTheme="majorEastAsia" w:hAnsiTheme="majorHAnsi" w:cstheme="majorBidi"/>
+      <w:rFonts w:asciiTheme="majorHAnsi" w:hAnsiTheme="majorHAnsi" w:cstheme="majorBidi" w:eastAsia="Noto Sans SC"/>
       <w:color w:val="000000" w:themeColor="text1"/>
     </w:rPr>
     <w:tblPr>
@@ -9520,7 +9587,7 @@
       <w:spacing w:after="0" w:line="240" w:lineRule="auto"/>
     </w:pPr>
     <w:rPr>
-      <w:rFonts w:asciiTheme="majorHAnsi" w:eastAsiaTheme="majorEastAsia" w:hAnsiTheme="majorHAnsi" w:cstheme="majorBidi"/>
+      <w:rFonts w:asciiTheme="majorHAnsi" w:hAnsiTheme="majorHAnsi" w:cstheme="majorBidi" w:eastAsia="Noto Sans SC"/>
       <w:color w:val="000000" w:themeColor="text1"/>
     </w:rPr>
     <w:tblPr>
@@ -9648,7 +9715,7 @@
       <w:spacing w:after="0" w:line="240" w:lineRule="auto"/>
     </w:pPr>
     <w:rPr>
-      <w:rFonts w:asciiTheme="majorHAnsi" w:eastAsiaTheme="majorEastAsia" w:hAnsiTheme="majorHAnsi" w:cstheme="majorBidi"/>
+      <w:rFonts w:asciiTheme="majorHAnsi" w:hAnsiTheme="majorHAnsi" w:cstheme="majorBidi" w:eastAsia="Noto Sans SC"/>
       <w:color w:val="000000" w:themeColor="text1"/>
     </w:rPr>
     <w:tblPr>
@@ -10287,7 +10354,7 @@
       <w:spacing w:after="0" w:line="240" w:lineRule="auto"/>
     </w:pPr>
     <w:rPr>
-      <w:rFonts w:asciiTheme="majorHAnsi" w:eastAsiaTheme="majorEastAsia" w:hAnsiTheme="majorHAnsi" w:cstheme="majorBidi"/>
+      <w:rFonts w:asciiTheme="majorHAnsi" w:hAnsiTheme="majorHAnsi" w:cstheme="majorBidi" w:eastAsia="Noto Sans SC"/>
       <w:color w:val="000000" w:themeColor="text1"/>
     </w:rPr>
     <w:tblPr>
@@ -10412,7 +10479,7 @@
       <w:spacing w:after="0" w:line="240" w:lineRule="auto"/>
     </w:pPr>
     <w:rPr>
-      <w:rFonts w:asciiTheme="majorHAnsi" w:eastAsiaTheme="majorEastAsia" w:hAnsiTheme="majorHAnsi" w:cstheme="majorBidi"/>
+      <w:rFonts w:asciiTheme="majorHAnsi" w:hAnsiTheme="majorHAnsi" w:cstheme="majorBidi" w:eastAsia="Noto Sans SC"/>
       <w:color w:val="000000" w:themeColor="text1"/>
     </w:rPr>
     <w:tblPr>
@@ -10537,7 +10604,7 @@
       <w:spacing w:after="0" w:line="240" w:lineRule="auto"/>
     </w:pPr>
     <w:rPr>
-      <w:rFonts w:asciiTheme="majorHAnsi" w:eastAsiaTheme="majorEastAsia" w:hAnsiTheme="majorHAnsi" w:cstheme="majorBidi"/>
+      <w:rFonts w:asciiTheme="majorHAnsi" w:hAnsiTheme="majorHAnsi" w:cstheme="majorBidi" w:eastAsia="Noto Sans SC"/>
       <w:color w:val="000000" w:themeColor="text1"/>
     </w:rPr>
     <w:tblPr>
@@ -10662,7 +10729,7 @@
       <w:spacing w:after="0" w:line="240" w:lineRule="auto"/>
     </w:pPr>
     <w:rPr>
-      <w:rFonts w:asciiTheme="majorHAnsi" w:eastAsiaTheme="majorEastAsia" w:hAnsiTheme="majorHAnsi" w:cstheme="majorBidi"/>
+      <w:rFonts w:asciiTheme="majorHAnsi" w:hAnsiTheme="majorHAnsi" w:cstheme="majorBidi" w:eastAsia="Noto Sans SC"/>
       <w:color w:val="000000" w:themeColor="text1"/>
     </w:rPr>
     <w:tblPr>
@@ -10787,7 +10854,7 @@
       <w:spacing w:after="0" w:line="240" w:lineRule="auto"/>
     </w:pPr>
     <w:rPr>
-      <w:rFonts w:asciiTheme="majorHAnsi" w:eastAsiaTheme="majorEastAsia" w:hAnsiTheme="majorHAnsi" w:cstheme="majorBidi"/>
+      <w:rFonts w:asciiTheme="majorHAnsi" w:hAnsiTheme="majorHAnsi" w:cstheme="majorBidi" w:eastAsia="Noto Sans SC"/>
       <w:color w:val="000000" w:themeColor="text1"/>
     </w:rPr>
     <w:tblPr>
@@ -10912,7 +10979,7 @@
       <w:spacing w:after="0" w:line="240" w:lineRule="auto"/>
     </w:pPr>
     <w:rPr>
-      <w:rFonts w:asciiTheme="majorHAnsi" w:eastAsiaTheme="majorEastAsia" w:hAnsiTheme="majorHAnsi" w:cstheme="majorBidi"/>
+      <w:rFonts w:asciiTheme="majorHAnsi" w:hAnsiTheme="majorHAnsi" w:cstheme="majorBidi" w:eastAsia="Noto Sans SC"/>
       <w:color w:val="000000" w:themeColor="text1"/>
     </w:rPr>
     <w:tblPr>
@@ -11037,7 +11104,7 @@
       <w:spacing w:after="0" w:line="240" w:lineRule="auto"/>
     </w:pPr>
     <w:rPr>
-      <w:rFonts w:asciiTheme="majorHAnsi" w:eastAsiaTheme="majorEastAsia" w:hAnsiTheme="majorHAnsi" w:cstheme="majorBidi"/>
+      <w:rFonts w:asciiTheme="majorHAnsi" w:hAnsiTheme="majorHAnsi" w:cstheme="majorBidi" w:eastAsia="Noto Sans SC"/>
       <w:color w:val="000000" w:themeColor="text1"/>
     </w:rPr>
     <w:tblPr>

</xml_diff>